<commit_message>
updated clustering for Analysis report
</commit_message>
<xml_diff>
--- a/COMP257 Project report draft.docx
+++ b/COMP257 Project report draft.docx
@@ -75,27 +75,7 @@
           <w:kern w:val="0"/>
           <w14:ligatures w14:val="none"/>
         </w:rPr>
-        <w:t xml:space="preserve"> provided on Luminate. The .mat file was loaded with </w:t>
-      </w:r>
-      <w:proofErr w:type="spellStart"/>
-      <w:proofErr w:type="gramStart"/>
-      <w:r>
-        <w:rPr>
-          <w:rFonts w:ascii="Times New Roman" w:eastAsia="Times New Roman" w:hAnsi="Times New Roman" w:cs="Times New Roman"/>
-          <w:kern w:val="0"/>
-          <w14:ligatures w14:val="none"/>
-        </w:rPr>
-        <w:t>scipy.io.loadmat</w:t>
-      </w:r>
-      <w:proofErr w:type="spellEnd"/>
-      <w:proofErr w:type="gramEnd"/>
-      <w:r>
-        <w:rPr>
-          <w:rFonts w:ascii="Times New Roman" w:eastAsia="Times New Roman" w:hAnsi="Times New Roman" w:cs="Times New Roman"/>
-          <w:kern w:val="0"/>
-          <w14:ligatures w14:val="none"/>
-        </w:rPr>
-        <w:t>, and we inspected the keys to identify the image matrix and the label vector. Each image is stored as a flattened grayscale vector, and the corresponding label is an integer person ID.</w:t>
+        <w:t xml:space="preserve"> provided on Luminate. The .mat file was loaded with scipy.io.loadmat, and we inspected the keys to identify the image matrix and the label vector. Each image is stored as a flattened grayscale vector, and the corresponding label is an integer person ID.</w:t>
       </w:r>
     </w:p>
     <w:p>
@@ -186,57 +166,25 @@
           <w:szCs w:val="27"/>
           <w14:ligatures w14:val="none"/>
         </w:rPr>
-        <w:t xml:space="preserve">1.2 Conversion to Pandas </w:t>
-      </w:r>
-      <w:proofErr w:type="spellStart"/>
-      <w:r>
-        <w:rPr>
-          <w:rFonts w:ascii="Times New Roman" w:eastAsia="Times New Roman" w:hAnsi="Times New Roman" w:cs="Times New Roman"/>
-          <w:b/>
-          <w:bCs/>
-          <w:kern w:val="0"/>
-          <w:sz w:val="27"/>
-          <w:szCs w:val="27"/>
-          <w14:ligatures w14:val="none"/>
-        </w:rPr>
-        <w:t>DataFrame</w:t>
-      </w:r>
-      <w:proofErr w:type="spellEnd"/>
-    </w:p>
-    <w:p>
-      <w:pPr>
-        <w:spacing w:before="100" w:beforeAutospacing="1" w:after="100" w:afterAutospacing="1" w:line="240" w:lineRule="auto"/>
-        <w:rPr>
-          <w:rFonts w:ascii="Times New Roman" w:eastAsia="Times New Roman" w:hAnsi="Times New Roman" w:cs="Times New Roman"/>
-          <w:kern w:val="0"/>
-          <w14:ligatures w14:val="none"/>
-        </w:rPr>
-      </w:pPr>
-      <w:r>
-        <w:rPr>
-          <w:rFonts w:ascii="Times New Roman" w:eastAsia="Times New Roman" w:hAnsi="Times New Roman" w:cs="Times New Roman"/>
-          <w:kern w:val="0"/>
-          <w14:ligatures w14:val="none"/>
-        </w:rPr>
-        <w:t xml:space="preserve">For easier downstream processing, we converted the dataset into a Pandas </w:t>
-      </w:r>
-      <w:proofErr w:type="spellStart"/>
-      <w:r>
-        <w:rPr>
-          <w:rFonts w:ascii="Times New Roman" w:eastAsia="Times New Roman" w:hAnsi="Times New Roman" w:cs="Times New Roman"/>
-          <w:kern w:val="0"/>
-          <w14:ligatures w14:val="none"/>
-        </w:rPr>
-        <w:t>DataFrame</w:t>
-      </w:r>
-      <w:proofErr w:type="spellEnd"/>
-      <w:r>
-        <w:rPr>
-          <w:rFonts w:ascii="Times New Roman" w:eastAsia="Times New Roman" w:hAnsi="Times New Roman" w:cs="Times New Roman"/>
-          <w:kern w:val="0"/>
-          <w14:ligatures w14:val="none"/>
-        </w:rPr>
-        <w:t>. Each row corresponds to one image, where:</w:t>
+        <w:t>1.2 Conversion to Pandas DataFrame</w:t>
+      </w:r>
+    </w:p>
+    <w:p>
+      <w:pPr>
+        <w:spacing w:before="100" w:beforeAutospacing="1" w:after="100" w:afterAutospacing="1" w:line="240" w:lineRule="auto"/>
+        <w:rPr>
+          <w:rFonts w:ascii="Times New Roman" w:eastAsia="Times New Roman" w:hAnsi="Times New Roman" w:cs="Times New Roman"/>
+          <w:kern w:val="0"/>
+          <w14:ligatures w14:val="none"/>
+        </w:rPr>
+      </w:pPr>
+      <w:r>
+        <w:rPr>
+          <w:rFonts w:ascii="Times New Roman" w:eastAsia="Times New Roman" w:hAnsi="Times New Roman" w:cs="Times New Roman"/>
+          <w:kern w:val="0"/>
+          <w14:ligatures w14:val="none"/>
+        </w:rPr>
+        <w:t>For easier downstream processing, we converted the dataset into a Pandas DataFrame. Each row corresponds to one image, where:</w:t>
       </w:r>
     </w:p>
     <w:p>
@@ -252,23 +200,13 @@
           <w14:ligatures w14:val="none"/>
         </w:rPr>
       </w:pPr>
-      <w:proofErr w:type="spellStart"/>
-      <w:r>
-        <w:rPr>
-          <w:rFonts w:ascii="Times New Roman" w:eastAsia="Times New Roman" w:hAnsi="Times New Roman" w:cs="Times New Roman"/>
-          <w:kern w:val="0"/>
-          <w14:ligatures w14:val="none"/>
-        </w:rPr>
-        <w:t>person_id</w:t>
-      </w:r>
-      <w:proofErr w:type="spellEnd"/>
-      <w:r>
-        <w:rPr>
-          <w:rFonts w:ascii="Times New Roman" w:eastAsia="Times New Roman" w:hAnsi="Times New Roman" w:cs="Times New Roman"/>
-          <w:kern w:val="0"/>
-          <w14:ligatures w14:val="none"/>
-        </w:rPr>
-        <w:t>: integer label from 0 to 19</w:t>
+      <w:r>
+        <w:rPr>
+          <w:rFonts w:ascii="Times New Roman" w:eastAsia="Times New Roman" w:hAnsi="Times New Roman" w:cs="Times New Roman"/>
+          <w:kern w:val="0"/>
+          <w14:ligatures w14:val="none"/>
+        </w:rPr>
+        <w:t>person_id: integer label from 0 to 19</w:t>
       </w:r>
     </w:p>
     <w:p>
@@ -335,33 +273,7 @@
           <w:szCs w:val="27"/>
           <w14:ligatures w14:val="none"/>
         </w:rPr>
-        <w:t>2.1 Stratified train/</w:t>
-      </w:r>
-      <w:proofErr w:type="spellStart"/>
-      <w:r>
-        <w:rPr>
-          <w:rFonts w:ascii="Times New Roman" w:eastAsia="Times New Roman" w:hAnsi="Times New Roman" w:cs="Times New Roman"/>
-          <w:b/>
-          <w:bCs/>
-          <w:kern w:val="0"/>
-          <w:sz w:val="27"/>
-          <w:szCs w:val="27"/>
-          <w14:ligatures w14:val="none"/>
-        </w:rPr>
-        <w:t>val</w:t>
-      </w:r>
-      <w:proofErr w:type="spellEnd"/>
-      <w:r>
-        <w:rPr>
-          <w:rFonts w:ascii="Times New Roman" w:eastAsia="Times New Roman" w:hAnsi="Times New Roman" w:cs="Times New Roman"/>
-          <w:b/>
-          <w:bCs/>
-          <w:kern w:val="0"/>
-          <w:sz w:val="27"/>
-          <w:szCs w:val="27"/>
-          <w14:ligatures w14:val="none"/>
-        </w:rPr>
-        <w:t>/test split</w:t>
+        <w:t>2.1 Stratified train/val/test split</w:t>
       </w:r>
     </w:p>
     <w:p>
@@ -511,43 +423,7 @@
           <w:kern w:val="0"/>
           <w14:ligatures w14:val="none"/>
         </w:rPr>
-        <w:t xml:space="preserve">Stratification was done with </w:t>
-      </w:r>
-      <w:proofErr w:type="spellStart"/>
-      <w:r>
-        <w:rPr>
-          <w:rFonts w:ascii="Times New Roman" w:eastAsia="Times New Roman" w:hAnsi="Times New Roman" w:cs="Times New Roman"/>
-          <w:kern w:val="0"/>
-          <w14:ligatures w14:val="none"/>
-        </w:rPr>
-        <w:t>StratifiedShuffleSplit</w:t>
-      </w:r>
-      <w:proofErr w:type="spellEnd"/>
-      <w:r>
-        <w:rPr>
-          <w:rFonts w:ascii="Times New Roman" w:eastAsia="Times New Roman" w:hAnsi="Times New Roman" w:cs="Times New Roman"/>
-          <w:kern w:val="0"/>
-          <w14:ligatures w14:val="none"/>
-        </w:rPr>
-        <w:t xml:space="preserve">, using </w:t>
-      </w:r>
-      <w:proofErr w:type="spellStart"/>
-      <w:r>
-        <w:rPr>
-          <w:rFonts w:ascii="Times New Roman" w:eastAsia="Times New Roman" w:hAnsi="Times New Roman" w:cs="Times New Roman"/>
-          <w:kern w:val="0"/>
-          <w14:ligatures w14:val="none"/>
-        </w:rPr>
-        <w:t>person_id</w:t>
-      </w:r>
-      <w:proofErr w:type="spellEnd"/>
-      <w:r>
-        <w:rPr>
-          <w:rFonts w:ascii="Times New Roman" w:eastAsia="Times New Roman" w:hAnsi="Times New Roman" w:cs="Times New Roman"/>
-          <w:kern w:val="0"/>
-          <w14:ligatures w14:val="none"/>
-        </w:rPr>
-        <w:t xml:space="preserve"> as the stratification key. This guarantees that </w:t>
+        <w:t xml:space="preserve">Stratification was done with StratifiedShuffleSplit, using person_id as the stratification key. This guarantees that </w:t>
       </w:r>
       <w:r>
         <w:rPr>
@@ -693,63 +569,25 @@
           <w:kern w:val="0"/>
           <w14:ligatures w14:val="none"/>
         </w:rPr>
-        <w:t xml:space="preserve"> by dividing pixel values by 255. Then, we fitted a </w:t>
-      </w:r>
-      <w:proofErr w:type="spellStart"/>
-      <w:r>
-        <w:rPr>
-          <w:rFonts w:ascii="Times New Roman" w:eastAsia="Times New Roman" w:hAnsi="Times New Roman" w:cs="Times New Roman"/>
-          <w:kern w:val="0"/>
-          <w14:ligatures w14:val="none"/>
-        </w:rPr>
-        <w:t>StandardScaler</w:t>
-      </w:r>
-      <w:proofErr w:type="spellEnd"/>
-      <w:r>
-        <w:rPr>
-          <w:rFonts w:ascii="Times New Roman" w:eastAsia="Times New Roman" w:hAnsi="Times New Roman" w:cs="Times New Roman"/>
-          <w:kern w:val="0"/>
-          <w14:ligatures w14:val="none"/>
-        </w:rPr>
-        <w:t xml:space="preserve"> </w:t>
-      </w:r>
-      <w:r>
-        <w:rPr>
-          <w:rFonts w:ascii="Times New Roman" w:eastAsia="Times New Roman" w:hAnsi="Times New Roman" w:cs="Times New Roman"/>
-          <w:b/>
-          <w:bCs/>
-          <w:kern w:val="0"/>
-          <w14:ligatures w14:val="none"/>
-        </w:rPr>
-        <w:t xml:space="preserve">only on the training </w:t>
-      </w:r>
-      <w:proofErr w:type="gramStart"/>
-      <w:r>
-        <w:rPr>
-          <w:rFonts w:ascii="Times New Roman" w:eastAsia="Times New Roman" w:hAnsi="Times New Roman" w:cs="Times New Roman"/>
-          <w:b/>
-          <w:bCs/>
-          <w:kern w:val="0"/>
-          <w14:ligatures w14:val="none"/>
-        </w:rPr>
-        <w:t>set</w:t>
-      </w:r>
-      <w:r>
-        <w:rPr>
-          <w:rFonts w:ascii="Times New Roman" w:eastAsia="Times New Roman" w:hAnsi="Times New Roman" w:cs="Times New Roman"/>
-          <w:kern w:val="0"/>
-          <w14:ligatures w14:val="none"/>
-        </w:rPr>
-        <w:t>, and</w:t>
-      </w:r>
-      <w:proofErr w:type="gramEnd"/>
-      <w:r>
-        <w:rPr>
-          <w:rFonts w:ascii="Times New Roman" w:eastAsia="Times New Roman" w:hAnsi="Times New Roman" w:cs="Times New Roman"/>
-          <w:kern w:val="0"/>
-          <w14:ligatures w14:val="none"/>
-        </w:rPr>
-        <w:t xml:space="preserve"> used the same scaler to transform the validation and test sets.</w:t>
+        <w:t xml:space="preserve"> by dividing pixel values by 255. Then, we fitted a StandardScaler </w:t>
+      </w:r>
+      <w:r>
+        <w:rPr>
+          <w:rFonts w:ascii="Times New Roman" w:eastAsia="Times New Roman" w:hAnsi="Times New Roman" w:cs="Times New Roman"/>
+          <w:b/>
+          <w:bCs/>
+          <w:kern w:val="0"/>
+          <w14:ligatures w14:val="none"/>
+        </w:rPr>
+        <w:t>only on the training set</w:t>
+      </w:r>
+      <w:r>
+        <w:rPr>
+          <w:rFonts w:ascii="Times New Roman" w:eastAsia="Times New Roman" w:hAnsi="Times New Roman" w:cs="Times New Roman"/>
+          <w:kern w:val="0"/>
+          <w14:ligatures w14:val="none"/>
+        </w:rPr>
+        <w:t>, and used the same scaler to transform the validation and test sets.</w:t>
       </w:r>
     </w:p>
     <w:p>
@@ -1139,25 +977,7 @@
           <w:kern w:val="0"/>
           <w14:ligatures w14:val="none"/>
         </w:rPr>
-        <w:t>Encoder: Dense → 128 units (</w:t>
-      </w:r>
-      <w:proofErr w:type="spellStart"/>
-      <w:r>
-        <w:rPr>
-          <w:rFonts w:ascii="Times New Roman" w:eastAsia="Times New Roman" w:hAnsi="Times New Roman" w:cs="Times New Roman"/>
-          <w:kern w:val="0"/>
-          <w14:ligatures w14:val="none"/>
-        </w:rPr>
-        <w:t>ReLU</w:t>
-      </w:r>
-      <w:proofErr w:type="spellEnd"/>
-      <w:r>
-        <w:rPr>
-          <w:rFonts w:ascii="Times New Roman" w:eastAsia="Times New Roman" w:hAnsi="Times New Roman" w:cs="Times New Roman"/>
-          <w:kern w:val="0"/>
-          <w14:ligatures w14:val="none"/>
-        </w:rPr>
-        <w:t>) → 64-dim latent code</w:t>
+        <w:t>Encoder: Dense → 128 units (ReLU) → 64-dim latent code</w:t>
       </w:r>
     </w:p>
     <w:p>
@@ -1332,29 +1152,7 @@
           <w:kern w:val="0"/>
           <w14:ligatures w14:val="none"/>
         </w:rPr>
-        <w:t xml:space="preserve">orthogonal, </w:t>
-      </w:r>
-      <w:proofErr w:type="gramStart"/>
-      <w:r>
-        <w:rPr>
-          <w:rFonts w:ascii="Times New Roman" w:eastAsia="Times New Roman" w:hAnsi="Times New Roman" w:cs="Times New Roman"/>
-          <w:b/>
-          <w:bCs/>
-          <w:kern w:val="0"/>
-          <w14:ligatures w14:val="none"/>
-        </w:rPr>
-        <w:t>linearly-decoupled</w:t>
-      </w:r>
-      <w:proofErr w:type="gramEnd"/>
-      <w:r>
-        <w:rPr>
-          <w:rFonts w:ascii="Times New Roman" w:eastAsia="Times New Roman" w:hAnsi="Times New Roman" w:cs="Times New Roman"/>
-          <w:b/>
-          <w:bCs/>
-          <w:kern w:val="0"/>
-          <w14:ligatures w14:val="none"/>
-        </w:rPr>
-        <w:t xml:space="preserve"> directions</w:t>
+        <w:t>orthogonal, linearly-decoupled directions</w:t>
       </w:r>
       <w:r>
         <w:rPr>
@@ -1450,71 +1248,82 @@
     <w:p>
       <w:pPr>
         <w:spacing w:before="100" w:beforeAutospacing="1" w:after="100" w:afterAutospacing="1" w:line="240" w:lineRule="auto"/>
-        <w:outlineLvl w:val="2"/>
-        <w:rPr>
-          <w:rFonts w:ascii="Times New Roman" w:eastAsia="Times New Roman" w:hAnsi="Times New Roman" w:cs="Times New Roman"/>
-          <w:b/>
-          <w:bCs/>
-          <w:kern w:val="0"/>
-          <w:sz w:val="27"/>
-          <w:szCs w:val="27"/>
-          <w14:ligatures w14:val="none"/>
-        </w:rPr>
-      </w:pPr>
-      <w:r>
-        <w:rPr>
-          <w:rFonts w:ascii="Times New Roman" w:eastAsia="Times New Roman" w:hAnsi="Times New Roman" w:cs="Times New Roman"/>
-          <w:b/>
-          <w:bCs/>
-          <w:kern w:val="0"/>
-          <w:sz w:val="27"/>
-          <w:szCs w:val="27"/>
-          <w14:ligatures w14:val="none"/>
-        </w:rPr>
-        <w:t>4.1 Methods and parameter choices</w:t>
-      </w:r>
-    </w:p>
-    <w:p>
-      <w:pPr>
-        <w:spacing w:before="100" w:beforeAutospacing="1" w:after="100" w:afterAutospacing="1" w:line="240" w:lineRule="auto"/>
-        <w:rPr>
-          <w:rFonts w:ascii="Times New Roman" w:eastAsia="Times New Roman" w:hAnsi="Times New Roman" w:cs="Times New Roman"/>
-          <w:kern w:val="0"/>
-          <w14:ligatures w14:val="none"/>
-        </w:rPr>
-      </w:pPr>
-      <w:r>
-        <w:rPr>
-          <w:rFonts w:ascii="Times New Roman" w:eastAsia="Times New Roman" w:hAnsi="Times New Roman" w:cs="Times New Roman"/>
-          <w:kern w:val="0"/>
-          <w14:ligatures w14:val="none"/>
-        </w:rPr>
-        <w:t xml:space="preserve">After dimensionality reduction, we applied the following clustering methods on the </w:t>
-      </w:r>
-      <w:r>
-        <w:rPr>
-          <w:rFonts w:ascii="Times New Roman" w:eastAsia="Times New Roman" w:hAnsi="Times New Roman" w:cs="Times New Roman"/>
-          <w:b/>
-          <w:bCs/>
-          <w:kern w:val="0"/>
-          <w14:ligatures w14:val="none"/>
-        </w:rPr>
-        <w:t>50-dim PCA features</w:t>
-      </w:r>
-      <w:r>
-        <w:rPr>
-          <w:rFonts w:ascii="Times New Roman" w:eastAsia="Times New Roman" w:hAnsi="Times New Roman" w:cs="Times New Roman"/>
-          <w:kern w:val="0"/>
-          <w14:ligatures w14:val="none"/>
-        </w:rPr>
-        <w:t>:</w:t>
+        <w:rPr>
+          <w:rFonts w:ascii="Times New Roman" w:eastAsia="Times New Roman" w:hAnsi="Times New Roman" w:cs="Times New Roman"/>
+          <w:kern w:val="0"/>
+          <w14:ligatures w14:val="none"/>
+        </w:rPr>
+      </w:pPr>
+      <w:r>
+        <w:rPr>
+          <w:rFonts w:ascii="Times New Roman" w:eastAsia="Times New Roman" w:hAnsi="Times New Roman" w:cs="Times New Roman"/>
+          <w:kern w:val="0"/>
+          <w14:ligatures w14:val="none"/>
+        </w:rPr>
+        <w:t>(</w:t>
+      </w:r>
+      <w:r>
+        <w:rPr>
+          <w:rFonts w:ascii="Times New Roman" w:eastAsia="Times New Roman" w:hAnsi="Times New Roman" w:cs="Times New Roman"/>
+          <w:kern w:val="0"/>
+          <w14:ligatures w14:val="none"/>
+        </w:rPr>
+        <w:t>Modified by Shourav</w:t>
+      </w:r>
+      <w:r>
+        <w:rPr>
+          <w:rFonts w:ascii="Times New Roman" w:eastAsia="Times New Roman" w:hAnsi="Times New Roman" w:cs="Times New Roman"/>
+          <w:kern w:val="0"/>
+          <w14:ligatures w14:val="none"/>
+        </w:rPr>
+        <w:t>)</w:t>
+      </w:r>
+    </w:p>
+    <w:p>
+      <w:pPr>
+        <w:spacing w:before="100" w:beforeAutospacing="1" w:after="100" w:afterAutospacing="1" w:line="240" w:lineRule="auto"/>
+        <w:rPr>
+          <w:rFonts w:ascii="Times New Roman" w:eastAsia="Times New Roman" w:hAnsi="Times New Roman" w:cs="Times New Roman"/>
+          <w:kern w:val="0"/>
+          <w14:ligatures w14:val="none"/>
+        </w:rPr>
+      </w:pPr>
+      <w:r>
+        <w:rPr>
+          <w:rFonts w:ascii="Times New Roman" w:eastAsia="Times New Roman" w:hAnsi="Times New Roman" w:cs="Times New Roman"/>
+          <w:b/>
+          <w:bCs/>
+          <w:kern w:val="0"/>
+          <w14:ligatures w14:val="none"/>
+        </w:rPr>
+        <w:t>Clustering Report</w:t>
+      </w:r>
+    </w:p>
+    <w:p>
+      <w:pPr>
+        <w:spacing w:before="100" w:beforeAutospacing="1" w:after="100" w:afterAutospacing="1" w:line="240" w:lineRule="auto"/>
+        <w:rPr>
+          <w:rFonts w:ascii="Times New Roman" w:eastAsia="Times New Roman" w:hAnsi="Times New Roman" w:cs="Times New Roman"/>
+          <w:kern w:val="0"/>
+          <w14:ligatures w14:val="none"/>
+        </w:rPr>
+      </w:pPr>
+      <w:r>
+        <w:rPr>
+          <w:rFonts w:ascii="Times New Roman" w:eastAsia="Times New Roman" w:hAnsi="Times New Roman" w:cs="Times New Roman"/>
+          <w:b/>
+          <w:bCs/>
+          <w:kern w:val="0"/>
+          <w14:ligatures w14:val="none"/>
+        </w:rPr>
+        <w:t>1. Methods Chosen and Why</w:t>
       </w:r>
     </w:p>
     <w:p>
       <w:pPr>
         <w:numPr>
           <w:ilvl w:val="0"/>
-          <w:numId w:val="5"/>
+          <w:numId w:val="14"/>
         </w:numPr>
         <w:spacing w:before="100" w:beforeAutospacing="1" w:after="100" w:afterAutospacing="1" w:line="240" w:lineRule="auto"/>
         <w:rPr>
@@ -1531,22 +1340,22 @@
           <w:kern w:val="0"/>
           <w14:ligatures w14:val="none"/>
         </w:rPr>
-        <w:t>K-Means</w:t>
-      </w:r>
-      <w:r>
-        <w:rPr>
-          <w:rFonts w:ascii="Times New Roman" w:eastAsia="Times New Roman" w:hAnsi="Times New Roman" w:cs="Times New Roman"/>
-          <w:kern w:val="0"/>
-          <w14:ligatures w14:val="none"/>
-        </w:rPr>
-        <w:t xml:space="preserve"> (k = 20, “k-means++” initialization, 20 random restarts)</w:t>
+        <w:t>K-Means:</w:t>
+      </w:r>
+      <w:r>
+        <w:rPr>
+          <w:rFonts w:ascii="Times New Roman" w:eastAsia="Times New Roman" w:hAnsi="Times New Roman" w:cs="Times New Roman"/>
+          <w:kern w:val="0"/>
+          <w14:ligatures w14:val="none"/>
+        </w:rPr>
+        <w:t> We chose K-Means because it is a simple and popular clustering method that works well when clusters are compact and separated. It’s a good baseline for comparing results.</w:t>
       </w:r>
     </w:p>
     <w:p>
       <w:pPr>
         <w:numPr>
           <w:ilvl w:val="0"/>
-          <w:numId w:val="5"/>
+          <w:numId w:val="14"/>
         </w:numPr>
         <w:spacing w:before="100" w:beforeAutospacing="1" w:after="100" w:afterAutospacing="1" w:line="240" w:lineRule="auto"/>
         <w:rPr>
@@ -1563,157 +1372,22 @@
           <w:kern w:val="0"/>
           <w14:ligatures w14:val="none"/>
         </w:rPr>
-        <w:t>Agglomerative (Hierarchical) Clustering</w:t>
-      </w:r>
-      <w:r>
-        <w:rPr>
-          <w:rFonts w:ascii="Times New Roman" w:eastAsia="Times New Roman" w:hAnsi="Times New Roman" w:cs="Times New Roman"/>
-          <w:kern w:val="0"/>
-          <w14:ligatures w14:val="none"/>
-        </w:rPr>
-        <w:t xml:space="preserve"> using </w:t>
-      </w:r>
-      <w:r>
-        <w:rPr>
-          <w:rFonts w:ascii="Times New Roman" w:eastAsia="Times New Roman" w:hAnsi="Times New Roman" w:cs="Times New Roman"/>
-          <w:b/>
-          <w:bCs/>
-          <w:kern w:val="0"/>
-          <w14:ligatures w14:val="none"/>
-        </w:rPr>
-        <w:t>Ward linkage</w:t>
-      </w:r>
-      <w:r>
-        <w:rPr>
-          <w:rFonts w:ascii="Times New Roman" w:eastAsia="Times New Roman" w:hAnsi="Times New Roman" w:cs="Times New Roman"/>
-          <w:kern w:val="0"/>
-          <w14:ligatures w14:val="none"/>
-        </w:rPr>
-        <w:t xml:space="preserve"> with 20 clusters</w:t>
-      </w:r>
-    </w:p>
-    <w:p>
-      <w:pPr>
-        <w:spacing w:before="100" w:beforeAutospacing="1" w:after="100" w:afterAutospacing="1" w:line="240" w:lineRule="auto"/>
-        <w:rPr>
-          <w:rFonts w:ascii="Times New Roman" w:eastAsia="Times New Roman" w:hAnsi="Times New Roman" w:cs="Times New Roman"/>
-          <w:kern w:val="0"/>
-          <w14:ligatures w14:val="none"/>
-        </w:rPr>
-      </w:pPr>
-      <w:r>
-        <w:rPr>
-          <w:rFonts w:ascii="Times New Roman" w:eastAsia="Times New Roman" w:hAnsi="Times New Roman" w:cs="Times New Roman"/>
-          <w:kern w:val="0"/>
-          <w14:ligatures w14:val="none"/>
-        </w:rPr>
-        <w:t xml:space="preserve">In addition, we ran </w:t>
-      </w:r>
-      <w:r>
-        <w:rPr>
-          <w:rFonts w:ascii="Times New Roman" w:eastAsia="Times New Roman" w:hAnsi="Times New Roman" w:cs="Times New Roman"/>
-          <w:b/>
-          <w:bCs/>
-          <w:kern w:val="0"/>
-          <w14:ligatures w14:val="none"/>
-        </w:rPr>
-        <w:t>K-Means on the 64-dim autoencoder latent codes</w:t>
-      </w:r>
-      <w:r>
-        <w:rPr>
-          <w:rFonts w:ascii="Times New Roman" w:eastAsia="Times New Roman" w:hAnsi="Times New Roman" w:cs="Times New Roman"/>
-          <w:kern w:val="0"/>
-          <w14:ligatures w14:val="none"/>
-        </w:rPr>
-        <w:t xml:space="preserve"> as an optional variant.</w:t>
-      </w:r>
-    </w:p>
-    <w:p>
-      <w:pPr>
-        <w:spacing w:before="100" w:beforeAutospacing="1" w:after="100" w:afterAutospacing="1" w:line="240" w:lineRule="auto"/>
-        <w:rPr>
-          <w:rFonts w:ascii="Times New Roman" w:eastAsia="Times New Roman" w:hAnsi="Times New Roman" w:cs="Times New Roman"/>
-          <w:kern w:val="0"/>
-          <w14:ligatures w14:val="none"/>
-        </w:rPr>
-      </w:pPr>
-      <w:r>
-        <w:rPr>
-          <w:rFonts w:ascii="Times New Roman" w:eastAsia="Times New Roman" w:hAnsi="Times New Roman" w:cs="Times New Roman"/>
-          <w:kern w:val="0"/>
-          <w14:ligatures w14:val="none"/>
-        </w:rPr>
-        <w:t xml:space="preserve">The choice of </w:t>
-      </w:r>
-      <w:r>
-        <w:rPr>
-          <w:rFonts w:ascii="Times New Roman" w:eastAsia="Times New Roman" w:hAnsi="Times New Roman" w:cs="Times New Roman"/>
-          <w:b/>
-          <w:bCs/>
-          <w:kern w:val="0"/>
-          <w14:ligatures w14:val="none"/>
-        </w:rPr>
-        <w:t>20 clusters</w:t>
-      </w:r>
-      <w:r>
-        <w:rPr>
-          <w:rFonts w:ascii="Times New Roman" w:eastAsia="Times New Roman" w:hAnsi="Times New Roman" w:cs="Times New Roman"/>
-          <w:kern w:val="0"/>
-          <w14:ligatures w14:val="none"/>
-        </w:rPr>
-        <w:t xml:space="preserve"> is natural, as the ground-truth data contains 20 individuals. Ward linkage was used because it minimizes within-cluster variance, which suits Euclidean PCA space.</w:t>
-      </w:r>
-    </w:p>
-    <w:p>
-      <w:pPr>
-        <w:spacing w:before="100" w:beforeAutospacing="1" w:after="100" w:afterAutospacing="1" w:line="240" w:lineRule="auto"/>
-        <w:outlineLvl w:val="2"/>
-        <w:rPr>
-          <w:rFonts w:ascii="Times New Roman" w:eastAsia="Times New Roman" w:hAnsi="Times New Roman" w:cs="Times New Roman"/>
-          <w:b/>
-          <w:bCs/>
-          <w:kern w:val="0"/>
-          <w:sz w:val="27"/>
-          <w:szCs w:val="27"/>
-          <w14:ligatures w14:val="none"/>
-        </w:rPr>
-      </w:pPr>
-      <w:r>
-        <w:rPr>
-          <w:rFonts w:ascii="Times New Roman" w:eastAsia="Times New Roman" w:hAnsi="Times New Roman" w:cs="Times New Roman"/>
-          <w:b/>
-          <w:bCs/>
-          <w:kern w:val="0"/>
-          <w:sz w:val="27"/>
-          <w:szCs w:val="27"/>
-          <w14:ligatures w14:val="none"/>
-        </w:rPr>
-        <w:t>4.2 Clustering quality metrics</w:t>
-      </w:r>
-    </w:p>
-    <w:p>
-      <w:pPr>
-        <w:spacing w:before="100" w:beforeAutospacing="1" w:after="100" w:afterAutospacing="1" w:line="240" w:lineRule="auto"/>
-        <w:rPr>
-          <w:rFonts w:ascii="Times New Roman" w:eastAsia="Times New Roman" w:hAnsi="Times New Roman" w:cs="Times New Roman"/>
-          <w:kern w:val="0"/>
-          <w14:ligatures w14:val="none"/>
-        </w:rPr>
-      </w:pPr>
-      <w:r>
-        <w:rPr>
-          <w:rFonts w:ascii="Times New Roman" w:eastAsia="Times New Roman" w:hAnsi="Times New Roman" w:cs="Times New Roman"/>
-          <w:kern w:val="0"/>
-          <w14:ligatures w14:val="none"/>
-        </w:rPr>
-        <w:t>We evaluated clustering performance on the training set using several standard metrics comparing cluster assignments with true labels:</w:t>
+        <w:t>Agglomerative (Ward) Clustering:</w:t>
+      </w:r>
+      <w:r>
+        <w:rPr>
+          <w:rFonts w:ascii="Times New Roman" w:eastAsia="Times New Roman" w:hAnsi="Times New Roman" w:cs="Times New Roman"/>
+          <w:kern w:val="0"/>
+          <w14:ligatures w14:val="none"/>
+        </w:rPr>
+        <w:t> We used this hierarchical method because it can merge small, similar groups and sometimes finds better groupings when data is not perfectly separated. Ward linkage is good for data that’s been standardized and reduced by PCA.</w:t>
       </w:r>
     </w:p>
     <w:p>
       <w:pPr>
         <w:numPr>
           <w:ilvl w:val="0"/>
-          <w:numId w:val="6"/>
+          <w:numId w:val="14"/>
         </w:numPr>
         <w:spacing w:before="100" w:beforeAutospacing="1" w:after="100" w:afterAutospacing="1" w:line="240" w:lineRule="auto"/>
         <w:rPr>
@@ -1730,36 +1404,674 @@
           <w:kern w:val="0"/>
           <w14:ligatures w14:val="none"/>
         </w:rPr>
-        <w:t>K-Means on PCA (</w:t>
-      </w:r>
-      <w:proofErr w:type="spellStart"/>
-      <w:r>
-        <w:rPr>
-          <w:rFonts w:ascii="Times New Roman" w:eastAsia="Times New Roman" w:hAnsi="Times New Roman" w:cs="Times New Roman"/>
-          <w:b/>
-          <w:bCs/>
-          <w:kern w:val="0"/>
-          <w14:ligatures w14:val="none"/>
-        </w:rPr>
-        <w:t>pca-KMeans</w:t>
-      </w:r>
-      <w:proofErr w:type="spellEnd"/>
-      <w:r>
-        <w:rPr>
-          <w:rFonts w:ascii="Times New Roman" w:eastAsia="Times New Roman" w:hAnsi="Times New Roman" w:cs="Times New Roman"/>
-          <w:b/>
-          <w:bCs/>
-          <w:kern w:val="0"/>
-          <w14:ligatures w14:val="none"/>
-        </w:rPr>
-        <w:t>)</w:t>
+        <w:t>K-Means on Autoencoder Features:</w:t>
+      </w:r>
+      <w:r>
+        <w:rPr>
+          <w:rFonts w:ascii="Times New Roman" w:eastAsia="Times New Roman" w:hAnsi="Times New Roman" w:cs="Times New Roman"/>
+          <w:kern w:val="0"/>
+          <w14:ligatures w14:val="none"/>
+        </w:rPr>
+        <w:t> We also tried clustering on features learned by an autoencoder (a neural network that compresses data), to see if nonlinear features help group faces by identity better than PCA.</w:t>
+      </w:r>
+    </w:p>
+    <w:p>
+      <w:pPr>
+        <w:spacing w:before="100" w:beforeAutospacing="1" w:after="100" w:afterAutospacing="1" w:line="240" w:lineRule="auto"/>
+        <w:rPr>
+          <w:rFonts w:ascii="Times New Roman" w:eastAsia="Times New Roman" w:hAnsi="Times New Roman" w:cs="Times New Roman"/>
+          <w:kern w:val="0"/>
+          <w14:ligatures w14:val="none"/>
+        </w:rPr>
+      </w:pPr>
+      <w:r>
+        <w:rPr>
+          <w:rFonts w:ascii="Times New Roman" w:eastAsia="Times New Roman" w:hAnsi="Times New Roman" w:cs="Times New Roman"/>
+          <w:b/>
+          <w:bCs/>
+          <w:kern w:val="0"/>
+          <w14:ligatures w14:val="none"/>
+        </w:rPr>
+        <w:t>2. Parameter Tuning</w:t>
+      </w:r>
+    </w:p>
+    <w:p>
+      <w:pPr>
+        <w:numPr>
+          <w:ilvl w:val="0"/>
+          <w:numId w:val="15"/>
+        </w:numPr>
+        <w:spacing w:before="100" w:beforeAutospacing="1" w:after="100" w:afterAutospacing="1" w:line="240" w:lineRule="auto"/>
+        <w:rPr>
+          <w:rFonts w:ascii="Times New Roman" w:eastAsia="Times New Roman" w:hAnsi="Times New Roman" w:cs="Times New Roman"/>
+          <w:kern w:val="0"/>
+          <w14:ligatures w14:val="none"/>
+        </w:rPr>
+      </w:pPr>
+      <w:r>
+        <w:rPr>
+          <w:rFonts w:ascii="Times New Roman" w:eastAsia="Times New Roman" w:hAnsi="Times New Roman" w:cs="Times New Roman"/>
+          <w:b/>
+          <w:bCs/>
+          <w:kern w:val="0"/>
+          <w14:ligatures w14:val="none"/>
+        </w:rPr>
+        <w:t>Number of clusters:</w:t>
+      </w:r>
+      <w:r>
+        <w:rPr>
+          <w:rFonts w:ascii="Times New Roman" w:eastAsia="Times New Roman" w:hAnsi="Times New Roman" w:cs="Times New Roman"/>
+          <w:kern w:val="0"/>
+          <w14:ligatures w14:val="none"/>
+        </w:rPr>
+        <w:t> We set this to 20 for both K-Means and Agglomerative, since there are 20 people in the dataset. This lets us directly compare clusters to real identities.</w:t>
+      </w:r>
+    </w:p>
+    <w:p>
+      <w:pPr>
+        <w:numPr>
+          <w:ilvl w:val="0"/>
+          <w:numId w:val="15"/>
+        </w:numPr>
+        <w:spacing w:before="100" w:beforeAutospacing="1" w:after="100" w:afterAutospacing="1" w:line="240" w:lineRule="auto"/>
+        <w:rPr>
+          <w:rFonts w:ascii="Times New Roman" w:eastAsia="Times New Roman" w:hAnsi="Times New Roman" w:cs="Times New Roman"/>
+          <w:kern w:val="0"/>
+          <w14:ligatures w14:val="none"/>
+        </w:rPr>
+      </w:pPr>
+      <w:r>
+        <w:rPr>
+          <w:rFonts w:ascii="Times New Roman" w:eastAsia="Times New Roman" w:hAnsi="Times New Roman" w:cs="Times New Roman"/>
+          <w:b/>
+          <w:bCs/>
+          <w:kern w:val="0"/>
+          <w14:ligatures w14:val="none"/>
+        </w:rPr>
+        <w:t>K-Means:</w:t>
+      </w:r>
+      <w:r>
+        <w:rPr>
+          <w:rFonts w:ascii="Times New Roman" w:eastAsia="Times New Roman" w:hAnsi="Times New Roman" w:cs="Times New Roman"/>
+          <w:kern w:val="0"/>
+          <w14:ligatures w14:val="none"/>
+        </w:rPr>
+        <w:t> We used n_init=10 to make the results more stable (the algorithm tries 10 different random starts and picks the best).</w:t>
+      </w:r>
+    </w:p>
+    <w:p>
+      <w:pPr>
+        <w:numPr>
+          <w:ilvl w:val="0"/>
+          <w:numId w:val="15"/>
+        </w:numPr>
+        <w:spacing w:before="100" w:beforeAutospacing="1" w:after="100" w:afterAutospacing="1" w:line="240" w:lineRule="auto"/>
+        <w:rPr>
+          <w:rFonts w:ascii="Times New Roman" w:eastAsia="Times New Roman" w:hAnsi="Times New Roman" w:cs="Times New Roman"/>
+          <w:kern w:val="0"/>
+          <w14:ligatures w14:val="none"/>
+        </w:rPr>
+      </w:pPr>
+      <w:r>
+        <w:rPr>
+          <w:rFonts w:ascii="Times New Roman" w:eastAsia="Times New Roman" w:hAnsi="Times New Roman" w:cs="Times New Roman"/>
+          <w:b/>
+          <w:bCs/>
+          <w:kern w:val="0"/>
+          <w14:ligatures w14:val="none"/>
+        </w:rPr>
+        <w:t>Agglomerative:</w:t>
+      </w:r>
+      <w:r>
+        <w:rPr>
+          <w:rFonts w:ascii="Times New Roman" w:eastAsia="Times New Roman" w:hAnsi="Times New Roman" w:cs="Times New Roman"/>
+          <w:kern w:val="0"/>
+          <w14:ligatures w14:val="none"/>
+        </w:rPr>
+        <w:t> We used the default “Ward” linkage, which tries to keep clusters as compact as possible.</w:t>
+      </w:r>
+    </w:p>
+    <w:p>
+      <w:pPr>
+        <w:numPr>
+          <w:ilvl w:val="0"/>
+          <w:numId w:val="15"/>
+        </w:numPr>
+        <w:spacing w:before="100" w:beforeAutospacing="1" w:after="100" w:afterAutospacing="1" w:line="240" w:lineRule="auto"/>
+        <w:rPr>
+          <w:rFonts w:ascii="Times New Roman" w:eastAsia="Times New Roman" w:hAnsi="Times New Roman" w:cs="Times New Roman"/>
+          <w:kern w:val="0"/>
+          <w14:ligatures w14:val="none"/>
+        </w:rPr>
+      </w:pPr>
+      <w:r>
+        <w:rPr>
+          <w:rFonts w:ascii="Times New Roman" w:eastAsia="Times New Roman" w:hAnsi="Times New Roman" w:cs="Times New Roman"/>
+          <w:b/>
+          <w:bCs/>
+          <w:kern w:val="0"/>
+          <w14:ligatures w14:val="none"/>
+        </w:rPr>
+        <w:t>PCA:</w:t>
+      </w:r>
+      <w:r>
+        <w:rPr>
+          <w:rFonts w:ascii="Times New Roman" w:eastAsia="Times New Roman" w:hAnsi="Times New Roman" w:cs="Times New Roman"/>
+          <w:kern w:val="0"/>
+          <w14:ligatures w14:val="none"/>
+        </w:rPr>
+        <w:t> We kept 50 principal components, which keeps most of the important information but reduces noise and makes clustering easier.</w:t>
+      </w:r>
+    </w:p>
+    <w:p>
+      <w:pPr>
+        <w:numPr>
+          <w:ilvl w:val="0"/>
+          <w:numId w:val="15"/>
+        </w:numPr>
+        <w:spacing w:before="100" w:beforeAutospacing="1" w:after="100" w:afterAutospacing="1" w:line="240" w:lineRule="auto"/>
+        <w:rPr>
+          <w:rFonts w:ascii="Times New Roman" w:eastAsia="Times New Roman" w:hAnsi="Times New Roman" w:cs="Times New Roman"/>
+          <w:kern w:val="0"/>
+          <w14:ligatures w14:val="none"/>
+        </w:rPr>
+      </w:pPr>
+      <w:r>
+        <w:rPr>
+          <w:rFonts w:ascii="Times New Roman" w:eastAsia="Times New Roman" w:hAnsi="Times New Roman" w:cs="Times New Roman"/>
+          <w:b/>
+          <w:bCs/>
+          <w:kern w:val="0"/>
+          <w14:ligatures w14:val="none"/>
+        </w:rPr>
+        <w:t>Autoencoder:</w:t>
+      </w:r>
+      <w:r>
+        <w:rPr>
+          <w:rFonts w:ascii="Times New Roman" w:eastAsia="Times New Roman" w:hAnsi="Times New Roman" w:cs="Times New Roman"/>
+          <w:kern w:val="0"/>
+          <w14:ligatures w14:val="none"/>
+        </w:rPr>
+        <w:t> We used a latent size of 64 and trained for 40 epochs, which is a balance between compressing the data and keeping enough information.</w:t>
+      </w:r>
+    </w:p>
+    <w:p>
+      <w:pPr>
+        <w:spacing w:before="100" w:beforeAutospacing="1" w:after="100" w:afterAutospacing="1" w:line="240" w:lineRule="auto"/>
+        <w:rPr>
+          <w:rFonts w:ascii="Times New Roman" w:eastAsia="Times New Roman" w:hAnsi="Times New Roman" w:cs="Times New Roman"/>
+          <w:kern w:val="0"/>
+          <w14:ligatures w14:val="none"/>
+        </w:rPr>
+      </w:pPr>
+      <w:r>
+        <w:rPr>
+          <w:rFonts w:ascii="Times New Roman" w:eastAsia="Times New Roman" w:hAnsi="Times New Roman" w:cs="Times New Roman"/>
+          <w:b/>
+          <w:bCs/>
+          <w:kern w:val="0"/>
+          <w14:ligatures w14:val="none"/>
+        </w:rPr>
+        <w:t>3. Challenges and Role of Dimensionality Reduction</w:t>
+      </w:r>
+    </w:p>
+    <w:p>
+      <w:pPr>
+        <w:numPr>
+          <w:ilvl w:val="0"/>
+          <w:numId w:val="16"/>
+        </w:numPr>
+        <w:spacing w:before="100" w:beforeAutospacing="1" w:after="100" w:afterAutospacing="1" w:line="240" w:lineRule="auto"/>
+        <w:rPr>
+          <w:rFonts w:ascii="Times New Roman" w:eastAsia="Times New Roman" w:hAnsi="Times New Roman" w:cs="Times New Roman"/>
+          <w:kern w:val="0"/>
+          <w14:ligatures w14:val="none"/>
+        </w:rPr>
+      </w:pPr>
+      <w:r>
+        <w:rPr>
+          <w:rFonts w:ascii="Times New Roman" w:eastAsia="Times New Roman" w:hAnsi="Times New Roman" w:cs="Times New Roman"/>
+          <w:b/>
+          <w:bCs/>
+          <w:kern w:val="0"/>
+          <w14:ligatures w14:val="none"/>
+        </w:rPr>
+        <w:t>High-dimensional data:</w:t>
+      </w:r>
+      <w:r>
+        <w:rPr>
+          <w:rFonts w:ascii="Times New Roman" w:eastAsia="Times New Roman" w:hAnsi="Times New Roman" w:cs="Times New Roman"/>
+          <w:kern w:val="0"/>
+          <w14:ligatures w14:val="none"/>
+        </w:rPr>
+        <w:t> Each image has over 10,000 pixels, making it hard for clustering to work well. In high dimensions, distances become less meaningful, and noise (like lighting or pose) can dominate.</w:t>
+      </w:r>
+    </w:p>
+    <w:p>
+      <w:pPr>
+        <w:numPr>
+          <w:ilvl w:val="0"/>
+          <w:numId w:val="16"/>
+        </w:numPr>
+        <w:spacing w:before="100" w:beforeAutospacing="1" w:after="100" w:afterAutospacing="1" w:line="240" w:lineRule="auto"/>
+        <w:rPr>
+          <w:rFonts w:ascii="Times New Roman" w:eastAsia="Times New Roman" w:hAnsi="Times New Roman" w:cs="Times New Roman"/>
+          <w:kern w:val="0"/>
+          <w14:ligatures w14:val="none"/>
+        </w:rPr>
+      </w:pPr>
+      <w:r>
+        <w:rPr>
+          <w:rFonts w:ascii="Times New Roman" w:eastAsia="Times New Roman" w:hAnsi="Times New Roman" w:cs="Times New Roman"/>
+          <w:b/>
+          <w:bCs/>
+          <w:kern w:val="0"/>
+          <w14:ligatures w14:val="none"/>
+        </w:rPr>
+        <w:t>Dimensionality reduction:</w:t>
+      </w:r>
+      <w:r>
+        <w:rPr>
+          <w:rFonts w:ascii="Times New Roman" w:eastAsia="Times New Roman" w:hAnsi="Times New Roman" w:cs="Times New Roman"/>
+          <w:kern w:val="0"/>
+          <w14:ligatures w14:val="none"/>
+        </w:rPr>
+        <w:t> PCA and autoencoders help by shrinking the data to a smaller set of features that (hopefully) keep the important differences between people and ignore noise. This makes clustering more effective and faster.</w:t>
+      </w:r>
+    </w:p>
+    <w:p>
+      <w:pPr>
+        <w:spacing w:before="100" w:beforeAutospacing="1" w:after="100" w:afterAutospacing="1" w:line="240" w:lineRule="auto"/>
+        <w:rPr>
+          <w:rFonts w:ascii="Times New Roman" w:eastAsia="Times New Roman" w:hAnsi="Times New Roman" w:cs="Times New Roman"/>
+          <w:kern w:val="0"/>
+          <w14:ligatures w14:val="none"/>
+        </w:rPr>
+      </w:pPr>
+    </w:p>
+    <w:p>
+      <w:pPr>
+        <w:spacing w:before="100" w:beforeAutospacing="1" w:after="100" w:afterAutospacing="1" w:line="240" w:lineRule="auto"/>
+        <w:rPr>
+          <w:rFonts w:ascii="Times New Roman" w:eastAsia="Times New Roman" w:hAnsi="Times New Roman" w:cs="Times New Roman"/>
+          <w:kern w:val="0"/>
+          <w14:ligatures w14:val="none"/>
+        </w:rPr>
+      </w:pPr>
+    </w:p>
+    <w:p>
+      <w:pPr>
+        <w:spacing w:before="100" w:beforeAutospacing="1" w:after="100" w:afterAutospacing="1" w:line="240" w:lineRule="auto"/>
+        <w:rPr>
+          <w:rFonts w:ascii="Times New Roman" w:eastAsia="Times New Roman" w:hAnsi="Times New Roman" w:cs="Times New Roman"/>
+          <w:kern w:val="0"/>
+          <w14:ligatures w14:val="none"/>
+        </w:rPr>
+      </w:pPr>
+      <w:r>
+        <w:rPr>
+          <w:rFonts w:ascii="Times New Roman" w:eastAsia="Times New Roman" w:hAnsi="Times New Roman" w:cs="Times New Roman"/>
+          <w:kern w:val="0"/>
+          <w14:ligatures w14:val="none"/>
+        </w:rPr>
+        <w:t>“Include 2D visualizations of the clustering results using matplotlib, and provide an analysis of the purity or composition of each cluster. This analysis will help assess how effectively each method groups images of the same individual.”</w:t>
+      </w:r>
+    </w:p>
+    <w:p>
+      <w:pPr>
+        <w:spacing w:before="100" w:beforeAutospacing="1" w:after="100" w:afterAutospacing="1" w:line="240" w:lineRule="auto"/>
+        <w:rPr>
+          <w:rFonts w:ascii="Times New Roman" w:eastAsia="Times New Roman" w:hAnsi="Times New Roman" w:cs="Times New Roman"/>
+          <w:b/>
+          <w:bCs/>
+          <w:kern w:val="0"/>
+          <w14:ligatures w14:val="none"/>
+        </w:rPr>
+      </w:pPr>
+      <w:r>
+        <w:rPr>
+          <w:rFonts w:ascii="Times New Roman" w:eastAsia="Times New Roman" w:hAnsi="Times New Roman" w:cs="Times New Roman"/>
+          <w:b/>
+          <w:bCs/>
+          <w:kern w:val="0"/>
+          <w14:ligatures w14:val="none"/>
+        </w:rPr>
+        <w:t>2D Matplotlib plots for clustering</w:t>
+      </w:r>
+    </w:p>
+    <w:p>
+      <w:pPr>
+        <w:spacing w:before="100" w:beforeAutospacing="1" w:after="100" w:afterAutospacing="1" w:line="240" w:lineRule="auto"/>
+        <w:rPr>
+          <w:rFonts w:ascii="Times New Roman" w:eastAsia="Times New Roman" w:hAnsi="Times New Roman" w:cs="Times New Roman"/>
+          <w:kern w:val="0"/>
+          <w14:ligatures w14:val="none"/>
+        </w:rPr>
+      </w:pPr>
+      <w:r>
+        <w:rPr>
+          <w:rFonts w:ascii="Times New Roman" w:eastAsia="Times New Roman" w:hAnsi="Times New Roman" w:cs="Times New Roman"/>
+          <w:kern w:val="0"/>
+          <w14:ligatures w14:val="none"/>
+        </w:rPr>
+        <w:drawing>
+          <wp:inline distT="0" distB="0" distL="0" distR="0" wp14:anchorId="30D556EC" wp14:editId="03747188">
+            <wp:extent cx="3976956" cy="3238500"/>
+            <wp:effectExtent l="0" t="0" r="5080" b="0"/>
+            <wp:docPr id="446659155" name="Picture 1" descr="A screen shot of a graph&#10;&#10;AI-generated content may be incorrect."/>
+            <wp:cNvGraphicFramePr>
+              <a:graphicFrameLocks xmlns:a="http://schemas.openxmlformats.org/drawingml/2006/main" noChangeAspect="1"/>
+            </wp:cNvGraphicFramePr>
+            <a:graphic xmlns:a="http://schemas.openxmlformats.org/drawingml/2006/main">
+              <a:graphicData uri="http://schemas.openxmlformats.org/drawingml/2006/picture">
+                <pic:pic xmlns:pic="http://schemas.openxmlformats.org/drawingml/2006/picture">
+                  <pic:nvPicPr>
+                    <pic:cNvPr id="446659155" name="Picture 1" descr="A screen shot of a graph&#10;&#10;AI-generated content may be incorrect."/>
+                    <pic:cNvPicPr/>
+                  </pic:nvPicPr>
+                  <pic:blipFill>
+                    <a:blip r:embed="rId5"/>
+                    <a:stretch>
+                      <a:fillRect/>
+                    </a:stretch>
+                  </pic:blipFill>
+                  <pic:spPr>
+                    <a:xfrm>
+                      <a:off x="0" y="0"/>
+                      <a:ext cx="3986982" cy="3246665"/>
+                    </a:xfrm>
+                    <a:prstGeom prst="rect">
+                      <a:avLst/>
+                    </a:prstGeom>
+                  </pic:spPr>
+                </pic:pic>
+              </a:graphicData>
+            </a:graphic>
+          </wp:inline>
+        </w:drawing>
+      </w:r>
+    </w:p>
+    <w:p>
+      <w:pPr>
+        <w:spacing w:before="100" w:beforeAutospacing="1" w:after="100" w:afterAutospacing="1" w:line="240" w:lineRule="auto"/>
+        <w:rPr>
+          <w:rFonts w:ascii="Times New Roman" w:eastAsia="Times New Roman" w:hAnsi="Times New Roman" w:cs="Times New Roman"/>
+          <w:kern w:val="0"/>
+          <w14:ligatures w14:val="none"/>
+        </w:rPr>
+      </w:pPr>
+    </w:p>
+    <w:p>
+      <w:pPr>
+        <w:spacing w:before="100" w:beforeAutospacing="1" w:after="100" w:afterAutospacing="1" w:line="240" w:lineRule="auto"/>
+        <w:rPr>
+          <w:rFonts w:ascii="Times New Roman" w:eastAsia="Times New Roman" w:hAnsi="Times New Roman" w:cs="Times New Roman"/>
+          <w:kern w:val="0"/>
+          <w14:ligatures w14:val="none"/>
+        </w:rPr>
+      </w:pPr>
+      <w:r>
+        <w:rPr>
+          <w:rFonts w:ascii="Times New Roman" w:eastAsia="Times New Roman" w:hAnsi="Times New Roman" w:cs="Times New Roman"/>
+          <w:kern w:val="0"/>
+          <w14:ligatures w14:val="none"/>
+        </w:rPr>
+        <w:lastRenderedPageBreak/>
+        <w:drawing>
+          <wp:inline distT="0" distB="0" distL="0" distR="0" wp14:anchorId="2534210F" wp14:editId="5BE50E32">
+            <wp:extent cx="3971246" cy="3230880"/>
+            <wp:effectExtent l="0" t="0" r="0" b="7620"/>
+            <wp:docPr id="1257062331" name="Picture 1" descr="A screen shot of a computer screen&#10;&#10;AI-generated content may be incorrect."/>
+            <wp:cNvGraphicFramePr>
+              <a:graphicFrameLocks xmlns:a="http://schemas.openxmlformats.org/drawingml/2006/main" noChangeAspect="1"/>
+            </wp:cNvGraphicFramePr>
+            <a:graphic xmlns:a="http://schemas.openxmlformats.org/drawingml/2006/main">
+              <a:graphicData uri="http://schemas.openxmlformats.org/drawingml/2006/picture">
+                <pic:pic xmlns:pic="http://schemas.openxmlformats.org/drawingml/2006/picture">
+                  <pic:nvPicPr>
+                    <pic:cNvPr id="1257062331" name="Picture 1" descr="A screen shot of a computer screen&#10;&#10;AI-generated content may be incorrect."/>
+                    <pic:cNvPicPr/>
+                  </pic:nvPicPr>
+                  <pic:blipFill>
+                    <a:blip r:embed="rId6"/>
+                    <a:stretch>
+                      <a:fillRect/>
+                    </a:stretch>
+                  </pic:blipFill>
+                  <pic:spPr>
+                    <a:xfrm>
+                      <a:off x="0" y="0"/>
+                      <a:ext cx="3976388" cy="3235063"/>
+                    </a:xfrm>
+                    <a:prstGeom prst="rect">
+                      <a:avLst/>
+                    </a:prstGeom>
+                  </pic:spPr>
+                </pic:pic>
+              </a:graphicData>
+            </a:graphic>
+          </wp:inline>
+        </w:drawing>
+      </w:r>
+    </w:p>
+    <w:p>
+      <w:pPr>
+        <w:spacing w:before="100" w:beforeAutospacing="1" w:after="100" w:afterAutospacing="1" w:line="240" w:lineRule="auto"/>
+        <w:rPr>
+          <w:rFonts w:ascii="Times New Roman" w:eastAsia="Times New Roman" w:hAnsi="Times New Roman" w:cs="Times New Roman"/>
+          <w:kern w:val="0"/>
+          <w14:ligatures w14:val="none"/>
+        </w:rPr>
+      </w:pPr>
+      <w:r>
+        <w:rPr>
+          <w:rFonts w:ascii="Times New Roman" w:eastAsia="Times New Roman" w:hAnsi="Times New Roman" w:cs="Times New Roman"/>
+          <w:kern w:val="0"/>
+          <w14:ligatures w14:val="none"/>
+        </w:rPr>
+        <w:drawing>
+          <wp:inline distT="0" distB="0" distL="0" distR="0" wp14:anchorId="7D5E7485" wp14:editId="2BA902C9">
+            <wp:extent cx="3952443" cy="3192780"/>
+            <wp:effectExtent l="0" t="0" r="0" b="7620"/>
+            <wp:docPr id="1129201278" name="Picture 1" descr="A screen shot of a computer screen&#10;&#10;AI-generated content may be incorrect."/>
+            <wp:cNvGraphicFramePr>
+              <a:graphicFrameLocks xmlns:a="http://schemas.openxmlformats.org/drawingml/2006/main" noChangeAspect="1"/>
+            </wp:cNvGraphicFramePr>
+            <a:graphic xmlns:a="http://schemas.openxmlformats.org/drawingml/2006/main">
+              <a:graphicData uri="http://schemas.openxmlformats.org/drawingml/2006/picture">
+                <pic:pic xmlns:pic="http://schemas.openxmlformats.org/drawingml/2006/picture">
+                  <pic:nvPicPr>
+                    <pic:cNvPr id="1129201278" name="Picture 1" descr="A screen shot of a computer screen&#10;&#10;AI-generated content may be incorrect."/>
+                    <pic:cNvPicPr/>
+                  </pic:nvPicPr>
+                  <pic:blipFill>
+                    <a:blip r:embed="rId7"/>
+                    <a:stretch>
+                      <a:fillRect/>
+                    </a:stretch>
+                  </pic:blipFill>
+                  <pic:spPr>
+                    <a:xfrm>
+                      <a:off x="0" y="0"/>
+                      <a:ext cx="3957058" cy="3196508"/>
+                    </a:xfrm>
+                    <a:prstGeom prst="rect">
+                      <a:avLst/>
+                    </a:prstGeom>
+                  </pic:spPr>
+                </pic:pic>
+              </a:graphicData>
+            </a:graphic>
+          </wp:inline>
+        </w:drawing>
+      </w:r>
+    </w:p>
+    <w:p>
+      <w:pPr>
+        <w:spacing w:before="100" w:beforeAutospacing="1" w:after="100" w:afterAutospacing="1" w:line="240" w:lineRule="auto"/>
+        <w:rPr>
+          <w:rFonts w:ascii="Times New Roman" w:eastAsia="Times New Roman" w:hAnsi="Times New Roman" w:cs="Times New Roman"/>
+          <w:kern w:val="0"/>
+          <w14:ligatures w14:val="none"/>
+        </w:rPr>
+      </w:pPr>
+    </w:p>
+    <w:p>
+      <w:pPr>
+        <w:spacing w:before="100" w:beforeAutospacing="1" w:after="100" w:afterAutospacing="1" w:line="240" w:lineRule="auto"/>
+        <w:rPr>
+          <w:rFonts w:ascii="Times New Roman" w:eastAsia="Times New Roman" w:hAnsi="Times New Roman" w:cs="Times New Roman"/>
+          <w:kern w:val="0"/>
+          <w14:ligatures w14:val="none"/>
+        </w:rPr>
+      </w:pPr>
+    </w:p>
+    <w:p>
+      <w:pPr>
+        <w:spacing w:before="100" w:beforeAutospacing="1" w:after="100" w:afterAutospacing="1" w:line="240" w:lineRule="auto"/>
+        <w:rPr>
+          <w:rFonts w:ascii="Times New Roman" w:eastAsia="Times New Roman" w:hAnsi="Times New Roman" w:cs="Times New Roman"/>
+          <w:kern w:val="0"/>
+          <w14:ligatures w14:val="none"/>
+        </w:rPr>
+      </w:pPr>
+      <w:r>
+        <w:rPr>
+          <w:rFonts w:ascii="Times New Roman" w:eastAsia="Times New Roman" w:hAnsi="Times New Roman" w:cs="Times New Roman"/>
+          <w:kern w:val="0"/>
+          <w14:ligatures w14:val="none"/>
+        </w:rPr>
+        <w:lastRenderedPageBreak/>
+        <w:drawing>
+          <wp:inline distT="0" distB="0" distL="0" distR="0" wp14:anchorId="0DDCA53A" wp14:editId="64BB4B21">
+            <wp:extent cx="4239820" cy="3429000"/>
+            <wp:effectExtent l="0" t="0" r="8890" b="0"/>
+            <wp:docPr id="616860165" name="Picture 1" descr="A screen shot of a computer screen&#10;&#10;AI-generated content may be incorrect."/>
+            <wp:cNvGraphicFramePr>
+              <a:graphicFrameLocks xmlns:a="http://schemas.openxmlformats.org/drawingml/2006/main" noChangeAspect="1"/>
+            </wp:cNvGraphicFramePr>
+            <a:graphic xmlns:a="http://schemas.openxmlformats.org/drawingml/2006/main">
+              <a:graphicData uri="http://schemas.openxmlformats.org/drawingml/2006/picture">
+                <pic:pic xmlns:pic="http://schemas.openxmlformats.org/drawingml/2006/picture">
+                  <pic:nvPicPr>
+                    <pic:cNvPr id="616860165" name="Picture 1" descr="A screen shot of a computer screen&#10;&#10;AI-generated content may be incorrect."/>
+                    <pic:cNvPicPr/>
+                  </pic:nvPicPr>
+                  <pic:blipFill>
+                    <a:blip r:embed="rId8"/>
+                    <a:stretch>
+                      <a:fillRect/>
+                    </a:stretch>
+                  </pic:blipFill>
+                  <pic:spPr>
+                    <a:xfrm>
+                      <a:off x="0" y="0"/>
+                      <a:ext cx="4246906" cy="3434731"/>
+                    </a:xfrm>
+                    <a:prstGeom prst="rect">
+                      <a:avLst/>
+                    </a:prstGeom>
+                  </pic:spPr>
+                </pic:pic>
+              </a:graphicData>
+            </a:graphic>
+          </wp:inline>
+        </w:drawing>
+      </w:r>
+    </w:p>
+    <w:p>
+      <w:pPr>
+        <w:spacing w:before="100" w:beforeAutospacing="1" w:after="100" w:afterAutospacing="1" w:line="240" w:lineRule="auto"/>
+        <w:rPr>
+          <w:rFonts w:ascii="Times New Roman" w:eastAsia="Times New Roman" w:hAnsi="Times New Roman" w:cs="Times New Roman"/>
+          <w:b/>
+          <w:bCs/>
+          <w:kern w:val="0"/>
+          <w14:ligatures w14:val="none"/>
+        </w:rPr>
+      </w:pPr>
+    </w:p>
+    <w:p>
+      <w:pPr>
+        <w:spacing w:before="100" w:beforeAutospacing="1" w:after="100" w:afterAutospacing="1" w:line="240" w:lineRule="auto"/>
+        <w:rPr>
+          <w:rFonts w:ascii="Times New Roman" w:eastAsia="Times New Roman" w:hAnsi="Times New Roman" w:cs="Times New Roman"/>
+          <w:kern w:val="0"/>
+          <w14:ligatures w14:val="none"/>
+        </w:rPr>
+      </w:pPr>
+      <w:r>
+        <w:rPr>
+          <w:rFonts w:ascii="Times New Roman" w:eastAsia="Times New Roman" w:hAnsi="Times New Roman" w:cs="Times New Roman"/>
+          <w:b/>
+          <w:bCs/>
+          <w:kern w:val="0"/>
+          <w14:ligatures w14:val="none"/>
+        </w:rPr>
+        <w:t>4. Cluster Purity and Composition Analysis</w:t>
+      </w:r>
+    </w:p>
+    <w:p>
+      <w:pPr>
+        <w:numPr>
+          <w:ilvl w:val="0"/>
+          <w:numId w:val="17"/>
+        </w:numPr>
+        <w:spacing w:before="100" w:beforeAutospacing="1" w:after="100" w:afterAutospacing="1" w:line="240" w:lineRule="auto"/>
+        <w:rPr>
+          <w:rFonts w:ascii="Times New Roman" w:eastAsia="Times New Roman" w:hAnsi="Times New Roman" w:cs="Times New Roman"/>
+          <w:kern w:val="0"/>
+          <w14:ligatures w14:val="none"/>
+        </w:rPr>
+      </w:pPr>
+      <w:r>
+        <w:rPr>
+          <w:rFonts w:ascii="Times New Roman" w:eastAsia="Times New Roman" w:hAnsi="Times New Roman" w:cs="Times New Roman"/>
+          <w:b/>
+          <w:bCs/>
+          <w:kern w:val="0"/>
+          <w14:ligatures w14:val="none"/>
+        </w:rPr>
+        <w:t>Purity:</w:t>
+      </w:r>
+      <w:r>
+        <w:rPr>
+          <w:rFonts w:ascii="Times New Roman" w:eastAsia="Times New Roman" w:hAnsi="Times New Roman" w:cs="Times New Roman"/>
+          <w:kern w:val="0"/>
+          <w14:ligatures w14:val="none"/>
+        </w:rPr>
+        <w:t> For each cluster, we looked at what fraction of images belonged to the most common person (the “purity”). High purity means the cluster mostly contains images of the same person; low purity means it’s a mix.</w:t>
+      </w:r>
+    </w:p>
+    <w:p>
+      <w:pPr>
+        <w:numPr>
+          <w:ilvl w:val="0"/>
+          <w:numId w:val="17"/>
+        </w:numPr>
+        <w:spacing w:before="100" w:beforeAutospacing="1" w:after="100" w:afterAutospacing="1" w:line="240" w:lineRule="auto"/>
+        <w:rPr>
+          <w:rFonts w:ascii="Times New Roman" w:eastAsia="Times New Roman" w:hAnsi="Times New Roman" w:cs="Times New Roman"/>
+          <w:kern w:val="0"/>
+          <w14:ligatures w14:val="none"/>
+        </w:rPr>
+      </w:pPr>
+      <w:r>
+        <w:rPr>
+          <w:rFonts w:ascii="Times New Roman" w:eastAsia="Times New Roman" w:hAnsi="Times New Roman" w:cs="Times New Roman"/>
+          <w:b/>
+          <w:bCs/>
+          <w:kern w:val="0"/>
+          <w14:ligatures w14:val="none"/>
+        </w:rPr>
+        <w:t>Results:</w:t>
       </w:r>
     </w:p>
     <w:p>
       <w:pPr>
         <w:numPr>
           <w:ilvl w:val="1"/>
-          <w:numId w:val="6"/>
+          <w:numId w:val="17"/>
         </w:numPr>
         <w:spacing w:before="100" w:beforeAutospacing="1" w:after="100" w:afterAutospacing="1" w:line="240" w:lineRule="auto"/>
         <w:rPr>
@@ -1774,24 +2086,14 @@
           <w:kern w:val="0"/>
           <w14:ligatures w14:val="none"/>
         </w:rPr>
-        <w:t xml:space="preserve">Adjusted Rand Index (ARI): </w:t>
-      </w:r>
-      <w:r>
-        <w:rPr>
-          <w:rFonts w:ascii="Times New Roman" w:eastAsia="Times New Roman" w:hAnsi="Times New Roman" w:cs="Times New Roman"/>
-          <w:b/>
-          <w:bCs/>
-          <w:kern w:val="0"/>
-          <w14:ligatures w14:val="none"/>
-        </w:rPr>
-        <w:t>0.3389</w:t>
+        <w:t>Some clusters were very pure (e.g., all images of one person), showing the method worked well for those cases.</w:t>
       </w:r>
     </w:p>
     <w:p>
       <w:pPr>
         <w:numPr>
           <w:ilvl w:val="1"/>
-          <w:numId w:val="6"/>
+          <w:numId w:val="17"/>
         </w:numPr>
         <w:spacing w:before="100" w:beforeAutospacing="1" w:after="100" w:afterAutospacing="1" w:line="240" w:lineRule="auto"/>
         <w:rPr>
@@ -1806,24 +2108,14 @@
           <w:kern w:val="0"/>
           <w14:ligatures w14:val="none"/>
         </w:rPr>
-        <w:t xml:space="preserve">Normalized Mutual Information (NMI): </w:t>
-      </w:r>
-      <w:r>
-        <w:rPr>
-          <w:rFonts w:ascii="Times New Roman" w:eastAsia="Times New Roman" w:hAnsi="Times New Roman" w:cs="Times New Roman"/>
-          <w:b/>
-          <w:bCs/>
-          <w:kern w:val="0"/>
-          <w14:ligatures w14:val="none"/>
-        </w:rPr>
-        <w:t>0.6555</w:t>
+        <w:t>Many clusters were mixed, especially when people had similar poses or lighting, or when the same person appeared in different conditions.</w:t>
       </w:r>
     </w:p>
     <w:p>
       <w:pPr>
         <w:numPr>
           <w:ilvl w:val="1"/>
-          <w:numId w:val="6"/>
+          <w:numId w:val="17"/>
         </w:numPr>
         <w:spacing w:before="100" w:beforeAutospacing="1" w:after="100" w:afterAutospacing="1" w:line="240" w:lineRule="auto"/>
         <w:rPr>
@@ -1835,59 +2127,27 @@
       <w:r>
         <w:rPr>
           <w:rFonts w:ascii="Times New Roman" w:eastAsia="Times New Roman" w:hAnsi="Times New Roman" w:cs="Times New Roman"/>
-          <w:kern w:val="0"/>
-          <w14:ligatures w14:val="none"/>
-        </w:rPr>
-        <w:t xml:space="preserve">Silhouette score: </w:t>
-      </w:r>
-      <w:r>
-        <w:rPr>
-          <w:rFonts w:ascii="Times New Roman" w:eastAsia="Times New Roman" w:hAnsi="Times New Roman" w:cs="Times New Roman"/>
-          <w:b/>
-          <w:bCs/>
-          <w:kern w:val="0"/>
-          <w14:ligatures w14:val="none"/>
-        </w:rPr>
-        <w:t>0.2273</w:t>
-      </w:r>
-    </w:p>
-    <w:p>
-      <w:pPr>
-        <w:numPr>
-          <w:ilvl w:val="1"/>
-          <w:numId w:val="6"/>
-        </w:numPr>
-        <w:spacing w:before="100" w:beforeAutospacing="1" w:after="100" w:afterAutospacing="1" w:line="240" w:lineRule="auto"/>
-        <w:rPr>
-          <w:rFonts w:ascii="Times New Roman" w:eastAsia="Times New Roman" w:hAnsi="Times New Roman" w:cs="Times New Roman"/>
-          <w:kern w:val="0"/>
-          <w14:ligatures w14:val="none"/>
-        </w:rPr>
-      </w:pPr>
-      <w:r>
-        <w:rPr>
-          <w:rFonts w:ascii="Times New Roman" w:eastAsia="Times New Roman" w:hAnsi="Times New Roman" w:cs="Times New Roman"/>
-          <w:kern w:val="0"/>
-          <w14:ligatures w14:val="none"/>
-        </w:rPr>
-        <w:t xml:space="preserve">Cluster purity: </w:t>
-      </w:r>
-      <w:r>
-        <w:rPr>
-          <w:rFonts w:ascii="Times New Roman" w:eastAsia="Times New Roman" w:hAnsi="Times New Roman" w:cs="Times New Roman"/>
-          <w:b/>
-          <w:bCs/>
-          <w:kern w:val="0"/>
-          <w14:ligatures w14:val="none"/>
-        </w:rPr>
-        <w:t>0.5275</w:t>
+          <w:b/>
+          <w:bCs/>
+          <w:kern w:val="0"/>
+          <w14:ligatures w14:val="none"/>
+        </w:rPr>
+        <w:t>Overall purity:</w:t>
+      </w:r>
+      <w:r>
+        <w:rPr>
+          <w:rFonts w:ascii="Times New Roman" w:eastAsia="Times New Roman" w:hAnsi="Times New Roman" w:cs="Times New Roman"/>
+          <w:kern w:val="0"/>
+          <w14:ligatures w14:val="none"/>
+        </w:rPr>
+        <w:t> About 0.29 for training data and 0.18 for test data, for both K-Means and Agglomerative. This means that, on average, less than a third of each cluster is made up of the same person, and it’s even lower on new (test) data.</w:t>
       </w:r>
     </w:p>
     <w:p>
       <w:pPr>
         <w:numPr>
           <w:ilvl w:val="0"/>
-          <w:numId w:val="6"/>
+          <w:numId w:val="17"/>
         </w:numPr>
         <w:spacing w:before="100" w:beforeAutospacing="1" w:after="100" w:afterAutospacing="1" w:line="240" w:lineRule="auto"/>
         <w:rPr>
@@ -1904,164 +2164,42 @@
           <w:kern w:val="0"/>
           <w14:ligatures w14:val="none"/>
         </w:rPr>
-        <w:t>Agglomerative on PCA (</w:t>
-      </w:r>
-      <w:proofErr w:type="spellStart"/>
-      <w:r>
-        <w:rPr>
-          <w:rFonts w:ascii="Times New Roman" w:eastAsia="Times New Roman" w:hAnsi="Times New Roman" w:cs="Times New Roman"/>
-          <w:b/>
-          <w:bCs/>
-          <w:kern w:val="0"/>
-          <w14:ligatures w14:val="none"/>
-        </w:rPr>
-        <w:t>pca</w:t>
-      </w:r>
-      <w:proofErr w:type="spellEnd"/>
-      <w:r>
-        <w:rPr>
-          <w:rFonts w:ascii="Times New Roman" w:eastAsia="Times New Roman" w:hAnsi="Times New Roman" w:cs="Times New Roman"/>
-          <w:b/>
-          <w:bCs/>
-          <w:kern w:val="0"/>
-          <w14:ligatures w14:val="none"/>
-        </w:rPr>
-        <w:t>-Agglomerative)</w:t>
-      </w:r>
-    </w:p>
-    <w:p>
-      <w:pPr>
-        <w:numPr>
-          <w:ilvl w:val="1"/>
-          <w:numId w:val="6"/>
-        </w:numPr>
-        <w:spacing w:before="100" w:beforeAutospacing="1" w:after="100" w:afterAutospacing="1" w:line="240" w:lineRule="auto"/>
-        <w:rPr>
-          <w:rFonts w:ascii="Times New Roman" w:eastAsia="Times New Roman" w:hAnsi="Times New Roman" w:cs="Times New Roman"/>
-          <w:kern w:val="0"/>
-          <w14:ligatures w14:val="none"/>
-        </w:rPr>
-      </w:pPr>
-      <w:r>
-        <w:rPr>
-          <w:rFonts w:ascii="Times New Roman" w:eastAsia="Times New Roman" w:hAnsi="Times New Roman" w:cs="Times New Roman"/>
-          <w:kern w:val="0"/>
-          <w14:ligatures w14:val="none"/>
-        </w:rPr>
-        <w:t xml:space="preserve">ARI: </w:t>
-      </w:r>
-      <w:r>
-        <w:rPr>
-          <w:rFonts w:ascii="Times New Roman" w:eastAsia="Times New Roman" w:hAnsi="Times New Roman" w:cs="Times New Roman"/>
-          <w:b/>
-          <w:bCs/>
-          <w:kern w:val="0"/>
-          <w14:ligatures w14:val="none"/>
-        </w:rPr>
-        <w:t>0.3802</w:t>
-      </w:r>
-    </w:p>
-    <w:p>
-      <w:pPr>
-        <w:numPr>
-          <w:ilvl w:val="1"/>
-          <w:numId w:val="6"/>
-        </w:numPr>
-        <w:spacing w:before="100" w:beforeAutospacing="1" w:after="100" w:afterAutospacing="1" w:line="240" w:lineRule="auto"/>
-        <w:rPr>
-          <w:rFonts w:ascii="Times New Roman" w:eastAsia="Times New Roman" w:hAnsi="Times New Roman" w:cs="Times New Roman"/>
-          <w:kern w:val="0"/>
-          <w14:ligatures w14:val="none"/>
-        </w:rPr>
-      </w:pPr>
-      <w:r>
-        <w:rPr>
-          <w:rFonts w:ascii="Times New Roman" w:eastAsia="Times New Roman" w:hAnsi="Times New Roman" w:cs="Times New Roman"/>
-          <w:kern w:val="0"/>
-          <w14:ligatures w14:val="none"/>
-        </w:rPr>
-        <w:t xml:space="preserve">NMI: </w:t>
-      </w:r>
-      <w:r>
-        <w:rPr>
-          <w:rFonts w:ascii="Times New Roman" w:eastAsia="Times New Roman" w:hAnsi="Times New Roman" w:cs="Times New Roman"/>
-          <w:b/>
-          <w:bCs/>
-          <w:kern w:val="0"/>
-          <w14:ligatures w14:val="none"/>
-        </w:rPr>
-        <w:t>0.7036</w:t>
-      </w:r>
-    </w:p>
-    <w:p>
-      <w:pPr>
-        <w:numPr>
-          <w:ilvl w:val="1"/>
-          <w:numId w:val="6"/>
-        </w:numPr>
-        <w:spacing w:before="100" w:beforeAutospacing="1" w:after="100" w:afterAutospacing="1" w:line="240" w:lineRule="auto"/>
-        <w:rPr>
-          <w:rFonts w:ascii="Times New Roman" w:eastAsia="Times New Roman" w:hAnsi="Times New Roman" w:cs="Times New Roman"/>
-          <w:kern w:val="0"/>
-          <w14:ligatures w14:val="none"/>
-        </w:rPr>
-      </w:pPr>
-      <w:r>
-        <w:rPr>
-          <w:rFonts w:ascii="Times New Roman" w:eastAsia="Times New Roman" w:hAnsi="Times New Roman" w:cs="Times New Roman"/>
-          <w:kern w:val="0"/>
-          <w14:ligatures w14:val="none"/>
-        </w:rPr>
-        <w:t xml:space="preserve">Silhouette score: </w:t>
-      </w:r>
-      <w:r>
-        <w:rPr>
-          <w:rFonts w:ascii="Times New Roman" w:eastAsia="Times New Roman" w:hAnsi="Times New Roman" w:cs="Times New Roman"/>
-          <w:b/>
-          <w:bCs/>
-          <w:kern w:val="0"/>
-          <w14:ligatures w14:val="none"/>
-        </w:rPr>
-        <w:t>0.2373</w:t>
-      </w:r>
-    </w:p>
-    <w:p>
-      <w:pPr>
-        <w:numPr>
-          <w:ilvl w:val="1"/>
-          <w:numId w:val="6"/>
-        </w:numPr>
-        <w:spacing w:before="100" w:beforeAutospacing="1" w:after="100" w:afterAutospacing="1" w:line="240" w:lineRule="auto"/>
-        <w:rPr>
-          <w:rFonts w:ascii="Times New Roman" w:eastAsia="Times New Roman" w:hAnsi="Times New Roman" w:cs="Times New Roman"/>
-          <w:kern w:val="0"/>
-          <w14:ligatures w14:val="none"/>
-        </w:rPr>
-      </w:pPr>
-      <w:r>
-        <w:rPr>
-          <w:rFonts w:ascii="Times New Roman" w:eastAsia="Times New Roman" w:hAnsi="Times New Roman" w:cs="Times New Roman"/>
-          <w:kern w:val="0"/>
-          <w14:ligatures w14:val="none"/>
-        </w:rPr>
-        <w:t xml:space="preserve">Cluster purity: </w:t>
-      </w:r>
-      <w:r>
-        <w:rPr>
-          <w:rFonts w:ascii="Times New Roman" w:eastAsia="Times New Roman" w:hAnsi="Times New Roman" w:cs="Times New Roman"/>
-          <w:b/>
-          <w:bCs/>
-          <w:kern w:val="0"/>
-          <w14:ligatures w14:val="none"/>
-        </w:rPr>
-        <w:t>0.5478</w:t>
+        <w:t>What this tells us:</w:t>
+      </w:r>
+      <w:r>
+        <w:rPr>
+          <w:rFonts w:ascii="Times New Roman" w:eastAsia="Times New Roman" w:hAnsi="Times New Roman" w:cs="Times New Roman"/>
+          <w:kern w:val="0"/>
+          <w14:ligatures w14:val="none"/>
+        </w:rPr>
+        <w:t> The clustering methods could group some people well, but often mixed up identities, especially when pose or lighting changed. Agglomerative did a little better than K-Means, and using autoencoder features helped a bit, but not dramatically.</w:t>
+      </w:r>
+    </w:p>
+    <w:p>
+      <w:pPr>
+        <w:spacing w:before="100" w:beforeAutospacing="1" w:after="100" w:afterAutospacing="1" w:line="240" w:lineRule="auto"/>
+        <w:rPr>
+          <w:rFonts w:ascii="Times New Roman" w:eastAsia="Times New Roman" w:hAnsi="Times New Roman" w:cs="Times New Roman"/>
+          <w:kern w:val="0"/>
+          <w14:ligatures w14:val="none"/>
+        </w:rPr>
+      </w:pPr>
+      <w:r>
+        <w:rPr>
+          <w:rFonts w:ascii="Times New Roman" w:eastAsia="Times New Roman" w:hAnsi="Times New Roman" w:cs="Times New Roman"/>
+          <w:b/>
+          <w:bCs/>
+          <w:kern w:val="0"/>
+          <w14:ligatures w14:val="none"/>
+        </w:rPr>
+        <w:t>Summary</w:t>
       </w:r>
     </w:p>
     <w:p>
       <w:pPr>
         <w:numPr>
           <w:ilvl w:val="0"/>
-          <w:numId w:val="6"/>
+          <w:numId w:val="18"/>
         </w:numPr>
         <w:spacing w:before="100" w:beforeAutospacing="1" w:after="100" w:afterAutospacing="1" w:line="240" w:lineRule="auto"/>
         <w:rPr>
@@ -2073,269 +2211,17 @@
       <w:r>
         <w:rPr>
           <w:rFonts w:ascii="Times New Roman" w:eastAsia="Times New Roman" w:hAnsi="Times New Roman" w:cs="Times New Roman"/>
-          <w:b/>
-          <w:bCs/>
-          <w:kern w:val="0"/>
-          <w14:ligatures w14:val="none"/>
-        </w:rPr>
-        <w:t>K-Means on AE latent codes (AE-</w:t>
-      </w:r>
-      <w:proofErr w:type="spellStart"/>
-      <w:r>
-        <w:rPr>
-          <w:rFonts w:ascii="Times New Roman" w:eastAsia="Times New Roman" w:hAnsi="Times New Roman" w:cs="Times New Roman"/>
-          <w:b/>
-          <w:bCs/>
-          <w:kern w:val="0"/>
-          <w14:ligatures w14:val="none"/>
-        </w:rPr>
-        <w:t>KMeans</w:t>
-      </w:r>
-      <w:proofErr w:type="spellEnd"/>
-      <w:r>
-        <w:rPr>
-          <w:rFonts w:ascii="Times New Roman" w:eastAsia="Times New Roman" w:hAnsi="Times New Roman" w:cs="Times New Roman"/>
-          <w:b/>
-          <w:bCs/>
-          <w:kern w:val="0"/>
-          <w14:ligatures w14:val="none"/>
-        </w:rPr>
-        <w:t>, optional)</w:t>
-      </w:r>
-    </w:p>
-    <w:p>
-      <w:pPr>
-        <w:numPr>
-          <w:ilvl w:val="1"/>
-          <w:numId w:val="6"/>
-        </w:numPr>
-        <w:spacing w:before="100" w:beforeAutospacing="1" w:after="100" w:afterAutospacing="1" w:line="240" w:lineRule="auto"/>
-        <w:rPr>
-          <w:rFonts w:ascii="Times New Roman" w:eastAsia="Times New Roman" w:hAnsi="Times New Roman" w:cs="Times New Roman"/>
-          <w:kern w:val="0"/>
-          <w14:ligatures w14:val="none"/>
-        </w:rPr>
-      </w:pPr>
-      <w:r>
-        <w:rPr>
-          <w:rFonts w:ascii="Times New Roman" w:eastAsia="Times New Roman" w:hAnsi="Times New Roman" w:cs="Times New Roman"/>
-          <w:kern w:val="0"/>
-          <w14:ligatures w14:val="none"/>
-        </w:rPr>
-        <w:t xml:space="preserve">ARI: </w:t>
-      </w:r>
-      <w:r>
-        <w:rPr>
-          <w:rFonts w:ascii="Times New Roman" w:eastAsia="Times New Roman" w:hAnsi="Times New Roman" w:cs="Times New Roman"/>
-          <w:b/>
-          <w:bCs/>
-          <w:kern w:val="0"/>
-          <w14:ligatures w14:val="none"/>
-        </w:rPr>
-        <w:t>0.3633</w:t>
-      </w:r>
-    </w:p>
-    <w:p>
-      <w:pPr>
-        <w:numPr>
-          <w:ilvl w:val="1"/>
-          <w:numId w:val="6"/>
-        </w:numPr>
-        <w:spacing w:before="100" w:beforeAutospacing="1" w:after="100" w:afterAutospacing="1" w:line="240" w:lineRule="auto"/>
-        <w:rPr>
-          <w:rFonts w:ascii="Times New Roman" w:eastAsia="Times New Roman" w:hAnsi="Times New Roman" w:cs="Times New Roman"/>
-          <w:kern w:val="0"/>
-          <w14:ligatures w14:val="none"/>
-        </w:rPr>
-      </w:pPr>
-      <w:r>
-        <w:rPr>
-          <w:rFonts w:ascii="Times New Roman" w:eastAsia="Times New Roman" w:hAnsi="Times New Roman" w:cs="Times New Roman"/>
-          <w:kern w:val="0"/>
-          <w14:ligatures w14:val="none"/>
-        </w:rPr>
-        <w:t xml:space="preserve">NMI: </w:t>
-      </w:r>
-      <w:r>
-        <w:rPr>
-          <w:rFonts w:ascii="Times New Roman" w:eastAsia="Times New Roman" w:hAnsi="Times New Roman" w:cs="Times New Roman"/>
-          <w:b/>
-          <w:bCs/>
-          <w:kern w:val="0"/>
-          <w14:ligatures w14:val="none"/>
-        </w:rPr>
-        <w:t>0.6630</w:t>
-      </w:r>
-    </w:p>
-    <w:p>
-      <w:pPr>
-        <w:numPr>
-          <w:ilvl w:val="1"/>
-          <w:numId w:val="6"/>
-        </w:numPr>
-        <w:spacing w:before="100" w:beforeAutospacing="1" w:after="100" w:afterAutospacing="1" w:line="240" w:lineRule="auto"/>
-        <w:rPr>
-          <w:rFonts w:ascii="Times New Roman" w:eastAsia="Times New Roman" w:hAnsi="Times New Roman" w:cs="Times New Roman"/>
-          <w:kern w:val="0"/>
-          <w14:ligatures w14:val="none"/>
-        </w:rPr>
-      </w:pPr>
-      <w:r>
-        <w:rPr>
-          <w:rFonts w:ascii="Times New Roman" w:eastAsia="Times New Roman" w:hAnsi="Times New Roman" w:cs="Times New Roman"/>
-          <w:kern w:val="0"/>
-          <w14:ligatures w14:val="none"/>
-        </w:rPr>
-        <w:t xml:space="preserve">Silhouette score: </w:t>
-      </w:r>
-      <w:r>
-        <w:rPr>
-          <w:rFonts w:ascii="Times New Roman" w:eastAsia="Times New Roman" w:hAnsi="Times New Roman" w:cs="Times New Roman"/>
-          <w:b/>
-          <w:bCs/>
-          <w:kern w:val="0"/>
-          <w14:ligatures w14:val="none"/>
-        </w:rPr>
-        <w:t>0.2515</w:t>
-      </w:r>
-    </w:p>
-    <w:p>
-      <w:pPr>
-        <w:numPr>
-          <w:ilvl w:val="1"/>
-          <w:numId w:val="6"/>
-        </w:numPr>
-        <w:spacing w:before="100" w:beforeAutospacing="1" w:after="100" w:afterAutospacing="1" w:line="240" w:lineRule="auto"/>
-        <w:rPr>
-          <w:rFonts w:ascii="Times New Roman" w:eastAsia="Times New Roman" w:hAnsi="Times New Roman" w:cs="Times New Roman"/>
-          <w:kern w:val="0"/>
-          <w14:ligatures w14:val="none"/>
-        </w:rPr>
-      </w:pPr>
-      <w:r>
-        <w:rPr>
-          <w:rFonts w:ascii="Times New Roman" w:eastAsia="Times New Roman" w:hAnsi="Times New Roman" w:cs="Times New Roman"/>
-          <w:kern w:val="0"/>
-          <w14:ligatures w14:val="none"/>
-        </w:rPr>
-        <w:t xml:space="preserve">Cluster purity: </w:t>
-      </w:r>
-      <w:r>
-        <w:rPr>
-          <w:rFonts w:ascii="Times New Roman" w:eastAsia="Times New Roman" w:hAnsi="Times New Roman" w:cs="Times New Roman"/>
-          <w:b/>
-          <w:bCs/>
-          <w:kern w:val="0"/>
-          <w14:ligatures w14:val="none"/>
-        </w:rPr>
-        <w:t>0.5362</w:t>
-      </w:r>
-    </w:p>
-    <w:p>
-      <w:pPr>
-        <w:spacing w:before="100" w:beforeAutospacing="1" w:after="100" w:afterAutospacing="1" w:line="240" w:lineRule="auto"/>
-        <w:rPr>
-          <w:rFonts w:ascii="Times New Roman" w:eastAsia="Times New Roman" w:hAnsi="Times New Roman" w:cs="Times New Roman"/>
-          <w:kern w:val="0"/>
-          <w14:ligatures w14:val="none"/>
-        </w:rPr>
-      </w:pPr>
-      <w:r>
-        <w:rPr>
-          <w:rFonts w:ascii="Times New Roman" w:eastAsia="Times New Roman" w:hAnsi="Times New Roman" w:cs="Times New Roman"/>
-          <w:kern w:val="0"/>
-          <w14:ligatures w14:val="none"/>
-        </w:rPr>
-        <w:t xml:space="preserve">Across these metrics, </w:t>
-      </w:r>
-      <w:r>
-        <w:rPr>
-          <w:rFonts w:ascii="Times New Roman" w:eastAsia="Times New Roman" w:hAnsi="Times New Roman" w:cs="Times New Roman"/>
-          <w:b/>
-          <w:bCs/>
-          <w:kern w:val="0"/>
-          <w14:ligatures w14:val="none"/>
-        </w:rPr>
-        <w:t>Agglomerative clustering on PCA features</w:t>
-      </w:r>
-      <w:r>
-        <w:rPr>
-          <w:rFonts w:ascii="Times New Roman" w:eastAsia="Times New Roman" w:hAnsi="Times New Roman" w:cs="Times New Roman"/>
-          <w:kern w:val="0"/>
-          <w14:ligatures w14:val="none"/>
-        </w:rPr>
-        <w:t xml:space="preserve"> performs slightly better than K-Means, indicating that hierarchical merging with Ward linkage can model the data structure more accurately.</w:t>
-      </w:r>
-    </w:p>
-    <w:p>
-      <w:pPr>
-        <w:spacing w:before="100" w:beforeAutospacing="1" w:after="100" w:afterAutospacing="1" w:line="240" w:lineRule="auto"/>
-        <w:outlineLvl w:val="2"/>
-        <w:rPr>
-          <w:rFonts w:ascii="Times New Roman" w:eastAsia="Times New Roman" w:hAnsi="Times New Roman" w:cs="Times New Roman"/>
-          <w:b/>
-          <w:bCs/>
-          <w:kern w:val="0"/>
-          <w:sz w:val="27"/>
-          <w:szCs w:val="27"/>
-          <w14:ligatures w14:val="none"/>
-        </w:rPr>
-      </w:pPr>
-      <w:r>
-        <w:rPr>
-          <w:rFonts w:ascii="Times New Roman" w:eastAsia="Times New Roman" w:hAnsi="Times New Roman" w:cs="Times New Roman"/>
-          <w:b/>
-          <w:bCs/>
-          <w:kern w:val="0"/>
-          <w:sz w:val="27"/>
-          <w:szCs w:val="27"/>
-          <w14:ligatures w14:val="none"/>
-        </w:rPr>
-        <w:t>4.3 2D visualization and cluster composition</w:t>
-      </w:r>
-    </w:p>
-    <w:p>
-      <w:pPr>
-        <w:spacing w:before="100" w:beforeAutospacing="1" w:after="100" w:afterAutospacing="1" w:line="240" w:lineRule="auto"/>
-        <w:rPr>
-          <w:rFonts w:ascii="Times New Roman" w:eastAsia="Times New Roman" w:hAnsi="Times New Roman" w:cs="Times New Roman"/>
-          <w:kern w:val="0"/>
-          <w14:ligatures w14:val="none"/>
-        </w:rPr>
-      </w:pPr>
-      <w:r>
-        <w:rPr>
-          <w:rFonts w:ascii="Times New Roman" w:eastAsia="Times New Roman" w:hAnsi="Times New Roman" w:cs="Times New Roman"/>
-          <w:kern w:val="0"/>
-          <w14:ligatures w14:val="none"/>
-        </w:rPr>
-        <w:lastRenderedPageBreak/>
-        <w:t xml:space="preserve">We projected the 50-dim PCA features down to </w:t>
-      </w:r>
-      <w:r>
-        <w:rPr>
-          <w:rFonts w:ascii="Times New Roman" w:eastAsia="Times New Roman" w:hAnsi="Times New Roman" w:cs="Times New Roman"/>
-          <w:b/>
-          <w:bCs/>
-          <w:kern w:val="0"/>
-          <w14:ligatures w14:val="none"/>
-        </w:rPr>
-        <w:t>2 principal components</w:t>
-      </w:r>
-      <w:r>
-        <w:rPr>
-          <w:rFonts w:ascii="Times New Roman" w:eastAsia="Times New Roman" w:hAnsi="Times New Roman" w:cs="Times New Roman"/>
-          <w:kern w:val="0"/>
-          <w14:ligatures w14:val="none"/>
-        </w:rPr>
-        <w:t xml:space="preserve"> and colored points by cluster ID to visualize the clustering structure:</w:t>
+          <w:kern w:val="0"/>
+          <w14:ligatures w14:val="none"/>
+        </w:rPr>
+        <w:t>Clustering faces by identity is hard because of pose and lighting changes.</w:t>
       </w:r>
     </w:p>
     <w:p>
       <w:pPr>
         <w:numPr>
           <w:ilvl w:val="0"/>
-          <w:numId w:val="7"/>
+          <w:numId w:val="18"/>
         </w:numPr>
         <w:spacing w:before="100" w:beforeAutospacing="1" w:after="100" w:afterAutospacing="1" w:line="240" w:lineRule="auto"/>
         <w:rPr>
@@ -2347,27 +2233,17 @@
       <w:r>
         <w:rPr>
           <w:rFonts w:ascii="Times New Roman" w:eastAsia="Times New Roman" w:hAnsi="Times New Roman" w:cs="Times New Roman"/>
-          <w:b/>
-          <w:bCs/>
-          <w:kern w:val="0"/>
-          <w14:ligatures w14:val="none"/>
-        </w:rPr>
-        <w:t>Figure pca_kmeans_scatter.png</w:t>
-      </w:r>
-      <w:r>
-        <w:rPr>
-          <w:rFonts w:ascii="Times New Roman" w:eastAsia="Times New Roman" w:hAnsi="Times New Roman" w:cs="Times New Roman"/>
-          <w:kern w:val="0"/>
-          <w14:ligatures w14:val="none"/>
-        </w:rPr>
-        <w:t>: PCA(2D) with K-Means clusters</w:t>
+          <w:kern w:val="0"/>
+          <w14:ligatures w14:val="none"/>
+        </w:rPr>
+        <w:t>Dimensionality reduction (PCA, autoencoder) helps, but doesn’t solve everything.</w:t>
       </w:r>
     </w:p>
     <w:p>
       <w:pPr>
         <w:numPr>
           <w:ilvl w:val="0"/>
-          <w:numId w:val="7"/>
+          <w:numId w:val="18"/>
         </w:numPr>
         <w:spacing w:before="100" w:beforeAutospacing="1" w:after="100" w:afterAutospacing="1" w:line="240" w:lineRule="auto"/>
         <w:rPr>
@@ -2379,38 +2255,33 @@
       <w:r>
         <w:rPr>
           <w:rFonts w:ascii="Times New Roman" w:eastAsia="Times New Roman" w:hAnsi="Times New Roman" w:cs="Times New Roman"/>
-          <w:b/>
-          <w:bCs/>
-          <w:kern w:val="0"/>
-          <w14:ligatures w14:val="none"/>
-        </w:rPr>
-        <w:t>Figure pca_agg_scatter.png</w:t>
-      </w:r>
-      <w:r>
-        <w:rPr>
-          <w:rFonts w:ascii="Times New Roman" w:eastAsia="Times New Roman" w:hAnsi="Times New Roman" w:cs="Times New Roman"/>
-          <w:kern w:val="0"/>
-          <w14:ligatures w14:val="none"/>
-        </w:rPr>
-        <w:t>: PCA(2D) with Agglomerative clusters</w:t>
-      </w:r>
-    </w:p>
-    <w:p>
-      <w:pPr>
-        <w:spacing w:before="100" w:beforeAutospacing="1" w:after="100" w:afterAutospacing="1" w:line="240" w:lineRule="auto"/>
-        <w:rPr>
-          <w:rFonts w:ascii="Times New Roman" w:eastAsia="Times New Roman" w:hAnsi="Times New Roman" w:cs="Times New Roman"/>
-          <w:kern w:val="0"/>
-          <w14:ligatures w14:val="none"/>
-        </w:rPr>
-      </w:pPr>
-      <w:r>
-        <w:rPr>
-          <w:rFonts w:ascii="Times New Roman" w:eastAsia="Times New Roman" w:hAnsi="Times New Roman" w:cs="Times New Roman"/>
-          <w:kern w:val="0"/>
-          <w14:ligatures w14:val="none"/>
-        </w:rPr>
-        <w:t>The plots reveal that images of the same person tend to form local neighborhoods, but there is still noticeable overlap between nearby clusters, especially for faces with similar pose or lighting.</w:t>
+          <w:kern w:val="0"/>
+          <w14:ligatures w14:val="none"/>
+        </w:rPr>
+        <w:t>Some clusters are pure, but many are mixed, so there’s room for improvement.</w:t>
+      </w:r>
+    </w:p>
+    <w:p>
+      <w:pPr>
+        <w:numPr>
+          <w:ilvl w:val="0"/>
+          <w:numId w:val="18"/>
+        </w:numPr>
+        <w:spacing w:before="100" w:beforeAutospacing="1" w:after="100" w:afterAutospacing="1" w:line="240" w:lineRule="auto"/>
+        <w:rPr>
+          <w:rFonts w:ascii="Times New Roman" w:eastAsia="Times New Roman" w:hAnsi="Times New Roman" w:cs="Times New Roman"/>
+          <w:kern w:val="0"/>
+          <w14:ligatures w14:val="none"/>
+        </w:rPr>
+      </w:pPr>
+      <w:r>
+        <w:rPr>
+          <w:rFonts w:ascii="Times New Roman" w:eastAsia="Times New Roman" w:hAnsi="Times New Roman" w:cs="Times New Roman"/>
+          <w:kern w:val="0"/>
+          <w14:ligatures w14:val="none"/>
+        </w:rPr>
+        <w:lastRenderedPageBreak/>
+        <w:t>Our analysis of cluster purity shows that while the methods can sometimes group the same person together, they often mix up different people, especially in challenging conditions.</w:t>
       </w:r>
     </w:p>
     <w:p>
@@ -2517,18 +2388,8 @@
           <w:kern w:val="0"/>
           <w14:ligatures w14:val="none"/>
         </w:rPr>
-        <w:t xml:space="preserve">Hidden layer 1: 128 units, </w:t>
-      </w:r>
-      <w:proofErr w:type="spellStart"/>
-      <w:r>
-        <w:rPr>
-          <w:rFonts w:ascii="Times New Roman" w:eastAsia="Times New Roman" w:hAnsi="Times New Roman" w:cs="Times New Roman"/>
-          <w:kern w:val="0"/>
-          <w14:ligatures w14:val="none"/>
-        </w:rPr>
-        <w:t>ReLU</w:t>
-      </w:r>
-      <w:proofErr w:type="spellEnd"/>
+        <w:t>Hidden layer 1: 128 units, ReLU</w:t>
+      </w:r>
     </w:p>
     <w:p>
       <w:pPr>
@@ -2549,18 +2410,8 @@
           <w:kern w:val="0"/>
           <w14:ligatures w14:val="none"/>
         </w:rPr>
-        <w:t xml:space="preserve">Hidden layer 2: 64 units, </w:t>
-      </w:r>
-      <w:proofErr w:type="spellStart"/>
-      <w:r>
-        <w:rPr>
-          <w:rFonts w:ascii="Times New Roman" w:eastAsia="Times New Roman" w:hAnsi="Times New Roman" w:cs="Times New Roman"/>
-          <w:kern w:val="0"/>
-          <w14:ligatures w14:val="none"/>
-        </w:rPr>
-        <w:t>ReLU</w:t>
-      </w:r>
-      <w:proofErr w:type="spellEnd"/>
+        <w:t>Hidden layer 2: 64 units, ReLU</w:t>
+      </w:r>
     </w:p>
     <w:p>
       <w:pPr>
@@ -2581,25 +2432,7 @@
           <w:kern w:val="0"/>
           <w14:ligatures w14:val="none"/>
         </w:rPr>
-        <w:t xml:space="preserve">Output layer: 20 units, </w:t>
-      </w:r>
-      <w:proofErr w:type="spellStart"/>
-      <w:r>
-        <w:rPr>
-          <w:rFonts w:ascii="Times New Roman" w:eastAsia="Times New Roman" w:hAnsi="Times New Roman" w:cs="Times New Roman"/>
-          <w:kern w:val="0"/>
-          <w14:ligatures w14:val="none"/>
-        </w:rPr>
-        <w:t>softmax</w:t>
-      </w:r>
-      <w:proofErr w:type="spellEnd"/>
-      <w:r>
-        <w:rPr>
-          <w:rFonts w:ascii="Times New Roman" w:eastAsia="Times New Roman" w:hAnsi="Times New Roman" w:cs="Times New Roman"/>
-          <w:kern w:val="0"/>
-          <w14:ligatures w14:val="none"/>
-        </w:rPr>
-        <w:t xml:space="preserve"> (one class per person)</w:t>
+        <w:t>Output layer: 20 units, softmax (one class per person)</w:t>
       </w:r>
     </w:p>
     <w:p>
@@ -3107,6 +2940,7 @@
           <w:kern w:val="0"/>
           <w14:ligatures w14:val="none"/>
         </w:rPr>
+        <w:lastRenderedPageBreak/>
         <w:t>A few classes (e.g., IDs 1, 3, 10, 14, 15) have slightly lower recall or precision due to occasional confusion with visually similar individuals.</w:t>
       </w:r>
     </w:p>
@@ -3153,25 +2987,7 @@
           <w:kern w:val="0"/>
           <w14:ligatures w14:val="none"/>
         </w:rPr>
-        <w:t xml:space="preserve">, which visually confirms that </w:t>
-      </w:r>
-      <w:proofErr w:type="gramStart"/>
-      <w:r>
-        <w:rPr>
-          <w:rFonts w:ascii="Times New Roman" w:eastAsia="Times New Roman" w:hAnsi="Times New Roman" w:cs="Times New Roman"/>
-          <w:kern w:val="0"/>
-          <w14:ligatures w14:val="none"/>
-        </w:rPr>
-        <w:t>the majority of</w:t>
-      </w:r>
-      <w:proofErr w:type="gramEnd"/>
-      <w:r>
-        <w:rPr>
-          <w:rFonts w:ascii="Times New Roman" w:eastAsia="Times New Roman" w:hAnsi="Times New Roman" w:cs="Times New Roman"/>
-          <w:kern w:val="0"/>
-          <w14:ligatures w14:val="none"/>
-        </w:rPr>
-        <w:t xml:space="preserve"> faces are correctly classified.</w:t>
+        <w:t>, which visually confirms that the majority of faces are correctly classified.</w:t>
       </w:r>
     </w:p>
     <w:p>
@@ -3451,13 +3267,7 @@
         <w:t>.</w:t>
       </w:r>
     </w:p>
-    <w:p>
-      <w:pPr>
-        <w:rPr>
-          <w:rFonts w:hint="eastAsia"/>
-        </w:rPr>
-      </w:pPr>
-    </w:p>
+    <w:p/>
     <w:sectPr>
       <w:pgSz w:w="12240" w:h="15840"/>
       <w:pgMar w:top="1440" w:right="1440" w:bottom="1440" w:left="1440" w:header="708" w:footer="708" w:gutter="0"/>
@@ -3620,6 +3430,155 @@
     </w:lvl>
   </w:abstractNum>
   <w:abstractNum w:abstractNumId="1" w15:restartNumberingAfterBreak="0">
+    <w:nsid w:val="080A15B9"/>
+    <w:multiLevelType w:val="multilevel"/>
+    <w:tmpl w:val="1A9424EA"/>
+    <w:lvl w:ilvl="0">
+      <w:start w:val="1"/>
+      <w:numFmt w:val="bullet"/>
+      <w:lvlText w:val=""/>
+      <w:lvlJc w:val="left"/>
+      <w:pPr>
+        <w:tabs>
+          <w:tab w:val="num" w:pos="720"/>
+        </w:tabs>
+        <w:ind w:left="720" w:hanging="360"/>
+      </w:pPr>
+      <w:rPr>
+        <w:rFonts w:ascii="Symbol" w:hAnsi="Symbol" w:hint="default"/>
+        <w:sz w:val="20"/>
+      </w:rPr>
+    </w:lvl>
+    <w:lvl w:ilvl="1" w:tentative="1">
+      <w:start w:val="1"/>
+      <w:numFmt w:val="bullet"/>
+      <w:lvlText w:val="o"/>
+      <w:lvlJc w:val="left"/>
+      <w:pPr>
+        <w:tabs>
+          <w:tab w:val="num" w:pos="1440"/>
+        </w:tabs>
+        <w:ind w:left="1440" w:hanging="360"/>
+      </w:pPr>
+      <w:rPr>
+        <w:rFonts w:ascii="Courier New" w:hAnsi="Courier New" w:hint="default"/>
+        <w:sz w:val="20"/>
+      </w:rPr>
+    </w:lvl>
+    <w:lvl w:ilvl="2" w:tentative="1">
+      <w:start w:val="1"/>
+      <w:numFmt w:val="bullet"/>
+      <w:lvlText w:val=""/>
+      <w:lvlJc w:val="left"/>
+      <w:pPr>
+        <w:tabs>
+          <w:tab w:val="num" w:pos="2160"/>
+        </w:tabs>
+        <w:ind w:left="2160" w:hanging="360"/>
+      </w:pPr>
+      <w:rPr>
+        <w:rFonts w:ascii="Wingdings" w:hAnsi="Wingdings" w:hint="default"/>
+        <w:sz w:val="20"/>
+      </w:rPr>
+    </w:lvl>
+    <w:lvl w:ilvl="3" w:tentative="1">
+      <w:start w:val="1"/>
+      <w:numFmt w:val="bullet"/>
+      <w:lvlText w:val=""/>
+      <w:lvlJc w:val="left"/>
+      <w:pPr>
+        <w:tabs>
+          <w:tab w:val="num" w:pos="2880"/>
+        </w:tabs>
+        <w:ind w:left="2880" w:hanging="360"/>
+      </w:pPr>
+      <w:rPr>
+        <w:rFonts w:ascii="Wingdings" w:hAnsi="Wingdings" w:hint="default"/>
+        <w:sz w:val="20"/>
+      </w:rPr>
+    </w:lvl>
+    <w:lvl w:ilvl="4" w:tentative="1">
+      <w:start w:val="1"/>
+      <w:numFmt w:val="bullet"/>
+      <w:lvlText w:val=""/>
+      <w:lvlJc w:val="left"/>
+      <w:pPr>
+        <w:tabs>
+          <w:tab w:val="num" w:pos="3600"/>
+        </w:tabs>
+        <w:ind w:left="3600" w:hanging="360"/>
+      </w:pPr>
+      <w:rPr>
+        <w:rFonts w:ascii="Wingdings" w:hAnsi="Wingdings" w:hint="default"/>
+        <w:sz w:val="20"/>
+      </w:rPr>
+    </w:lvl>
+    <w:lvl w:ilvl="5" w:tentative="1">
+      <w:start w:val="1"/>
+      <w:numFmt w:val="bullet"/>
+      <w:lvlText w:val=""/>
+      <w:lvlJc w:val="left"/>
+      <w:pPr>
+        <w:tabs>
+          <w:tab w:val="num" w:pos="4320"/>
+        </w:tabs>
+        <w:ind w:left="4320" w:hanging="360"/>
+      </w:pPr>
+      <w:rPr>
+        <w:rFonts w:ascii="Wingdings" w:hAnsi="Wingdings" w:hint="default"/>
+        <w:sz w:val="20"/>
+      </w:rPr>
+    </w:lvl>
+    <w:lvl w:ilvl="6" w:tentative="1">
+      <w:start w:val="1"/>
+      <w:numFmt w:val="bullet"/>
+      <w:lvlText w:val=""/>
+      <w:lvlJc w:val="left"/>
+      <w:pPr>
+        <w:tabs>
+          <w:tab w:val="num" w:pos="5040"/>
+        </w:tabs>
+        <w:ind w:left="5040" w:hanging="360"/>
+      </w:pPr>
+      <w:rPr>
+        <w:rFonts w:ascii="Wingdings" w:hAnsi="Wingdings" w:hint="default"/>
+        <w:sz w:val="20"/>
+      </w:rPr>
+    </w:lvl>
+    <w:lvl w:ilvl="7" w:tentative="1">
+      <w:start w:val="1"/>
+      <w:numFmt w:val="bullet"/>
+      <w:lvlText w:val=""/>
+      <w:lvlJc w:val="left"/>
+      <w:pPr>
+        <w:tabs>
+          <w:tab w:val="num" w:pos="5760"/>
+        </w:tabs>
+        <w:ind w:left="5760" w:hanging="360"/>
+      </w:pPr>
+      <w:rPr>
+        <w:rFonts w:ascii="Wingdings" w:hAnsi="Wingdings" w:hint="default"/>
+        <w:sz w:val="20"/>
+      </w:rPr>
+    </w:lvl>
+    <w:lvl w:ilvl="8" w:tentative="1">
+      <w:start w:val="1"/>
+      <w:numFmt w:val="bullet"/>
+      <w:lvlText w:val=""/>
+      <w:lvlJc w:val="left"/>
+      <w:pPr>
+        <w:tabs>
+          <w:tab w:val="num" w:pos="6480"/>
+        </w:tabs>
+        <w:ind w:left="6480" w:hanging="360"/>
+      </w:pPr>
+      <w:rPr>
+        <w:rFonts w:ascii="Wingdings" w:hAnsi="Wingdings" w:hint="default"/>
+        <w:sz w:val="20"/>
+      </w:rPr>
+    </w:lvl>
+  </w:abstractNum>
+  <w:abstractNum w:abstractNumId="2" w15:restartNumberingAfterBreak="0">
     <w:nsid w:val="0D413433"/>
     <w:multiLevelType w:val="multilevel"/>
     <w:tmpl w:val="6DE8FA4A"/>
@@ -3768,7 +3727,7 @@
       </w:rPr>
     </w:lvl>
   </w:abstractNum>
-  <w:abstractNum w:abstractNumId="2" w15:restartNumberingAfterBreak="0">
+  <w:abstractNum w:abstractNumId="3" w15:restartNumberingAfterBreak="0">
     <w:nsid w:val="10C5121A"/>
     <w:multiLevelType w:val="multilevel"/>
     <w:tmpl w:val="46386A26"/>
@@ -3917,7 +3876,7 @@
       </w:rPr>
     </w:lvl>
   </w:abstractNum>
-  <w:abstractNum w:abstractNumId="3" w15:restartNumberingAfterBreak="0">
+  <w:abstractNum w:abstractNumId="4" w15:restartNumberingAfterBreak="0">
     <w:nsid w:val="16695EE9"/>
     <w:multiLevelType w:val="multilevel"/>
     <w:tmpl w:val="CA4EB9C6"/>
@@ -4066,7 +4025,7 @@
       </w:rPr>
     </w:lvl>
   </w:abstractNum>
-  <w:abstractNum w:abstractNumId="4" w15:restartNumberingAfterBreak="0">
+  <w:abstractNum w:abstractNumId="5" w15:restartNumberingAfterBreak="0">
     <w:nsid w:val="1BE312F1"/>
     <w:multiLevelType w:val="multilevel"/>
     <w:tmpl w:val="9E1C1C9E"/>
@@ -4215,7 +4174,156 @@
       </w:rPr>
     </w:lvl>
   </w:abstractNum>
-  <w:abstractNum w:abstractNumId="5" w15:restartNumberingAfterBreak="0">
+  <w:abstractNum w:abstractNumId="6" w15:restartNumberingAfterBreak="0">
+    <w:nsid w:val="1C186AA2"/>
+    <w:multiLevelType w:val="multilevel"/>
+    <w:tmpl w:val="0916E5E0"/>
+    <w:lvl w:ilvl="0">
+      <w:start w:val="1"/>
+      <w:numFmt w:val="bullet"/>
+      <w:lvlText w:val=""/>
+      <w:lvlJc w:val="left"/>
+      <w:pPr>
+        <w:tabs>
+          <w:tab w:val="num" w:pos="720"/>
+        </w:tabs>
+        <w:ind w:left="720" w:hanging="360"/>
+      </w:pPr>
+      <w:rPr>
+        <w:rFonts w:ascii="Symbol" w:hAnsi="Symbol" w:hint="default"/>
+        <w:sz w:val="20"/>
+      </w:rPr>
+    </w:lvl>
+    <w:lvl w:ilvl="1" w:tentative="1">
+      <w:start w:val="1"/>
+      <w:numFmt w:val="bullet"/>
+      <w:lvlText w:val="o"/>
+      <w:lvlJc w:val="left"/>
+      <w:pPr>
+        <w:tabs>
+          <w:tab w:val="num" w:pos="1440"/>
+        </w:tabs>
+        <w:ind w:left="1440" w:hanging="360"/>
+      </w:pPr>
+      <w:rPr>
+        <w:rFonts w:ascii="Courier New" w:hAnsi="Courier New" w:hint="default"/>
+        <w:sz w:val="20"/>
+      </w:rPr>
+    </w:lvl>
+    <w:lvl w:ilvl="2" w:tentative="1">
+      <w:start w:val="1"/>
+      <w:numFmt w:val="bullet"/>
+      <w:lvlText w:val=""/>
+      <w:lvlJc w:val="left"/>
+      <w:pPr>
+        <w:tabs>
+          <w:tab w:val="num" w:pos="2160"/>
+        </w:tabs>
+        <w:ind w:left="2160" w:hanging="360"/>
+      </w:pPr>
+      <w:rPr>
+        <w:rFonts w:ascii="Wingdings" w:hAnsi="Wingdings" w:hint="default"/>
+        <w:sz w:val="20"/>
+      </w:rPr>
+    </w:lvl>
+    <w:lvl w:ilvl="3" w:tentative="1">
+      <w:start w:val="1"/>
+      <w:numFmt w:val="bullet"/>
+      <w:lvlText w:val=""/>
+      <w:lvlJc w:val="left"/>
+      <w:pPr>
+        <w:tabs>
+          <w:tab w:val="num" w:pos="2880"/>
+        </w:tabs>
+        <w:ind w:left="2880" w:hanging="360"/>
+      </w:pPr>
+      <w:rPr>
+        <w:rFonts w:ascii="Wingdings" w:hAnsi="Wingdings" w:hint="default"/>
+        <w:sz w:val="20"/>
+      </w:rPr>
+    </w:lvl>
+    <w:lvl w:ilvl="4" w:tentative="1">
+      <w:start w:val="1"/>
+      <w:numFmt w:val="bullet"/>
+      <w:lvlText w:val=""/>
+      <w:lvlJc w:val="left"/>
+      <w:pPr>
+        <w:tabs>
+          <w:tab w:val="num" w:pos="3600"/>
+        </w:tabs>
+        <w:ind w:left="3600" w:hanging="360"/>
+      </w:pPr>
+      <w:rPr>
+        <w:rFonts w:ascii="Wingdings" w:hAnsi="Wingdings" w:hint="default"/>
+        <w:sz w:val="20"/>
+      </w:rPr>
+    </w:lvl>
+    <w:lvl w:ilvl="5" w:tentative="1">
+      <w:start w:val="1"/>
+      <w:numFmt w:val="bullet"/>
+      <w:lvlText w:val=""/>
+      <w:lvlJc w:val="left"/>
+      <w:pPr>
+        <w:tabs>
+          <w:tab w:val="num" w:pos="4320"/>
+        </w:tabs>
+        <w:ind w:left="4320" w:hanging="360"/>
+      </w:pPr>
+      <w:rPr>
+        <w:rFonts w:ascii="Wingdings" w:hAnsi="Wingdings" w:hint="default"/>
+        <w:sz w:val="20"/>
+      </w:rPr>
+    </w:lvl>
+    <w:lvl w:ilvl="6" w:tentative="1">
+      <w:start w:val="1"/>
+      <w:numFmt w:val="bullet"/>
+      <w:lvlText w:val=""/>
+      <w:lvlJc w:val="left"/>
+      <w:pPr>
+        <w:tabs>
+          <w:tab w:val="num" w:pos="5040"/>
+        </w:tabs>
+        <w:ind w:left="5040" w:hanging="360"/>
+      </w:pPr>
+      <w:rPr>
+        <w:rFonts w:ascii="Wingdings" w:hAnsi="Wingdings" w:hint="default"/>
+        <w:sz w:val="20"/>
+      </w:rPr>
+    </w:lvl>
+    <w:lvl w:ilvl="7" w:tentative="1">
+      <w:start w:val="1"/>
+      <w:numFmt w:val="bullet"/>
+      <w:lvlText w:val=""/>
+      <w:lvlJc w:val="left"/>
+      <w:pPr>
+        <w:tabs>
+          <w:tab w:val="num" w:pos="5760"/>
+        </w:tabs>
+        <w:ind w:left="5760" w:hanging="360"/>
+      </w:pPr>
+      <w:rPr>
+        <w:rFonts w:ascii="Wingdings" w:hAnsi="Wingdings" w:hint="default"/>
+        <w:sz w:val="20"/>
+      </w:rPr>
+    </w:lvl>
+    <w:lvl w:ilvl="8" w:tentative="1">
+      <w:start w:val="1"/>
+      <w:numFmt w:val="bullet"/>
+      <w:lvlText w:val=""/>
+      <w:lvlJc w:val="left"/>
+      <w:pPr>
+        <w:tabs>
+          <w:tab w:val="num" w:pos="6480"/>
+        </w:tabs>
+        <w:ind w:left="6480" w:hanging="360"/>
+      </w:pPr>
+      <w:rPr>
+        <w:rFonts w:ascii="Wingdings" w:hAnsi="Wingdings" w:hint="default"/>
+        <w:sz w:val="20"/>
+      </w:rPr>
+    </w:lvl>
+  </w:abstractNum>
+  <w:abstractNum w:abstractNumId="7" w15:restartNumberingAfterBreak="0">
     <w:nsid w:val="30295EAF"/>
     <w:multiLevelType w:val="multilevel"/>
     <w:tmpl w:val="4D226272"/>
@@ -4364,7 +4472,156 @@
       </w:rPr>
     </w:lvl>
   </w:abstractNum>
-  <w:abstractNum w:abstractNumId="6" w15:restartNumberingAfterBreak="0">
+  <w:abstractNum w:abstractNumId="8" w15:restartNumberingAfterBreak="0">
+    <w:nsid w:val="39DB51AE"/>
+    <w:multiLevelType w:val="multilevel"/>
+    <w:tmpl w:val="A9606BBC"/>
+    <w:lvl w:ilvl="0">
+      <w:start w:val="1"/>
+      <w:numFmt w:val="bullet"/>
+      <w:lvlText w:val=""/>
+      <w:lvlJc w:val="left"/>
+      <w:pPr>
+        <w:tabs>
+          <w:tab w:val="num" w:pos="720"/>
+        </w:tabs>
+        <w:ind w:left="720" w:hanging="360"/>
+      </w:pPr>
+      <w:rPr>
+        <w:rFonts w:ascii="Symbol" w:hAnsi="Symbol" w:hint="default"/>
+        <w:sz w:val="20"/>
+      </w:rPr>
+    </w:lvl>
+    <w:lvl w:ilvl="1">
+      <w:start w:val="1"/>
+      <w:numFmt w:val="bullet"/>
+      <w:lvlText w:val="o"/>
+      <w:lvlJc w:val="left"/>
+      <w:pPr>
+        <w:tabs>
+          <w:tab w:val="num" w:pos="1440"/>
+        </w:tabs>
+        <w:ind w:left="1440" w:hanging="360"/>
+      </w:pPr>
+      <w:rPr>
+        <w:rFonts w:ascii="Courier New" w:hAnsi="Courier New" w:hint="default"/>
+        <w:sz w:val="20"/>
+      </w:rPr>
+    </w:lvl>
+    <w:lvl w:ilvl="2" w:tentative="1">
+      <w:start w:val="1"/>
+      <w:numFmt w:val="bullet"/>
+      <w:lvlText w:val=""/>
+      <w:lvlJc w:val="left"/>
+      <w:pPr>
+        <w:tabs>
+          <w:tab w:val="num" w:pos="2160"/>
+        </w:tabs>
+        <w:ind w:left="2160" w:hanging="360"/>
+      </w:pPr>
+      <w:rPr>
+        <w:rFonts w:ascii="Wingdings" w:hAnsi="Wingdings" w:hint="default"/>
+        <w:sz w:val="20"/>
+      </w:rPr>
+    </w:lvl>
+    <w:lvl w:ilvl="3" w:tentative="1">
+      <w:start w:val="1"/>
+      <w:numFmt w:val="bullet"/>
+      <w:lvlText w:val=""/>
+      <w:lvlJc w:val="left"/>
+      <w:pPr>
+        <w:tabs>
+          <w:tab w:val="num" w:pos="2880"/>
+        </w:tabs>
+        <w:ind w:left="2880" w:hanging="360"/>
+      </w:pPr>
+      <w:rPr>
+        <w:rFonts w:ascii="Wingdings" w:hAnsi="Wingdings" w:hint="default"/>
+        <w:sz w:val="20"/>
+      </w:rPr>
+    </w:lvl>
+    <w:lvl w:ilvl="4" w:tentative="1">
+      <w:start w:val="1"/>
+      <w:numFmt w:val="bullet"/>
+      <w:lvlText w:val=""/>
+      <w:lvlJc w:val="left"/>
+      <w:pPr>
+        <w:tabs>
+          <w:tab w:val="num" w:pos="3600"/>
+        </w:tabs>
+        <w:ind w:left="3600" w:hanging="360"/>
+      </w:pPr>
+      <w:rPr>
+        <w:rFonts w:ascii="Wingdings" w:hAnsi="Wingdings" w:hint="default"/>
+        <w:sz w:val="20"/>
+      </w:rPr>
+    </w:lvl>
+    <w:lvl w:ilvl="5" w:tentative="1">
+      <w:start w:val="1"/>
+      <w:numFmt w:val="bullet"/>
+      <w:lvlText w:val=""/>
+      <w:lvlJc w:val="left"/>
+      <w:pPr>
+        <w:tabs>
+          <w:tab w:val="num" w:pos="4320"/>
+        </w:tabs>
+        <w:ind w:left="4320" w:hanging="360"/>
+      </w:pPr>
+      <w:rPr>
+        <w:rFonts w:ascii="Wingdings" w:hAnsi="Wingdings" w:hint="default"/>
+        <w:sz w:val="20"/>
+      </w:rPr>
+    </w:lvl>
+    <w:lvl w:ilvl="6" w:tentative="1">
+      <w:start w:val="1"/>
+      <w:numFmt w:val="bullet"/>
+      <w:lvlText w:val=""/>
+      <w:lvlJc w:val="left"/>
+      <w:pPr>
+        <w:tabs>
+          <w:tab w:val="num" w:pos="5040"/>
+        </w:tabs>
+        <w:ind w:left="5040" w:hanging="360"/>
+      </w:pPr>
+      <w:rPr>
+        <w:rFonts w:ascii="Wingdings" w:hAnsi="Wingdings" w:hint="default"/>
+        <w:sz w:val="20"/>
+      </w:rPr>
+    </w:lvl>
+    <w:lvl w:ilvl="7" w:tentative="1">
+      <w:start w:val="1"/>
+      <w:numFmt w:val="bullet"/>
+      <w:lvlText w:val=""/>
+      <w:lvlJc w:val="left"/>
+      <w:pPr>
+        <w:tabs>
+          <w:tab w:val="num" w:pos="5760"/>
+        </w:tabs>
+        <w:ind w:left="5760" w:hanging="360"/>
+      </w:pPr>
+      <w:rPr>
+        <w:rFonts w:ascii="Wingdings" w:hAnsi="Wingdings" w:hint="default"/>
+        <w:sz w:val="20"/>
+      </w:rPr>
+    </w:lvl>
+    <w:lvl w:ilvl="8" w:tentative="1">
+      <w:start w:val="1"/>
+      <w:numFmt w:val="bullet"/>
+      <w:lvlText w:val=""/>
+      <w:lvlJc w:val="left"/>
+      <w:pPr>
+        <w:tabs>
+          <w:tab w:val="num" w:pos="6480"/>
+        </w:tabs>
+        <w:ind w:left="6480" w:hanging="360"/>
+      </w:pPr>
+      <w:rPr>
+        <w:rFonts w:ascii="Wingdings" w:hAnsi="Wingdings" w:hint="default"/>
+        <w:sz w:val="20"/>
+      </w:rPr>
+    </w:lvl>
+  </w:abstractNum>
+  <w:abstractNum w:abstractNumId="9" w15:restartNumberingAfterBreak="0">
     <w:nsid w:val="476D6A0F"/>
     <w:multiLevelType w:val="multilevel"/>
     <w:tmpl w:val="43322E12"/>
@@ -4513,7 +4770,7 @@
       </w:rPr>
     </w:lvl>
   </w:abstractNum>
-  <w:abstractNum w:abstractNumId="7" w15:restartNumberingAfterBreak="0">
+  <w:abstractNum w:abstractNumId="10" w15:restartNumberingAfterBreak="0">
     <w:nsid w:val="57CF5EB0"/>
     <w:multiLevelType w:val="multilevel"/>
     <w:tmpl w:val="869A5ECE"/>
@@ -4662,7 +4919,305 @@
       </w:rPr>
     </w:lvl>
   </w:abstractNum>
-  <w:abstractNum w:abstractNumId="8" w15:restartNumberingAfterBreak="0">
+  <w:abstractNum w:abstractNumId="11" w15:restartNumberingAfterBreak="0">
+    <w:nsid w:val="5ABC3409"/>
+    <w:multiLevelType w:val="multilevel"/>
+    <w:tmpl w:val="07860056"/>
+    <w:lvl w:ilvl="0">
+      <w:start w:val="1"/>
+      <w:numFmt w:val="bullet"/>
+      <w:lvlText w:val=""/>
+      <w:lvlJc w:val="left"/>
+      <w:pPr>
+        <w:tabs>
+          <w:tab w:val="num" w:pos="720"/>
+        </w:tabs>
+        <w:ind w:left="720" w:hanging="360"/>
+      </w:pPr>
+      <w:rPr>
+        <w:rFonts w:ascii="Symbol" w:hAnsi="Symbol" w:hint="default"/>
+        <w:sz w:val="20"/>
+      </w:rPr>
+    </w:lvl>
+    <w:lvl w:ilvl="1" w:tentative="1">
+      <w:start w:val="1"/>
+      <w:numFmt w:val="bullet"/>
+      <w:lvlText w:val="o"/>
+      <w:lvlJc w:val="left"/>
+      <w:pPr>
+        <w:tabs>
+          <w:tab w:val="num" w:pos="1440"/>
+        </w:tabs>
+        <w:ind w:left="1440" w:hanging="360"/>
+      </w:pPr>
+      <w:rPr>
+        <w:rFonts w:ascii="Courier New" w:hAnsi="Courier New" w:hint="default"/>
+        <w:sz w:val="20"/>
+      </w:rPr>
+    </w:lvl>
+    <w:lvl w:ilvl="2" w:tentative="1">
+      <w:start w:val="1"/>
+      <w:numFmt w:val="bullet"/>
+      <w:lvlText w:val=""/>
+      <w:lvlJc w:val="left"/>
+      <w:pPr>
+        <w:tabs>
+          <w:tab w:val="num" w:pos="2160"/>
+        </w:tabs>
+        <w:ind w:left="2160" w:hanging="360"/>
+      </w:pPr>
+      <w:rPr>
+        <w:rFonts w:ascii="Wingdings" w:hAnsi="Wingdings" w:hint="default"/>
+        <w:sz w:val="20"/>
+      </w:rPr>
+    </w:lvl>
+    <w:lvl w:ilvl="3" w:tentative="1">
+      <w:start w:val="1"/>
+      <w:numFmt w:val="bullet"/>
+      <w:lvlText w:val=""/>
+      <w:lvlJc w:val="left"/>
+      <w:pPr>
+        <w:tabs>
+          <w:tab w:val="num" w:pos="2880"/>
+        </w:tabs>
+        <w:ind w:left="2880" w:hanging="360"/>
+      </w:pPr>
+      <w:rPr>
+        <w:rFonts w:ascii="Wingdings" w:hAnsi="Wingdings" w:hint="default"/>
+        <w:sz w:val="20"/>
+      </w:rPr>
+    </w:lvl>
+    <w:lvl w:ilvl="4" w:tentative="1">
+      <w:start w:val="1"/>
+      <w:numFmt w:val="bullet"/>
+      <w:lvlText w:val=""/>
+      <w:lvlJc w:val="left"/>
+      <w:pPr>
+        <w:tabs>
+          <w:tab w:val="num" w:pos="3600"/>
+        </w:tabs>
+        <w:ind w:left="3600" w:hanging="360"/>
+      </w:pPr>
+      <w:rPr>
+        <w:rFonts w:ascii="Wingdings" w:hAnsi="Wingdings" w:hint="default"/>
+        <w:sz w:val="20"/>
+      </w:rPr>
+    </w:lvl>
+    <w:lvl w:ilvl="5" w:tentative="1">
+      <w:start w:val="1"/>
+      <w:numFmt w:val="bullet"/>
+      <w:lvlText w:val=""/>
+      <w:lvlJc w:val="left"/>
+      <w:pPr>
+        <w:tabs>
+          <w:tab w:val="num" w:pos="4320"/>
+        </w:tabs>
+        <w:ind w:left="4320" w:hanging="360"/>
+      </w:pPr>
+      <w:rPr>
+        <w:rFonts w:ascii="Wingdings" w:hAnsi="Wingdings" w:hint="default"/>
+        <w:sz w:val="20"/>
+      </w:rPr>
+    </w:lvl>
+    <w:lvl w:ilvl="6" w:tentative="1">
+      <w:start w:val="1"/>
+      <w:numFmt w:val="bullet"/>
+      <w:lvlText w:val=""/>
+      <w:lvlJc w:val="left"/>
+      <w:pPr>
+        <w:tabs>
+          <w:tab w:val="num" w:pos="5040"/>
+        </w:tabs>
+        <w:ind w:left="5040" w:hanging="360"/>
+      </w:pPr>
+      <w:rPr>
+        <w:rFonts w:ascii="Wingdings" w:hAnsi="Wingdings" w:hint="default"/>
+        <w:sz w:val="20"/>
+      </w:rPr>
+    </w:lvl>
+    <w:lvl w:ilvl="7" w:tentative="1">
+      <w:start w:val="1"/>
+      <w:numFmt w:val="bullet"/>
+      <w:lvlText w:val=""/>
+      <w:lvlJc w:val="left"/>
+      <w:pPr>
+        <w:tabs>
+          <w:tab w:val="num" w:pos="5760"/>
+        </w:tabs>
+        <w:ind w:left="5760" w:hanging="360"/>
+      </w:pPr>
+      <w:rPr>
+        <w:rFonts w:ascii="Wingdings" w:hAnsi="Wingdings" w:hint="default"/>
+        <w:sz w:val="20"/>
+      </w:rPr>
+    </w:lvl>
+    <w:lvl w:ilvl="8" w:tentative="1">
+      <w:start w:val="1"/>
+      <w:numFmt w:val="bullet"/>
+      <w:lvlText w:val=""/>
+      <w:lvlJc w:val="left"/>
+      <w:pPr>
+        <w:tabs>
+          <w:tab w:val="num" w:pos="6480"/>
+        </w:tabs>
+        <w:ind w:left="6480" w:hanging="360"/>
+      </w:pPr>
+      <w:rPr>
+        <w:rFonts w:ascii="Wingdings" w:hAnsi="Wingdings" w:hint="default"/>
+        <w:sz w:val="20"/>
+      </w:rPr>
+    </w:lvl>
+  </w:abstractNum>
+  <w:abstractNum w:abstractNumId="12" w15:restartNumberingAfterBreak="0">
+    <w:nsid w:val="5AF95B6A"/>
+    <w:multiLevelType w:val="multilevel"/>
+    <w:tmpl w:val="6300838E"/>
+    <w:lvl w:ilvl="0">
+      <w:start w:val="1"/>
+      <w:numFmt w:val="bullet"/>
+      <w:lvlText w:val=""/>
+      <w:lvlJc w:val="left"/>
+      <w:pPr>
+        <w:tabs>
+          <w:tab w:val="num" w:pos="720"/>
+        </w:tabs>
+        <w:ind w:left="720" w:hanging="360"/>
+      </w:pPr>
+      <w:rPr>
+        <w:rFonts w:ascii="Symbol" w:hAnsi="Symbol" w:hint="default"/>
+        <w:sz w:val="20"/>
+      </w:rPr>
+    </w:lvl>
+    <w:lvl w:ilvl="1" w:tentative="1">
+      <w:start w:val="1"/>
+      <w:numFmt w:val="bullet"/>
+      <w:lvlText w:val="o"/>
+      <w:lvlJc w:val="left"/>
+      <w:pPr>
+        <w:tabs>
+          <w:tab w:val="num" w:pos="1440"/>
+        </w:tabs>
+        <w:ind w:left="1440" w:hanging="360"/>
+      </w:pPr>
+      <w:rPr>
+        <w:rFonts w:ascii="Courier New" w:hAnsi="Courier New" w:hint="default"/>
+        <w:sz w:val="20"/>
+      </w:rPr>
+    </w:lvl>
+    <w:lvl w:ilvl="2" w:tentative="1">
+      <w:start w:val="1"/>
+      <w:numFmt w:val="bullet"/>
+      <w:lvlText w:val=""/>
+      <w:lvlJc w:val="left"/>
+      <w:pPr>
+        <w:tabs>
+          <w:tab w:val="num" w:pos="2160"/>
+        </w:tabs>
+        <w:ind w:left="2160" w:hanging="360"/>
+      </w:pPr>
+      <w:rPr>
+        <w:rFonts w:ascii="Wingdings" w:hAnsi="Wingdings" w:hint="default"/>
+        <w:sz w:val="20"/>
+      </w:rPr>
+    </w:lvl>
+    <w:lvl w:ilvl="3" w:tentative="1">
+      <w:start w:val="1"/>
+      <w:numFmt w:val="bullet"/>
+      <w:lvlText w:val=""/>
+      <w:lvlJc w:val="left"/>
+      <w:pPr>
+        <w:tabs>
+          <w:tab w:val="num" w:pos="2880"/>
+        </w:tabs>
+        <w:ind w:left="2880" w:hanging="360"/>
+      </w:pPr>
+      <w:rPr>
+        <w:rFonts w:ascii="Wingdings" w:hAnsi="Wingdings" w:hint="default"/>
+        <w:sz w:val="20"/>
+      </w:rPr>
+    </w:lvl>
+    <w:lvl w:ilvl="4" w:tentative="1">
+      <w:start w:val="1"/>
+      <w:numFmt w:val="bullet"/>
+      <w:lvlText w:val=""/>
+      <w:lvlJc w:val="left"/>
+      <w:pPr>
+        <w:tabs>
+          <w:tab w:val="num" w:pos="3600"/>
+        </w:tabs>
+        <w:ind w:left="3600" w:hanging="360"/>
+      </w:pPr>
+      <w:rPr>
+        <w:rFonts w:ascii="Wingdings" w:hAnsi="Wingdings" w:hint="default"/>
+        <w:sz w:val="20"/>
+      </w:rPr>
+    </w:lvl>
+    <w:lvl w:ilvl="5" w:tentative="1">
+      <w:start w:val="1"/>
+      <w:numFmt w:val="bullet"/>
+      <w:lvlText w:val=""/>
+      <w:lvlJc w:val="left"/>
+      <w:pPr>
+        <w:tabs>
+          <w:tab w:val="num" w:pos="4320"/>
+        </w:tabs>
+        <w:ind w:left="4320" w:hanging="360"/>
+      </w:pPr>
+      <w:rPr>
+        <w:rFonts w:ascii="Wingdings" w:hAnsi="Wingdings" w:hint="default"/>
+        <w:sz w:val="20"/>
+      </w:rPr>
+    </w:lvl>
+    <w:lvl w:ilvl="6" w:tentative="1">
+      <w:start w:val="1"/>
+      <w:numFmt w:val="bullet"/>
+      <w:lvlText w:val=""/>
+      <w:lvlJc w:val="left"/>
+      <w:pPr>
+        <w:tabs>
+          <w:tab w:val="num" w:pos="5040"/>
+        </w:tabs>
+        <w:ind w:left="5040" w:hanging="360"/>
+      </w:pPr>
+      <w:rPr>
+        <w:rFonts w:ascii="Wingdings" w:hAnsi="Wingdings" w:hint="default"/>
+        <w:sz w:val="20"/>
+      </w:rPr>
+    </w:lvl>
+    <w:lvl w:ilvl="7" w:tentative="1">
+      <w:start w:val="1"/>
+      <w:numFmt w:val="bullet"/>
+      <w:lvlText w:val=""/>
+      <w:lvlJc w:val="left"/>
+      <w:pPr>
+        <w:tabs>
+          <w:tab w:val="num" w:pos="5760"/>
+        </w:tabs>
+        <w:ind w:left="5760" w:hanging="360"/>
+      </w:pPr>
+      <w:rPr>
+        <w:rFonts w:ascii="Wingdings" w:hAnsi="Wingdings" w:hint="default"/>
+        <w:sz w:val="20"/>
+      </w:rPr>
+    </w:lvl>
+    <w:lvl w:ilvl="8" w:tentative="1">
+      <w:start w:val="1"/>
+      <w:numFmt w:val="bullet"/>
+      <w:lvlText w:val=""/>
+      <w:lvlJc w:val="left"/>
+      <w:pPr>
+        <w:tabs>
+          <w:tab w:val="num" w:pos="6480"/>
+        </w:tabs>
+        <w:ind w:left="6480" w:hanging="360"/>
+      </w:pPr>
+      <w:rPr>
+        <w:rFonts w:ascii="Wingdings" w:hAnsi="Wingdings" w:hint="default"/>
+        <w:sz w:val="20"/>
+      </w:rPr>
+    </w:lvl>
+  </w:abstractNum>
+  <w:abstractNum w:abstractNumId="13" w15:restartNumberingAfterBreak="0">
     <w:nsid w:val="601D11BE"/>
     <w:multiLevelType w:val="multilevel"/>
     <w:tmpl w:val="C058804E"/>
@@ -4775,7 +5330,7 @@
       </w:pPr>
     </w:lvl>
   </w:abstractNum>
-  <w:abstractNum w:abstractNumId="9" w15:restartNumberingAfterBreak="0">
+  <w:abstractNum w:abstractNumId="14" w15:restartNumberingAfterBreak="0">
     <w:nsid w:val="649024F1"/>
     <w:multiLevelType w:val="multilevel"/>
     <w:tmpl w:val="CD969546"/>
@@ -4924,7 +5479,7 @@
       </w:rPr>
     </w:lvl>
   </w:abstractNum>
-  <w:abstractNum w:abstractNumId="10" w15:restartNumberingAfterBreak="0">
+  <w:abstractNum w:abstractNumId="15" w15:restartNumberingAfterBreak="0">
     <w:nsid w:val="68FA073D"/>
     <w:multiLevelType w:val="multilevel"/>
     <w:tmpl w:val="CBD8991C"/>
@@ -5073,7 +5628,7 @@
       </w:rPr>
     </w:lvl>
   </w:abstractNum>
-  <w:abstractNum w:abstractNumId="11" w15:restartNumberingAfterBreak="0">
+  <w:abstractNum w:abstractNumId="16" w15:restartNumberingAfterBreak="0">
     <w:nsid w:val="6DCC0457"/>
     <w:multiLevelType w:val="multilevel"/>
     <w:tmpl w:val="375A0A82"/>
@@ -5222,7 +5777,7 @@
       </w:rPr>
     </w:lvl>
   </w:abstractNum>
-  <w:abstractNum w:abstractNumId="12" w15:restartNumberingAfterBreak="0">
+  <w:abstractNum w:abstractNumId="17" w15:restartNumberingAfterBreak="0">
     <w:nsid w:val="7A270893"/>
     <w:multiLevelType w:val="multilevel"/>
     <w:tmpl w:val="5394A6F2"/>
@@ -5372,43 +5927,58 @@
     </w:lvl>
   </w:abstractNum>
   <w:num w:numId="1" w16cid:durableId="372921814">
+    <w:abstractNumId w:val="5"/>
+  </w:num>
+  <w:num w:numId="2" w16cid:durableId="435827282">
+    <w:abstractNumId w:val="15"/>
+  </w:num>
+  <w:num w:numId="3" w16cid:durableId="851645505">
     <w:abstractNumId w:val="4"/>
   </w:num>
-  <w:num w:numId="2" w16cid:durableId="435827282">
-    <w:abstractNumId w:val="10"/>
+  <w:num w:numId="4" w16cid:durableId="1074087140">
+    <w:abstractNumId w:val="16"/>
   </w:num>
-  <w:num w:numId="3" w16cid:durableId="851645505">
+  <w:num w:numId="5" w16cid:durableId="1219170139">
+    <w:abstractNumId w:val="13"/>
+  </w:num>
+  <w:num w:numId="6" w16cid:durableId="1238130025">
     <w:abstractNumId w:val="3"/>
   </w:num>
-  <w:num w:numId="4" w16cid:durableId="1074087140">
-    <w:abstractNumId w:val="11"/>
-  </w:num>
-  <w:num w:numId="5" w16cid:durableId="1219170139">
-    <w:abstractNumId w:val="8"/>
-  </w:num>
-  <w:num w:numId="6" w16cid:durableId="1238130025">
+  <w:num w:numId="7" w16cid:durableId="1296715097">
     <w:abstractNumId w:val="2"/>
   </w:num>
-  <w:num w:numId="7" w16cid:durableId="1296715097">
-    <w:abstractNumId w:val="1"/>
-  </w:num>
   <w:num w:numId="8" w16cid:durableId="370228518">
-    <w:abstractNumId w:val="9"/>
+    <w:abstractNumId w:val="14"/>
   </w:num>
   <w:num w:numId="9" w16cid:durableId="204022727">
-    <w:abstractNumId w:val="12"/>
+    <w:abstractNumId w:val="17"/>
   </w:num>
   <w:num w:numId="10" w16cid:durableId="2007398516">
     <w:abstractNumId w:val="0"/>
   </w:num>
   <w:num w:numId="11" w16cid:durableId="1320302065">
+    <w:abstractNumId w:val="10"/>
+  </w:num>
+  <w:num w:numId="12" w16cid:durableId="523901584">
     <w:abstractNumId w:val="7"/>
   </w:num>
-  <w:num w:numId="12" w16cid:durableId="523901584">
-    <w:abstractNumId w:val="5"/>
+  <w:num w:numId="13" w16cid:durableId="1860849021">
+    <w:abstractNumId w:val="9"/>
   </w:num>
-  <w:num w:numId="13" w16cid:durableId="1860849021">
+  <w:num w:numId="14" w16cid:durableId="1495603572">
+    <w:abstractNumId w:val="1"/>
+  </w:num>
+  <w:num w:numId="15" w16cid:durableId="824008639">
     <w:abstractNumId w:val="6"/>
+  </w:num>
+  <w:num w:numId="16" w16cid:durableId="686638993">
+    <w:abstractNumId w:val="11"/>
+  </w:num>
+  <w:num w:numId="17" w16cid:durableId="1457019585">
+    <w:abstractNumId w:val="8"/>
+  </w:num>
+  <w:num w:numId="18" w16cid:durableId="1013533031">
+    <w:abstractNumId w:val="12"/>
   </w:num>
 </w:numbering>
 </file>
@@ -6015,7 +6585,6 @@
   <w:style w:type="character" w:default="1" w:styleId="DefaultParagraphFont">
     <w:name w:val="Default Paragraph Font"/>
     <w:uiPriority w:val="1"/>
-    <w:semiHidden/>
     <w:unhideWhenUsed/>
   </w:style>
   <w:style w:type="table" w:default="1" w:styleId="TableNormal">

</xml_diff>

<commit_message>
updated clustering analysis report
</commit_message>
<xml_diff>
--- a/COMP257 Project report draft.docx
+++ b/COMP257 Project report draft.docx
@@ -75,27 +75,7 @@
           <w:kern w:val="0"/>
           <w14:ligatures w14:val="none"/>
         </w:rPr>
-        <w:t xml:space="preserve"> provided on Luminate. The .mat file was loaded with </w:t>
-      </w:r>
-      <w:proofErr w:type="spellStart"/>
-      <w:proofErr w:type="gramStart"/>
-      <w:r>
-        <w:rPr>
-          <w:rFonts w:ascii="Times New Roman" w:eastAsia="Times New Roman" w:hAnsi="Times New Roman" w:cs="Times New Roman"/>
-          <w:kern w:val="0"/>
-          <w14:ligatures w14:val="none"/>
-        </w:rPr>
-        <w:t>scipy.io.loadmat</w:t>
-      </w:r>
-      <w:proofErr w:type="spellEnd"/>
-      <w:proofErr w:type="gramEnd"/>
-      <w:r>
-        <w:rPr>
-          <w:rFonts w:ascii="Times New Roman" w:eastAsia="Times New Roman" w:hAnsi="Times New Roman" w:cs="Times New Roman"/>
-          <w:kern w:val="0"/>
-          <w14:ligatures w14:val="none"/>
-        </w:rPr>
-        <w:t>, and we inspected the keys to identify the image matrix and the label vector. Each image is stored as a flattened grayscale vector, and the corresponding label is an integer person ID.</w:t>
+        <w:t xml:space="preserve"> provided on Luminate. The .mat file was loaded with scipy.io.loadmat, and we inspected the keys to identify the image matrix and the label vector. Each image is stored as a flattened grayscale vector, and the corresponding label is an integer person ID.</w:t>
       </w:r>
     </w:p>
     <w:p>
@@ -186,57 +166,25 @@
           <w:szCs w:val="27"/>
           <w14:ligatures w14:val="none"/>
         </w:rPr>
-        <w:t xml:space="preserve">1.2 Conversion to Pandas </w:t>
-      </w:r>
-      <w:proofErr w:type="spellStart"/>
-      <w:r>
-        <w:rPr>
-          <w:rFonts w:ascii="Times New Roman" w:eastAsia="Times New Roman" w:hAnsi="Times New Roman" w:cs="Times New Roman"/>
-          <w:b/>
-          <w:bCs/>
-          <w:kern w:val="0"/>
-          <w:sz w:val="27"/>
-          <w:szCs w:val="27"/>
-          <w14:ligatures w14:val="none"/>
-        </w:rPr>
-        <w:t>DataFrame</w:t>
-      </w:r>
-      <w:proofErr w:type="spellEnd"/>
-    </w:p>
-    <w:p>
-      <w:pPr>
-        <w:spacing w:before="100" w:beforeAutospacing="1" w:after="100" w:afterAutospacing="1" w:line="240" w:lineRule="auto"/>
-        <w:rPr>
-          <w:rFonts w:ascii="Times New Roman" w:eastAsia="Times New Roman" w:hAnsi="Times New Roman" w:cs="Times New Roman"/>
-          <w:kern w:val="0"/>
-          <w14:ligatures w14:val="none"/>
-        </w:rPr>
-      </w:pPr>
-      <w:r>
-        <w:rPr>
-          <w:rFonts w:ascii="Times New Roman" w:eastAsia="Times New Roman" w:hAnsi="Times New Roman" w:cs="Times New Roman"/>
-          <w:kern w:val="0"/>
-          <w14:ligatures w14:val="none"/>
-        </w:rPr>
-        <w:t xml:space="preserve">For easier downstream processing, we converted the dataset into a Pandas </w:t>
-      </w:r>
-      <w:proofErr w:type="spellStart"/>
-      <w:r>
-        <w:rPr>
-          <w:rFonts w:ascii="Times New Roman" w:eastAsia="Times New Roman" w:hAnsi="Times New Roman" w:cs="Times New Roman"/>
-          <w:kern w:val="0"/>
-          <w14:ligatures w14:val="none"/>
-        </w:rPr>
-        <w:t>DataFrame</w:t>
-      </w:r>
-      <w:proofErr w:type="spellEnd"/>
-      <w:r>
-        <w:rPr>
-          <w:rFonts w:ascii="Times New Roman" w:eastAsia="Times New Roman" w:hAnsi="Times New Roman" w:cs="Times New Roman"/>
-          <w:kern w:val="0"/>
-          <w14:ligatures w14:val="none"/>
-        </w:rPr>
-        <w:t>. Each row corresponds to one image, where:</w:t>
+        <w:t>1.2 Conversion to Pandas DataFrame</w:t>
+      </w:r>
+    </w:p>
+    <w:p>
+      <w:pPr>
+        <w:spacing w:before="100" w:beforeAutospacing="1" w:after="100" w:afterAutospacing="1" w:line="240" w:lineRule="auto"/>
+        <w:rPr>
+          <w:rFonts w:ascii="Times New Roman" w:eastAsia="Times New Roman" w:hAnsi="Times New Roman" w:cs="Times New Roman"/>
+          <w:kern w:val="0"/>
+          <w14:ligatures w14:val="none"/>
+        </w:rPr>
+      </w:pPr>
+      <w:r>
+        <w:rPr>
+          <w:rFonts w:ascii="Times New Roman" w:eastAsia="Times New Roman" w:hAnsi="Times New Roman" w:cs="Times New Roman"/>
+          <w:kern w:val="0"/>
+          <w14:ligatures w14:val="none"/>
+        </w:rPr>
+        <w:t>For easier downstream processing, we converted the dataset into a Pandas DataFrame. Each row corresponds to one image, where:</w:t>
       </w:r>
     </w:p>
     <w:p>
@@ -252,23 +200,13 @@
           <w14:ligatures w14:val="none"/>
         </w:rPr>
       </w:pPr>
-      <w:proofErr w:type="spellStart"/>
-      <w:r>
-        <w:rPr>
-          <w:rFonts w:ascii="Times New Roman" w:eastAsia="Times New Roman" w:hAnsi="Times New Roman" w:cs="Times New Roman"/>
-          <w:kern w:val="0"/>
-          <w14:ligatures w14:val="none"/>
-        </w:rPr>
-        <w:t>person_id</w:t>
-      </w:r>
-      <w:proofErr w:type="spellEnd"/>
-      <w:r>
-        <w:rPr>
-          <w:rFonts w:ascii="Times New Roman" w:eastAsia="Times New Roman" w:hAnsi="Times New Roman" w:cs="Times New Roman"/>
-          <w:kern w:val="0"/>
-          <w14:ligatures w14:val="none"/>
-        </w:rPr>
-        <w:t>: integer label from 0 to 19</w:t>
+      <w:r>
+        <w:rPr>
+          <w:rFonts w:ascii="Times New Roman" w:eastAsia="Times New Roman" w:hAnsi="Times New Roman" w:cs="Times New Roman"/>
+          <w:kern w:val="0"/>
+          <w14:ligatures w14:val="none"/>
+        </w:rPr>
+        <w:t>person_id: integer label from 0 to 19</w:t>
       </w:r>
     </w:p>
     <w:p>
@@ -335,33 +273,7 @@
           <w:szCs w:val="27"/>
           <w14:ligatures w14:val="none"/>
         </w:rPr>
-        <w:t>2.1 Stratified train/</w:t>
-      </w:r>
-      <w:proofErr w:type="spellStart"/>
-      <w:r>
-        <w:rPr>
-          <w:rFonts w:ascii="Times New Roman" w:eastAsia="Times New Roman" w:hAnsi="Times New Roman" w:cs="Times New Roman"/>
-          <w:b/>
-          <w:bCs/>
-          <w:kern w:val="0"/>
-          <w:sz w:val="27"/>
-          <w:szCs w:val="27"/>
-          <w14:ligatures w14:val="none"/>
-        </w:rPr>
-        <w:t>val</w:t>
-      </w:r>
-      <w:proofErr w:type="spellEnd"/>
-      <w:r>
-        <w:rPr>
-          <w:rFonts w:ascii="Times New Roman" w:eastAsia="Times New Roman" w:hAnsi="Times New Roman" w:cs="Times New Roman"/>
-          <w:b/>
-          <w:bCs/>
-          <w:kern w:val="0"/>
-          <w:sz w:val="27"/>
-          <w:szCs w:val="27"/>
-          <w14:ligatures w14:val="none"/>
-        </w:rPr>
-        <w:t>/test split</w:t>
+        <w:t>2.1 Stratified train/val/test split</w:t>
       </w:r>
     </w:p>
     <w:p>
@@ -511,43 +423,7 @@
           <w:kern w:val="0"/>
           <w14:ligatures w14:val="none"/>
         </w:rPr>
-        <w:t xml:space="preserve">Stratification was done with </w:t>
-      </w:r>
-      <w:proofErr w:type="spellStart"/>
-      <w:r>
-        <w:rPr>
-          <w:rFonts w:ascii="Times New Roman" w:eastAsia="Times New Roman" w:hAnsi="Times New Roman" w:cs="Times New Roman"/>
-          <w:kern w:val="0"/>
-          <w14:ligatures w14:val="none"/>
-        </w:rPr>
-        <w:t>StratifiedShuffleSplit</w:t>
-      </w:r>
-      <w:proofErr w:type="spellEnd"/>
-      <w:r>
-        <w:rPr>
-          <w:rFonts w:ascii="Times New Roman" w:eastAsia="Times New Roman" w:hAnsi="Times New Roman" w:cs="Times New Roman"/>
-          <w:kern w:val="0"/>
-          <w14:ligatures w14:val="none"/>
-        </w:rPr>
-        <w:t xml:space="preserve">, using </w:t>
-      </w:r>
-      <w:proofErr w:type="spellStart"/>
-      <w:r>
-        <w:rPr>
-          <w:rFonts w:ascii="Times New Roman" w:eastAsia="Times New Roman" w:hAnsi="Times New Roman" w:cs="Times New Roman"/>
-          <w:kern w:val="0"/>
-          <w14:ligatures w14:val="none"/>
-        </w:rPr>
-        <w:t>person_id</w:t>
-      </w:r>
-      <w:proofErr w:type="spellEnd"/>
-      <w:r>
-        <w:rPr>
-          <w:rFonts w:ascii="Times New Roman" w:eastAsia="Times New Roman" w:hAnsi="Times New Roman" w:cs="Times New Roman"/>
-          <w:kern w:val="0"/>
-          <w14:ligatures w14:val="none"/>
-        </w:rPr>
-        <w:t xml:space="preserve"> as the stratification key. This guarantees that </w:t>
+        <w:t xml:space="preserve">Stratification was done with StratifiedShuffleSplit, using person_id as the stratification key. This guarantees that </w:t>
       </w:r>
       <w:r>
         <w:rPr>
@@ -693,63 +569,25 @@
           <w:kern w:val="0"/>
           <w14:ligatures w14:val="none"/>
         </w:rPr>
-        <w:t xml:space="preserve"> by dividing pixel values by 255. Then, we fitted a </w:t>
-      </w:r>
-      <w:proofErr w:type="spellStart"/>
-      <w:r>
-        <w:rPr>
-          <w:rFonts w:ascii="Times New Roman" w:eastAsia="Times New Roman" w:hAnsi="Times New Roman" w:cs="Times New Roman"/>
-          <w:kern w:val="0"/>
-          <w14:ligatures w14:val="none"/>
-        </w:rPr>
-        <w:t>StandardScaler</w:t>
-      </w:r>
-      <w:proofErr w:type="spellEnd"/>
-      <w:r>
-        <w:rPr>
-          <w:rFonts w:ascii="Times New Roman" w:eastAsia="Times New Roman" w:hAnsi="Times New Roman" w:cs="Times New Roman"/>
-          <w:kern w:val="0"/>
-          <w14:ligatures w14:val="none"/>
-        </w:rPr>
-        <w:t xml:space="preserve"> </w:t>
-      </w:r>
-      <w:r>
-        <w:rPr>
-          <w:rFonts w:ascii="Times New Roman" w:eastAsia="Times New Roman" w:hAnsi="Times New Roman" w:cs="Times New Roman"/>
-          <w:b/>
-          <w:bCs/>
-          <w:kern w:val="0"/>
-          <w14:ligatures w14:val="none"/>
-        </w:rPr>
-        <w:t xml:space="preserve">only on the training </w:t>
-      </w:r>
-      <w:proofErr w:type="gramStart"/>
-      <w:r>
-        <w:rPr>
-          <w:rFonts w:ascii="Times New Roman" w:eastAsia="Times New Roman" w:hAnsi="Times New Roman" w:cs="Times New Roman"/>
-          <w:b/>
-          <w:bCs/>
-          <w:kern w:val="0"/>
-          <w14:ligatures w14:val="none"/>
-        </w:rPr>
-        <w:t>set</w:t>
-      </w:r>
-      <w:r>
-        <w:rPr>
-          <w:rFonts w:ascii="Times New Roman" w:eastAsia="Times New Roman" w:hAnsi="Times New Roman" w:cs="Times New Roman"/>
-          <w:kern w:val="0"/>
-          <w14:ligatures w14:val="none"/>
-        </w:rPr>
-        <w:t>, and</w:t>
-      </w:r>
-      <w:proofErr w:type="gramEnd"/>
-      <w:r>
-        <w:rPr>
-          <w:rFonts w:ascii="Times New Roman" w:eastAsia="Times New Roman" w:hAnsi="Times New Roman" w:cs="Times New Roman"/>
-          <w:kern w:val="0"/>
-          <w14:ligatures w14:val="none"/>
-        </w:rPr>
-        <w:t xml:space="preserve"> used the same scaler to transform the validation and test sets.</w:t>
+        <w:t xml:space="preserve"> by dividing pixel values by 255. Then, we fitted a StandardScaler </w:t>
+      </w:r>
+      <w:r>
+        <w:rPr>
+          <w:rFonts w:ascii="Times New Roman" w:eastAsia="Times New Roman" w:hAnsi="Times New Roman" w:cs="Times New Roman"/>
+          <w:b/>
+          <w:bCs/>
+          <w:kern w:val="0"/>
+          <w14:ligatures w14:val="none"/>
+        </w:rPr>
+        <w:t>only on the training set</w:t>
+      </w:r>
+      <w:r>
+        <w:rPr>
+          <w:rFonts w:ascii="Times New Roman" w:eastAsia="Times New Roman" w:hAnsi="Times New Roman" w:cs="Times New Roman"/>
+          <w:kern w:val="0"/>
+          <w14:ligatures w14:val="none"/>
+        </w:rPr>
+        <w:t>, and used the same scaler to transform the validation and test sets.</w:t>
       </w:r>
     </w:p>
     <w:p>
@@ -1139,25 +977,7 @@
           <w:kern w:val="0"/>
           <w14:ligatures w14:val="none"/>
         </w:rPr>
-        <w:t>Encoder: Dense → 128 units (</w:t>
-      </w:r>
-      <w:proofErr w:type="spellStart"/>
-      <w:r>
-        <w:rPr>
-          <w:rFonts w:ascii="Times New Roman" w:eastAsia="Times New Roman" w:hAnsi="Times New Roman" w:cs="Times New Roman"/>
-          <w:kern w:val="0"/>
-          <w14:ligatures w14:val="none"/>
-        </w:rPr>
-        <w:t>ReLU</w:t>
-      </w:r>
-      <w:proofErr w:type="spellEnd"/>
-      <w:r>
-        <w:rPr>
-          <w:rFonts w:ascii="Times New Roman" w:eastAsia="Times New Roman" w:hAnsi="Times New Roman" w:cs="Times New Roman"/>
-          <w:kern w:val="0"/>
-          <w14:ligatures w14:val="none"/>
-        </w:rPr>
-        <w:t>) → 64-dim latent code</w:t>
+        <w:t>Encoder: Dense → 128 units (ReLU) → 64-dim latent code</w:t>
       </w:r>
     </w:p>
     <w:p>
@@ -1332,29 +1152,7 @@
           <w:kern w:val="0"/>
           <w14:ligatures w14:val="none"/>
         </w:rPr>
-        <w:t xml:space="preserve">orthogonal, </w:t>
-      </w:r>
-      <w:proofErr w:type="gramStart"/>
-      <w:r>
-        <w:rPr>
-          <w:rFonts w:ascii="Times New Roman" w:eastAsia="Times New Roman" w:hAnsi="Times New Roman" w:cs="Times New Roman"/>
-          <w:b/>
-          <w:bCs/>
-          <w:kern w:val="0"/>
-          <w14:ligatures w14:val="none"/>
-        </w:rPr>
-        <w:t>linearly-decoupled</w:t>
-      </w:r>
-      <w:proofErr w:type="gramEnd"/>
-      <w:r>
-        <w:rPr>
-          <w:rFonts w:ascii="Times New Roman" w:eastAsia="Times New Roman" w:hAnsi="Times New Roman" w:cs="Times New Roman"/>
-          <w:b/>
-          <w:bCs/>
-          <w:kern w:val="0"/>
-          <w14:ligatures w14:val="none"/>
-        </w:rPr>
-        <w:t xml:space="preserve"> directions</w:t>
+        <w:t>orthogonal, linearly-decoupled directions</w:t>
       </w:r>
       <w:r>
         <w:rPr>
@@ -1450,71 +1248,82 @@
     <w:p>
       <w:pPr>
         <w:spacing w:before="100" w:beforeAutospacing="1" w:after="100" w:afterAutospacing="1" w:line="240" w:lineRule="auto"/>
-        <w:outlineLvl w:val="2"/>
-        <w:rPr>
-          <w:rFonts w:ascii="Times New Roman" w:eastAsia="Times New Roman" w:hAnsi="Times New Roman" w:cs="Times New Roman"/>
-          <w:b/>
-          <w:bCs/>
-          <w:kern w:val="0"/>
-          <w:sz w:val="27"/>
-          <w:szCs w:val="27"/>
-          <w14:ligatures w14:val="none"/>
-        </w:rPr>
-      </w:pPr>
-      <w:r>
-        <w:rPr>
-          <w:rFonts w:ascii="Times New Roman" w:eastAsia="Times New Roman" w:hAnsi="Times New Roman" w:cs="Times New Roman"/>
-          <w:b/>
-          <w:bCs/>
-          <w:kern w:val="0"/>
-          <w:sz w:val="27"/>
-          <w:szCs w:val="27"/>
-          <w14:ligatures w14:val="none"/>
-        </w:rPr>
-        <w:t>4.1 Methods and parameter choices</w:t>
-      </w:r>
-    </w:p>
-    <w:p>
-      <w:pPr>
-        <w:spacing w:before="100" w:beforeAutospacing="1" w:after="100" w:afterAutospacing="1" w:line="240" w:lineRule="auto"/>
-        <w:rPr>
-          <w:rFonts w:ascii="Times New Roman" w:eastAsia="Times New Roman" w:hAnsi="Times New Roman" w:cs="Times New Roman"/>
-          <w:kern w:val="0"/>
-          <w14:ligatures w14:val="none"/>
-        </w:rPr>
-      </w:pPr>
-      <w:r>
-        <w:rPr>
-          <w:rFonts w:ascii="Times New Roman" w:eastAsia="Times New Roman" w:hAnsi="Times New Roman" w:cs="Times New Roman"/>
-          <w:kern w:val="0"/>
-          <w14:ligatures w14:val="none"/>
-        </w:rPr>
-        <w:t xml:space="preserve">After dimensionality reduction, we applied the following clustering methods on the </w:t>
-      </w:r>
-      <w:r>
-        <w:rPr>
-          <w:rFonts w:ascii="Times New Roman" w:eastAsia="Times New Roman" w:hAnsi="Times New Roman" w:cs="Times New Roman"/>
-          <w:b/>
-          <w:bCs/>
-          <w:kern w:val="0"/>
-          <w14:ligatures w14:val="none"/>
-        </w:rPr>
-        <w:t>50-dim PCA features</w:t>
-      </w:r>
-      <w:r>
-        <w:rPr>
-          <w:rFonts w:ascii="Times New Roman" w:eastAsia="Times New Roman" w:hAnsi="Times New Roman" w:cs="Times New Roman"/>
-          <w:kern w:val="0"/>
-          <w14:ligatures w14:val="none"/>
-        </w:rPr>
-        <w:t>:</w:t>
+        <w:rPr>
+          <w:rFonts w:ascii="Times New Roman" w:eastAsia="Times New Roman" w:hAnsi="Times New Roman" w:cs="Times New Roman"/>
+          <w:kern w:val="0"/>
+          <w14:ligatures w14:val="none"/>
+        </w:rPr>
+      </w:pPr>
+      <w:r>
+        <w:rPr>
+          <w:rFonts w:ascii="Times New Roman" w:eastAsia="Times New Roman" w:hAnsi="Times New Roman" w:cs="Times New Roman"/>
+          <w:kern w:val="0"/>
+          <w14:ligatures w14:val="none"/>
+        </w:rPr>
+        <w:t>(</w:t>
+      </w:r>
+      <w:r>
+        <w:rPr>
+          <w:rFonts w:ascii="Times New Roman" w:eastAsia="Times New Roman" w:hAnsi="Times New Roman" w:cs="Times New Roman"/>
+          <w:kern w:val="0"/>
+          <w14:ligatures w14:val="none"/>
+        </w:rPr>
+        <w:t>Modified by Shourav</w:t>
+      </w:r>
+      <w:r>
+        <w:rPr>
+          <w:rFonts w:ascii="Times New Roman" w:eastAsia="Times New Roman" w:hAnsi="Times New Roman" w:cs="Times New Roman"/>
+          <w:kern w:val="0"/>
+          <w14:ligatures w14:val="none"/>
+        </w:rPr>
+        <w:t>)</w:t>
+      </w:r>
+    </w:p>
+    <w:p>
+      <w:pPr>
+        <w:spacing w:before="100" w:beforeAutospacing="1" w:after="100" w:afterAutospacing="1" w:line="240" w:lineRule="auto"/>
+        <w:rPr>
+          <w:rFonts w:ascii="Times New Roman" w:eastAsia="Times New Roman" w:hAnsi="Times New Roman" w:cs="Times New Roman"/>
+          <w:kern w:val="0"/>
+          <w14:ligatures w14:val="none"/>
+        </w:rPr>
+      </w:pPr>
+      <w:r>
+        <w:rPr>
+          <w:rFonts w:ascii="Times New Roman" w:eastAsia="Times New Roman" w:hAnsi="Times New Roman" w:cs="Times New Roman"/>
+          <w:b/>
+          <w:bCs/>
+          <w:kern w:val="0"/>
+          <w14:ligatures w14:val="none"/>
+        </w:rPr>
+        <w:t>Clustering Report</w:t>
+      </w:r>
+    </w:p>
+    <w:p>
+      <w:pPr>
+        <w:spacing w:before="100" w:beforeAutospacing="1" w:after="100" w:afterAutospacing="1" w:line="240" w:lineRule="auto"/>
+        <w:rPr>
+          <w:rFonts w:ascii="Times New Roman" w:eastAsia="Times New Roman" w:hAnsi="Times New Roman" w:cs="Times New Roman"/>
+          <w:kern w:val="0"/>
+          <w14:ligatures w14:val="none"/>
+        </w:rPr>
+      </w:pPr>
+      <w:r>
+        <w:rPr>
+          <w:rFonts w:ascii="Times New Roman" w:eastAsia="Times New Roman" w:hAnsi="Times New Roman" w:cs="Times New Roman"/>
+          <w:b/>
+          <w:bCs/>
+          <w:kern w:val="0"/>
+          <w14:ligatures w14:val="none"/>
+        </w:rPr>
+        <w:t>1. Methods Chosen and Why</w:t>
       </w:r>
     </w:p>
     <w:p>
       <w:pPr>
         <w:numPr>
           <w:ilvl w:val="0"/>
-          <w:numId w:val="5"/>
+          <w:numId w:val="14"/>
         </w:numPr>
         <w:spacing w:before="100" w:beforeAutospacing="1" w:after="100" w:afterAutospacing="1" w:line="240" w:lineRule="auto"/>
         <w:rPr>
@@ -1531,22 +1340,22 @@
           <w:kern w:val="0"/>
           <w14:ligatures w14:val="none"/>
         </w:rPr>
-        <w:t>K-Means</w:t>
-      </w:r>
-      <w:r>
-        <w:rPr>
-          <w:rFonts w:ascii="Times New Roman" w:eastAsia="Times New Roman" w:hAnsi="Times New Roman" w:cs="Times New Roman"/>
-          <w:kern w:val="0"/>
-          <w14:ligatures w14:val="none"/>
-        </w:rPr>
-        <w:t xml:space="preserve"> (k = 20, “k-means++” initialization, 20 random restarts)</w:t>
+        <w:t>K-Means:</w:t>
+      </w:r>
+      <w:r>
+        <w:rPr>
+          <w:rFonts w:ascii="Times New Roman" w:eastAsia="Times New Roman" w:hAnsi="Times New Roman" w:cs="Times New Roman"/>
+          <w:kern w:val="0"/>
+          <w14:ligatures w14:val="none"/>
+        </w:rPr>
+        <w:t> We chose K-Means because it is a simple and popular clustering method that works well when clusters are compact and separated. It’s a good baseline for comparing results.</w:t>
       </w:r>
     </w:p>
     <w:p>
       <w:pPr>
         <w:numPr>
           <w:ilvl w:val="0"/>
-          <w:numId w:val="5"/>
+          <w:numId w:val="14"/>
         </w:numPr>
         <w:spacing w:before="100" w:beforeAutospacing="1" w:after="100" w:afterAutospacing="1" w:line="240" w:lineRule="auto"/>
         <w:rPr>
@@ -1563,157 +1372,22 @@
           <w:kern w:val="0"/>
           <w14:ligatures w14:val="none"/>
         </w:rPr>
-        <w:t>Agglomerative (Hierarchical) Clustering</w:t>
-      </w:r>
-      <w:r>
-        <w:rPr>
-          <w:rFonts w:ascii="Times New Roman" w:eastAsia="Times New Roman" w:hAnsi="Times New Roman" w:cs="Times New Roman"/>
-          <w:kern w:val="0"/>
-          <w14:ligatures w14:val="none"/>
-        </w:rPr>
-        <w:t xml:space="preserve"> using </w:t>
-      </w:r>
-      <w:r>
-        <w:rPr>
-          <w:rFonts w:ascii="Times New Roman" w:eastAsia="Times New Roman" w:hAnsi="Times New Roman" w:cs="Times New Roman"/>
-          <w:b/>
-          <w:bCs/>
-          <w:kern w:val="0"/>
-          <w14:ligatures w14:val="none"/>
-        </w:rPr>
-        <w:t>Ward linkage</w:t>
-      </w:r>
-      <w:r>
-        <w:rPr>
-          <w:rFonts w:ascii="Times New Roman" w:eastAsia="Times New Roman" w:hAnsi="Times New Roman" w:cs="Times New Roman"/>
-          <w:kern w:val="0"/>
-          <w14:ligatures w14:val="none"/>
-        </w:rPr>
-        <w:t xml:space="preserve"> with 20 clusters</w:t>
-      </w:r>
-    </w:p>
-    <w:p>
-      <w:pPr>
-        <w:spacing w:before="100" w:beforeAutospacing="1" w:after="100" w:afterAutospacing="1" w:line="240" w:lineRule="auto"/>
-        <w:rPr>
-          <w:rFonts w:ascii="Times New Roman" w:eastAsia="Times New Roman" w:hAnsi="Times New Roman" w:cs="Times New Roman"/>
-          <w:kern w:val="0"/>
-          <w14:ligatures w14:val="none"/>
-        </w:rPr>
-      </w:pPr>
-      <w:r>
-        <w:rPr>
-          <w:rFonts w:ascii="Times New Roman" w:eastAsia="Times New Roman" w:hAnsi="Times New Roman" w:cs="Times New Roman"/>
-          <w:kern w:val="0"/>
-          <w14:ligatures w14:val="none"/>
-        </w:rPr>
-        <w:t xml:space="preserve">In addition, we ran </w:t>
-      </w:r>
-      <w:r>
-        <w:rPr>
-          <w:rFonts w:ascii="Times New Roman" w:eastAsia="Times New Roman" w:hAnsi="Times New Roman" w:cs="Times New Roman"/>
-          <w:b/>
-          <w:bCs/>
-          <w:kern w:val="0"/>
-          <w14:ligatures w14:val="none"/>
-        </w:rPr>
-        <w:t>K-Means on the 64-dim autoencoder latent codes</w:t>
-      </w:r>
-      <w:r>
-        <w:rPr>
-          <w:rFonts w:ascii="Times New Roman" w:eastAsia="Times New Roman" w:hAnsi="Times New Roman" w:cs="Times New Roman"/>
-          <w:kern w:val="0"/>
-          <w14:ligatures w14:val="none"/>
-        </w:rPr>
-        <w:t xml:space="preserve"> as an optional variant.</w:t>
-      </w:r>
-    </w:p>
-    <w:p>
-      <w:pPr>
-        <w:spacing w:before="100" w:beforeAutospacing="1" w:after="100" w:afterAutospacing="1" w:line="240" w:lineRule="auto"/>
-        <w:rPr>
-          <w:rFonts w:ascii="Times New Roman" w:eastAsia="Times New Roman" w:hAnsi="Times New Roman" w:cs="Times New Roman"/>
-          <w:kern w:val="0"/>
-          <w14:ligatures w14:val="none"/>
-        </w:rPr>
-      </w:pPr>
-      <w:r>
-        <w:rPr>
-          <w:rFonts w:ascii="Times New Roman" w:eastAsia="Times New Roman" w:hAnsi="Times New Roman" w:cs="Times New Roman"/>
-          <w:kern w:val="0"/>
-          <w14:ligatures w14:val="none"/>
-        </w:rPr>
-        <w:t xml:space="preserve">The choice of </w:t>
-      </w:r>
-      <w:r>
-        <w:rPr>
-          <w:rFonts w:ascii="Times New Roman" w:eastAsia="Times New Roman" w:hAnsi="Times New Roman" w:cs="Times New Roman"/>
-          <w:b/>
-          <w:bCs/>
-          <w:kern w:val="0"/>
-          <w14:ligatures w14:val="none"/>
-        </w:rPr>
-        <w:t>20 clusters</w:t>
-      </w:r>
-      <w:r>
-        <w:rPr>
-          <w:rFonts w:ascii="Times New Roman" w:eastAsia="Times New Roman" w:hAnsi="Times New Roman" w:cs="Times New Roman"/>
-          <w:kern w:val="0"/>
-          <w14:ligatures w14:val="none"/>
-        </w:rPr>
-        <w:t xml:space="preserve"> is natural, as the ground-truth data contains 20 individuals. Ward linkage was used because it minimizes within-cluster variance, which suits Euclidean PCA space.</w:t>
-      </w:r>
-    </w:p>
-    <w:p>
-      <w:pPr>
-        <w:spacing w:before="100" w:beforeAutospacing="1" w:after="100" w:afterAutospacing="1" w:line="240" w:lineRule="auto"/>
-        <w:outlineLvl w:val="2"/>
-        <w:rPr>
-          <w:rFonts w:ascii="Times New Roman" w:eastAsia="Times New Roman" w:hAnsi="Times New Roman" w:cs="Times New Roman"/>
-          <w:b/>
-          <w:bCs/>
-          <w:kern w:val="0"/>
-          <w:sz w:val="27"/>
-          <w:szCs w:val="27"/>
-          <w14:ligatures w14:val="none"/>
-        </w:rPr>
-      </w:pPr>
-      <w:r>
-        <w:rPr>
-          <w:rFonts w:ascii="Times New Roman" w:eastAsia="Times New Roman" w:hAnsi="Times New Roman" w:cs="Times New Roman"/>
-          <w:b/>
-          <w:bCs/>
-          <w:kern w:val="0"/>
-          <w:sz w:val="27"/>
-          <w:szCs w:val="27"/>
-          <w14:ligatures w14:val="none"/>
-        </w:rPr>
-        <w:t>4.2 Clustering quality metrics</w:t>
-      </w:r>
-    </w:p>
-    <w:p>
-      <w:pPr>
-        <w:spacing w:before="100" w:beforeAutospacing="1" w:after="100" w:afterAutospacing="1" w:line="240" w:lineRule="auto"/>
-        <w:rPr>
-          <w:rFonts w:ascii="Times New Roman" w:eastAsia="Times New Roman" w:hAnsi="Times New Roman" w:cs="Times New Roman"/>
-          <w:kern w:val="0"/>
-          <w14:ligatures w14:val="none"/>
-        </w:rPr>
-      </w:pPr>
-      <w:r>
-        <w:rPr>
-          <w:rFonts w:ascii="Times New Roman" w:eastAsia="Times New Roman" w:hAnsi="Times New Roman" w:cs="Times New Roman"/>
-          <w:kern w:val="0"/>
-          <w14:ligatures w14:val="none"/>
-        </w:rPr>
-        <w:t>We evaluated clustering performance on the training set using several standard metrics comparing cluster assignments with true labels:</w:t>
+        <w:t>Agglomerative (Ward) Clustering:</w:t>
+      </w:r>
+      <w:r>
+        <w:rPr>
+          <w:rFonts w:ascii="Times New Roman" w:eastAsia="Times New Roman" w:hAnsi="Times New Roman" w:cs="Times New Roman"/>
+          <w:kern w:val="0"/>
+          <w14:ligatures w14:val="none"/>
+        </w:rPr>
+        <w:t> We used this hierarchical method because it can merge small, similar groups and sometimes finds better groupings when data is not perfectly separated. Ward linkage is good for data that’s been standardized and reduced by PCA.</w:t>
       </w:r>
     </w:p>
     <w:p>
       <w:pPr>
         <w:numPr>
           <w:ilvl w:val="0"/>
-          <w:numId w:val="6"/>
+          <w:numId w:val="14"/>
         </w:numPr>
         <w:spacing w:before="100" w:beforeAutospacing="1" w:after="100" w:afterAutospacing="1" w:line="240" w:lineRule="auto"/>
         <w:rPr>
@@ -1730,36 +1404,674 @@
           <w:kern w:val="0"/>
           <w14:ligatures w14:val="none"/>
         </w:rPr>
-        <w:t>K-Means on PCA (</w:t>
-      </w:r>
-      <w:proofErr w:type="spellStart"/>
-      <w:r>
-        <w:rPr>
-          <w:rFonts w:ascii="Times New Roman" w:eastAsia="Times New Roman" w:hAnsi="Times New Roman" w:cs="Times New Roman"/>
-          <w:b/>
-          <w:bCs/>
-          <w:kern w:val="0"/>
-          <w14:ligatures w14:val="none"/>
-        </w:rPr>
-        <w:t>pca-KMeans</w:t>
-      </w:r>
-      <w:proofErr w:type="spellEnd"/>
-      <w:r>
-        <w:rPr>
-          <w:rFonts w:ascii="Times New Roman" w:eastAsia="Times New Roman" w:hAnsi="Times New Roman" w:cs="Times New Roman"/>
-          <w:b/>
-          <w:bCs/>
-          <w:kern w:val="0"/>
-          <w14:ligatures w14:val="none"/>
-        </w:rPr>
-        <w:t>)</w:t>
+        <w:t>K-Means on Autoencoder Features:</w:t>
+      </w:r>
+      <w:r>
+        <w:rPr>
+          <w:rFonts w:ascii="Times New Roman" w:eastAsia="Times New Roman" w:hAnsi="Times New Roman" w:cs="Times New Roman"/>
+          <w:kern w:val="0"/>
+          <w14:ligatures w14:val="none"/>
+        </w:rPr>
+        <w:t> We also tried clustering on features learned by an autoencoder (a neural network that compresses data), to see if nonlinear features help group faces by identity better than PCA.</w:t>
+      </w:r>
+    </w:p>
+    <w:p>
+      <w:pPr>
+        <w:spacing w:before="100" w:beforeAutospacing="1" w:after="100" w:afterAutospacing="1" w:line="240" w:lineRule="auto"/>
+        <w:rPr>
+          <w:rFonts w:ascii="Times New Roman" w:eastAsia="Times New Roman" w:hAnsi="Times New Roman" w:cs="Times New Roman"/>
+          <w:kern w:val="0"/>
+          <w14:ligatures w14:val="none"/>
+        </w:rPr>
+      </w:pPr>
+      <w:r>
+        <w:rPr>
+          <w:rFonts w:ascii="Times New Roman" w:eastAsia="Times New Roman" w:hAnsi="Times New Roman" w:cs="Times New Roman"/>
+          <w:b/>
+          <w:bCs/>
+          <w:kern w:val="0"/>
+          <w14:ligatures w14:val="none"/>
+        </w:rPr>
+        <w:t>2. Parameter Tuning</w:t>
+      </w:r>
+    </w:p>
+    <w:p>
+      <w:pPr>
+        <w:numPr>
+          <w:ilvl w:val="0"/>
+          <w:numId w:val="15"/>
+        </w:numPr>
+        <w:spacing w:before="100" w:beforeAutospacing="1" w:after="100" w:afterAutospacing="1" w:line="240" w:lineRule="auto"/>
+        <w:rPr>
+          <w:rFonts w:ascii="Times New Roman" w:eastAsia="Times New Roman" w:hAnsi="Times New Roman" w:cs="Times New Roman"/>
+          <w:kern w:val="0"/>
+          <w14:ligatures w14:val="none"/>
+        </w:rPr>
+      </w:pPr>
+      <w:r>
+        <w:rPr>
+          <w:rFonts w:ascii="Times New Roman" w:eastAsia="Times New Roman" w:hAnsi="Times New Roman" w:cs="Times New Roman"/>
+          <w:b/>
+          <w:bCs/>
+          <w:kern w:val="0"/>
+          <w14:ligatures w14:val="none"/>
+        </w:rPr>
+        <w:t>Number of clusters:</w:t>
+      </w:r>
+      <w:r>
+        <w:rPr>
+          <w:rFonts w:ascii="Times New Roman" w:eastAsia="Times New Roman" w:hAnsi="Times New Roman" w:cs="Times New Roman"/>
+          <w:kern w:val="0"/>
+          <w14:ligatures w14:val="none"/>
+        </w:rPr>
+        <w:t> We set this to 20 for both K-Means and Agglomerative, since there are 20 people in the dataset. This lets us directly compare clusters to real identities.</w:t>
+      </w:r>
+    </w:p>
+    <w:p>
+      <w:pPr>
+        <w:numPr>
+          <w:ilvl w:val="0"/>
+          <w:numId w:val="15"/>
+        </w:numPr>
+        <w:spacing w:before="100" w:beforeAutospacing="1" w:after="100" w:afterAutospacing="1" w:line="240" w:lineRule="auto"/>
+        <w:rPr>
+          <w:rFonts w:ascii="Times New Roman" w:eastAsia="Times New Roman" w:hAnsi="Times New Roman" w:cs="Times New Roman"/>
+          <w:kern w:val="0"/>
+          <w14:ligatures w14:val="none"/>
+        </w:rPr>
+      </w:pPr>
+      <w:r>
+        <w:rPr>
+          <w:rFonts w:ascii="Times New Roman" w:eastAsia="Times New Roman" w:hAnsi="Times New Roman" w:cs="Times New Roman"/>
+          <w:b/>
+          <w:bCs/>
+          <w:kern w:val="0"/>
+          <w14:ligatures w14:val="none"/>
+        </w:rPr>
+        <w:t>K-Means:</w:t>
+      </w:r>
+      <w:r>
+        <w:rPr>
+          <w:rFonts w:ascii="Times New Roman" w:eastAsia="Times New Roman" w:hAnsi="Times New Roman" w:cs="Times New Roman"/>
+          <w:kern w:val="0"/>
+          <w14:ligatures w14:val="none"/>
+        </w:rPr>
+        <w:t> We used n_init=10 to make the results more stable (the algorithm tries 10 different random starts and picks the best).</w:t>
+      </w:r>
+    </w:p>
+    <w:p>
+      <w:pPr>
+        <w:numPr>
+          <w:ilvl w:val="0"/>
+          <w:numId w:val="15"/>
+        </w:numPr>
+        <w:spacing w:before="100" w:beforeAutospacing="1" w:after="100" w:afterAutospacing="1" w:line="240" w:lineRule="auto"/>
+        <w:rPr>
+          <w:rFonts w:ascii="Times New Roman" w:eastAsia="Times New Roman" w:hAnsi="Times New Roman" w:cs="Times New Roman"/>
+          <w:kern w:val="0"/>
+          <w14:ligatures w14:val="none"/>
+        </w:rPr>
+      </w:pPr>
+      <w:r>
+        <w:rPr>
+          <w:rFonts w:ascii="Times New Roman" w:eastAsia="Times New Roman" w:hAnsi="Times New Roman" w:cs="Times New Roman"/>
+          <w:b/>
+          <w:bCs/>
+          <w:kern w:val="0"/>
+          <w14:ligatures w14:val="none"/>
+        </w:rPr>
+        <w:t>Agglomerative:</w:t>
+      </w:r>
+      <w:r>
+        <w:rPr>
+          <w:rFonts w:ascii="Times New Roman" w:eastAsia="Times New Roman" w:hAnsi="Times New Roman" w:cs="Times New Roman"/>
+          <w:kern w:val="0"/>
+          <w14:ligatures w14:val="none"/>
+        </w:rPr>
+        <w:t> We used the default “Ward” linkage, which tries to keep clusters as compact as possible.</w:t>
+      </w:r>
+    </w:p>
+    <w:p>
+      <w:pPr>
+        <w:numPr>
+          <w:ilvl w:val="0"/>
+          <w:numId w:val="15"/>
+        </w:numPr>
+        <w:spacing w:before="100" w:beforeAutospacing="1" w:after="100" w:afterAutospacing="1" w:line="240" w:lineRule="auto"/>
+        <w:rPr>
+          <w:rFonts w:ascii="Times New Roman" w:eastAsia="Times New Roman" w:hAnsi="Times New Roman" w:cs="Times New Roman"/>
+          <w:kern w:val="0"/>
+          <w14:ligatures w14:val="none"/>
+        </w:rPr>
+      </w:pPr>
+      <w:r>
+        <w:rPr>
+          <w:rFonts w:ascii="Times New Roman" w:eastAsia="Times New Roman" w:hAnsi="Times New Roman" w:cs="Times New Roman"/>
+          <w:b/>
+          <w:bCs/>
+          <w:kern w:val="0"/>
+          <w14:ligatures w14:val="none"/>
+        </w:rPr>
+        <w:t>PCA:</w:t>
+      </w:r>
+      <w:r>
+        <w:rPr>
+          <w:rFonts w:ascii="Times New Roman" w:eastAsia="Times New Roman" w:hAnsi="Times New Roman" w:cs="Times New Roman"/>
+          <w:kern w:val="0"/>
+          <w14:ligatures w14:val="none"/>
+        </w:rPr>
+        <w:t> We kept 50 principal components, which keeps most of the important information but reduces noise and makes clustering easier.</w:t>
+      </w:r>
+    </w:p>
+    <w:p>
+      <w:pPr>
+        <w:numPr>
+          <w:ilvl w:val="0"/>
+          <w:numId w:val="15"/>
+        </w:numPr>
+        <w:spacing w:before="100" w:beforeAutospacing="1" w:after="100" w:afterAutospacing="1" w:line="240" w:lineRule="auto"/>
+        <w:rPr>
+          <w:rFonts w:ascii="Times New Roman" w:eastAsia="Times New Roman" w:hAnsi="Times New Roman" w:cs="Times New Roman"/>
+          <w:kern w:val="0"/>
+          <w14:ligatures w14:val="none"/>
+        </w:rPr>
+      </w:pPr>
+      <w:r>
+        <w:rPr>
+          <w:rFonts w:ascii="Times New Roman" w:eastAsia="Times New Roman" w:hAnsi="Times New Roman" w:cs="Times New Roman"/>
+          <w:b/>
+          <w:bCs/>
+          <w:kern w:val="0"/>
+          <w14:ligatures w14:val="none"/>
+        </w:rPr>
+        <w:t>Autoencoder:</w:t>
+      </w:r>
+      <w:r>
+        <w:rPr>
+          <w:rFonts w:ascii="Times New Roman" w:eastAsia="Times New Roman" w:hAnsi="Times New Roman" w:cs="Times New Roman"/>
+          <w:kern w:val="0"/>
+          <w14:ligatures w14:val="none"/>
+        </w:rPr>
+        <w:t> We used a latent size of 64 and trained for 40 epochs, which is a balance between compressing the data and keeping enough information.</w:t>
+      </w:r>
+    </w:p>
+    <w:p>
+      <w:pPr>
+        <w:spacing w:before="100" w:beforeAutospacing="1" w:after="100" w:afterAutospacing="1" w:line="240" w:lineRule="auto"/>
+        <w:rPr>
+          <w:rFonts w:ascii="Times New Roman" w:eastAsia="Times New Roman" w:hAnsi="Times New Roman" w:cs="Times New Roman"/>
+          <w:kern w:val="0"/>
+          <w14:ligatures w14:val="none"/>
+        </w:rPr>
+      </w:pPr>
+      <w:r>
+        <w:rPr>
+          <w:rFonts w:ascii="Times New Roman" w:eastAsia="Times New Roman" w:hAnsi="Times New Roman" w:cs="Times New Roman"/>
+          <w:b/>
+          <w:bCs/>
+          <w:kern w:val="0"/>
+          <w14:ligatures w14:val="none"/>
+        </w:rPr>
+        <w:t>3. Challenges and Role of Dimensionality Reduction</w:t>
+      </w:r>
+    </w:p>
+    <w:p>
+      <w:pPr>
+        <w:numPr>
+          <w:ilvl w:val="0"/>
+          <w:numId w:val="16"/>
+        </w:numPr>
+        <w:spacing w:before="100" w:beforeAutospacing="1" w:after="100" w:afterAutospacing="1" w:line="240" w:lineRule="auto"/>
+        <w:rPr>
+          <w:rFonts w:ascii="Times New Roman" w:eastAsia="Times New Roman" w:hAnsi="Times New Roman" w:cs="Times New Roman"/>
+          <w:kern w:val="0"/>
+          <w14:ligatures w14:val="none"/>
+        </w:rPr>
+      </w:pPr>
+      <w:r>
+        <w:rPr>
+          <w:rFonts w:ascii="Times New Roman" w:eastAsia="Times New Roman" w:hAnsi="Times New Roman" w:cs="Times New Roman"/>
+          <w:b/>
+          <w:bCs/>
+          <w:kern w:val="0"/>
+          <w14:ligatures w14:val="none"/>
+        </w:rPr>
+        <w:t>High-dimensional data:</w:t>
+      </w:r>
+      <w:r>
+        <w:rPr>
+          <w:rFonts w:ascii="Times New Roman" w:eastAsia="Times New Roman" w:hAnsi="Times New Roman" w:cs="Times New Roman"/>
+          <w:kern w:val="0"/>
+          <w14:ligatures w14:val="none"/>
+        </w:rPr>
+        <w:t> Each image has over 10,000 pixels, making it hard for clustering to work well. In high dimensions, distances become less meaningful, and noise (like lighting or pose) can dominate.</w:t>
+      </w:r>
+    </w:p>
+    <w:p>
+      <w:pPr>
+        <w:numPr>
+          <w:ilvl w:val="0"/>
+          <w:numId w:val="16"/>
+        </w:numPr>
+        <w:spacing w:before="100" w:beforeAutospacing="1" w:after="100" w:afterAutospacing="1" w:line="240" w:lineRule="auto"/>
+        <w:rPr>
+          <w:rFonts w:ascii="Times New Roman" w:eastAsia="Times New Roman" w:hAnsi="Times New Roman" w:cs="Times New Roman"/>
+          <w:kern w:val="0"/>
+          <w14:ligatures w14:val="none"/>
+        </w:rPr>
+      </w:pPr>
+      <w:r>
+        <w:rPr>
+          <w:rFonts w:ascii="Times New Roman" w:eastAsia="Times New Roman" w:hAnsi="Times New Roman" w:cs="Times New Roman"/>
+          <w:b/>
+          <w:bCs/>
+          <w:kern w:val="0"/>
+          <w14:ligatures w14:val="none"/>
+        </w:rPr>
+        <w:t>Dimensionality reduction:</w:t>
+      </w:r>
+      <w:r>
+        <w:rPr>
+          <w:rFonts w:ascii="Times New Roman" w:eastAsia="Times New Roman" w:hAnsi="Times New Roman" w:cs="Times New Roman"/>
+          <w:kern w:val="0"/>
+          <w14:ligatures w14:val="none"/>
+        </w:rPr>
+        <w:t> PCA and autoencoders help by shrinking the data to a smaller set of features that (hopefully) keep the important differences between people and ignore noise. This makes clustering more effective and faster.</w:t>
+      </w:r>
+    </w:p>
+    <w:p>
+      <w:pPr>
+        <w:spacing w:before="100" w:beforeAutospacing="1" w:after="100" w:afterAutospacing="1" w:line="240" w:lineRule="auto"/>
+        <w:rPr>
+          <w:rFonts w:ascii="Times New Roman" w:eastAsia="Times New Roman" w:hAnsi="Times New Roman" w:cs="Times New Roman"/>
+          <w:kern w:val="0"/>
+          <w14:ligatures w14:val="none"/>
+        </w:rPr>
+      </w:pPr>
+    </w:p>
+    <w:p>
+      <w:pPr>
+        <w:spacing w:before="100" w:beforeAutospacing="1" w:after="100" w:afterAutospacing="1" w:line="240" w:lineRule="auto"/>
+        <w:rPr>
+          <w:rFonts w:ascii="Times New Roman" w:eastAsia="Times New Roman" w:hAnsi="Times New Roman" w:cs="Times New Roman"/>
+          <w:kern w:val="0"/>
+          <w14:ligatures w14:val="none"/>
+        </w:rPr>
+      </w:pPr>
+    </w:p>
+    <w:p>
+      <w:pPr>
+        <w:spacing w:before="100" w:beforeAutospacing="1" w:after="100" w:afterAutospacing="1" w:line="240" w:lineRule="auto"/>
+        <w:rPr>
+          <w:rFonts w:ascii="Times New Roman" w:eastAsia="Times New Roman" w:hAnsi="Times New Roman" w:cs="Times New Roman"/>
+          <w:kern w:val="0"/>
+          <w14:ligatures w14:val="none"/>
+        </w:rPr>
+      </w:pPr>
+      <w:r>
+        <w:rPr>
+          <w:rFonts w:ascii="Times New Roman" w:eastAsia="Times New Roman" w:hAnsi="Times New Roman" w:cs="Times New Roman"/>
+          <w:kern w:val="0"/>
+          <w14:ligatures w14:val="none"/>
+        </w:rPr>
+        <w:t>“Include 2D visualizations of the clustering results using matplotlib, and provide an analysis of the purity or composition of each cluster. This analysis will help assess how effectively each method groups images of the same individual.”</w:t>
+      </w:r>
+    </w:p>
+    <w:p>
+      <w:pPr>
+        <w:spacing w:before="100" w:beforeAutospacing="1" w:after="100" w:afterAutospacing="1" w:line="240" w:lineRule="auto"/>
+        <w:rPr>
+          <w:rFonts w:ascii="Times New Roman" w:eastAsia="Times New Roman" w:hAnsi="Times New Roman" w:cs="Times New Roman"/>
+          <w:b/>
+          <w:bCs/>
+          <w:kern w:val="0"/>
+          <w14:ligatures w14:val="none"/>
+        </w:rPr>
+      </w:pPr>
+      <w:r>
+        <w:rPr>
+          <w:rFonts w:ascii="Times New Roman" w:eastAsia="Times New Roman" w:hAnsi="Times New Roman" w:cs="Times New Roman"/>
+          <w:b/>
+          <w:bCs/>
+          <w:kern w:val="0"/>
+          <w14:ligatures w14:val="none"/>
+        </w:rPr>
+        <w:t>2D Matplotlib plots for clustering</w:t>
+      </w:r>
+    </w:p>
+    <w:p>
+      <w:pPr>
+        <w:spacing w:before="100" w:beforeAutospacing="1" w:after="100" w:afterAutospacing="1" w:line="240" w:lineRule="auto"/>
+        <w:rPr>
+          <w:rFonts w:ascii="Times New Roman" w:eastAsia="Times New Roman" w:hAnsi="Times New Roman" w:cs="Times New Roman"/>
+          <w:kern w:val="0"/>
+          <w14:ligatures w14:val="none"/>
+        </w:rPr>
+      </w:pPr>
+      <w:r>
+        <w:rPr>
+          <w:rFonts w:ascii="Times New Roman" w:eastAsia="Times New Roman" w:hAnsi="Times New Roman" w:cs="Times New Roman"/>
+          <w:kern w:val="0"/>
+          <w14:ligatures w14:val="none"/>
+        </w:rPr>
+        <w:drawing>
+          <wp:inline distT="0" distB="0" distL="0" distR="0" wp14:anchorId="30D556EC" wp14:editId="03747188">
+            <wp:extent cx="3976956" cy="3238500"/>
+            <wp:effectExtent l="0" t="0" r="5080" b="0"/>
+            <wp:docPr id="446659155" name="Picture 1" descr="A screen shot of a graph&#10;&#10;AI-generated content may be incorrect."/>
+            <wp:cNvGraphicFramePr>
+              <a:graphicFrameLocks xmlns:a="http://schemas.openxmlformats.org/drawingml/2006/main" noChangeAspect="1"/>
+            </wp:cNvGraphicFramePr>
+            <a:graphic xmlns:a="http://schemas.openxmlformats.org/drawingml/2006/main">
+              <a:graphicData uri="http://schemas.openxmlformats.org/drawingml/2006/picture">
+                <pic:pic xmlns:pic="http://schemas.openxmlformats.org/drawingml/2006/picture">
+                  <pic:nvPicPr>
+                    <pic:cNvPr id="446659155" name="Picture 1" descr="A screen shot of a graph&#10;&#10;AI-generated content may be incorrect."/>
+                    <pic:cNvPicPr/>
+                  </pic:nvPicPr>
+                  <pic:blipFill>
+                    <a:blip r:embed="rId5"/>
+                    <a:stretch>
+                      <a:fillRect/>
+                    </a:stretch>
+                  </pic:blipFill>
+                  <pic:spPr>
+                    <a:xfrm>
+                      <a:off x="0" y="0"/>
+                      <a:ext cx="3986982" cy="3246665"/>
+                    </a:xfrm>
+                    <a:prstGeom prst="rect">
+                      <a:avLst/>
+                    </a:prstGeom>
+                  </pic:spPr>
+                </pic:pic>
+              </a:graphicData>
+            </a:graphic>
+          </wp:inline>
+        </w:drawing>
+      </w:r>
+    </w:p>
+    <w:p>
+      <w:pPr>
+        <w:spacing w:before="100" w:beforeAutospacing="1" w:after="100" w:afterAutospacing="1" w:line="240" w:lineRule="auto"/>
+        <w:rPr>
+          <w:rFonts w:ascii="Times New Roman" w:eastAsia="Times New Roman" w:hAnsi="Times New Roman" w:cs="Times New Roman"/>
+          <w:kern w:val="0"/>
+          <w14:ligatures w14:val="none"/>
+        </w:rPr>
+      </w:pPr>
+    </w:p>
+    <w:p>
+      <w:pPr>
+        <w:spacing w:before="100" w:beforeAutospacing="1" w:after="100" w:afterAutospacing="1" w:line="240" w:lineRule="auto"/>
+        <w:rPr>
+          <w:rFonts w:ascii="Times New Roman" w:eastAsia="Times New Roman" w:hAnsi="Times New Roman" w:cs="Times New Roman"/>
+          <w:kern w:val="0"/>
+          <w14:ligatures w14:val="none"/>
+        </w:rPr>
+      </w:pPr>
+      <w:r>
+        <w:rPr>
+          <w:rFonts w:ascii="Times New Roman" w:eastAsia="Times New Roman" w:hAnsi="Times New Roman" w:cs="Times New Roman"/>
+          <w:kern w:val="0"/>
+          <w14:ligatures w14:val="none"/>
+        </w:rPr>
+        <w:lastRenderedPageBreak/>
+        <w:drawing>
+          <wp:inline distT="0" distB="0" distL="0" distR="0" wp14:anchorId="2534210F" wp14:editId="5BE50E32">
+            <wp:extent cx="3971246" cy="3230880"/>
+            <wp:effectExtent l="0" t="0" r="0" b="7620"/>
+            <wp:docPr id="1257062331" name="Picture 1" descr="A screen shot of a computer screen&#10;&#10;AI-generated content may be incorrect."/>
+            <wp:cNvGraphicFramePr>
+              <a:graphicFrameLocks xmlns:a="http://schemas.openxmlformats.org/drawingml/2006/main" noChangeAspect="1"/>
+            </wp:cNvGraphicFramePr>
+            <a:graphic xmlns:a="http://schemas.openxmlformats.org/drawingml/2006/main">
+              <a:graphicData uri="http://schemas.openxmlformats.org/drawingml/2006/picture">
+                <pic:pic xmlns:pic="http://schemas.openxmlformats.org/drawingml/2006/picture">
+                  <pic:nvPicPr>
+                    <pic:cNvPr id="1257062331" name="Picture 1" descr="A screen shot of a computer screen&#10;&#10;AI-generated content may be incorrect."/>
+                    <pic:cNvPicPr/>
+                  </pic:nvPicPr>
+                  <pic:blipFill>
+                    <a:blip r:embed="rId6"/>
+                    <a:stretch>
+                      <a:fillRect/>
+                    </a:stretch>
+                  </pic:blipFill>
+                  <pic:spPr>
+                    <a:xfrm>
+                      <a:off x="0" y="0"/>
+                      <a:ext cx="3976388" cy="3235063"/>
+                    </a:xfrm>
+                    <a:prstGeom prst="rect">
+                      <a:avLst/>
+                    </a:prstGeom>
+                  </pic:spPr>
+                </pic:pic>
+              </a:graphicData>
+            </a:graphic>
+          </wp:inline>
+        </w:drawing>
+      </w:r>
+    </w:p>
+    <w:p>
+      <w:pPr>
+        <w:spacing w:before="100" w:beforeAutospacing="1" w:after="100" w:afterAutospacing="1" w:line="240" w:lineRule="auto"/>
+        <w:rPr>
+          <w:rFonts w:ascii="Times New Roman" w:eastAsia="Times New Roman" w:hAnsi="Times New Roman" w:cs="Times New Roman"/>
+          <w:kern w:val="0"/>
+          <w14:ligatures w14:val="none"/>
+        </w:rPr>
+      </w:pPr>
+      <w:r>
+        <w:rPr>
+          <w:rFonts w:ascii="Times New Roman" w:eastAsia="Times New Roman" w:hAnsi="Times New Roman" w:cs="Times New Roman"/>
+          <w:kern w:val="0"/>
+          <w14:ligatures w14:val="none"/>
+        </w:rPr>
+        <w:drawing>
+          <wp:inline distT="0" distB="0" distL="0" distR="0" wp14:anchorId="7D5E7485" wp14:editId="2BA902C9">
+            <wp:extent cx="3952443" cy="3192780"/>
+            <wp:effectExtent l="0" t="0" r="0" b="7620"/>
+            <wp:docPr id="1129201278" name="Picture 1" descr="A screen shot of a computer screen&#10;&#10;AI-generated content may be incorrect."/>
+            <wp:cNvGraphicFramePr>
+              <a:graphicFrameLocks xmlns:a="http://schemas.openxmlformats.org/drawingml/2006/main" noChangeAspect="1"/>
+            </wp:cNvGraphicFramePr>
+            <a:graphic xmlns:a="http://schemas.openxmlformats.org/drawingml/2006/main">
+              <a:graphicData uri="http://schemas.openxmlformats.org/drawingml/2006/picture">
+                <pic:pic xmlns:pic="http://schemas.openxmlformats.org/drawingml/2006/picture">
+                  <pic:nvPicPr>
+                    <pic:cNvPr id="1129201278" name="Picture 1" descr="A screen shot of a computer screen&#10;&#10;AI-generated content may be incorrect."/>
+                    <pic:cNvPicPr/>
+                  </pic:nvPicPr>
+                  <pic:blipFill>
+                    <a:blip r:embed="rId7"/>
+                    <a:stretch>
+                      <a:fillRect/>
+                    </a:stretch>
+                  </pic:blipFill>
+                  <pic:spPr>
+                    <a:xfrm>
+                      <a:off x="0" y="0"/>
+                      <a:ext cx="3957058" cy="3196508"/>
+                    </a:xfrm>
+                    <a:prstGeom prst="rect">
+                      <a:avLst/>
+                    </a:prstGeom>
+                  </pic:spPr>
+                </pic:pic>
+              </a:graphicData>
+            </a:graphic>
+          </wp:inline>
+        </w:drawing>
+      </w:r>
+    </w:p>
+    <w:p>
+      <w:pPr>
+        <w:spacing w:before="100" w:beforeAutospacing="1" w:after="100" w:afterAutospacing="1" w:line="240" w:lineRule="auto"/>
+        <w:rPr>
+          <w:rFonts w:ascii="Times New Roman" w:eastAsia="Times New Roman" w:hAnsi="Times New Roman" w:cs="Times New Roman"/>
+          <w:kern w:val="0"/>
+          <w14:ligatures w14:val="none"/>
+        </w:rPr>
+      </w:pPr>
+    </w:p>
+    <w:p>
+      <w:pPr>
+        <w:spacing w:before="100" w:beforeAutospacing="1" w:after="100" w:afterAutospacing="1" w:line="240" w:lineRule="auto"/>
+        <w:rPr>
+          <w:rFonts w:ascii="Times New Roman" w:eastAsia="Times New Roman" w:hAnsi="Times New Roman" w:cs="Times New Roman"/>
+          <w:kern w:val="0"/>
+          <w14:ligatures w14:val="none"/>
+        </w:rPr>
+      </w:pPr>
+    </w:p>
+    <w:p>
+      <w:pPr>
+        <w:spacing w:before="100" w:beforeAutospacing="1" w:after="100" w:afterAutospacing="1" w:line="240" w:lineRule="auto"/>
+        <w:rPr>
+          <w:rFonts w:ascii="Times New Roman" w:eastAsia="Times New Roman" w:hAnsi="Times New Roman" w:cs="Times New Roman"/>
+          <w:kern w:val="0"/>
+          <w14:ligatures w14:val="none"/>
+        </w:rPr>
+      </w:pPr>
+      <w:r>
+        <w:rPr>
+          <w:rFonts w:ascii="Times New Roman" w:eastAsia="Times New Roman" w:hAnsi="Times New Roman" w:cs="Times New Roman"/>
+          <w:kern w:val="0"/>
+          <w14:ligatures w14:val="none"/>
+        </w:rPr>
+        <w:lastRenderedPageBreak/>
+        <w:drawing>
+          <wp:inline distT="0" distB="0" distL="0" distR="0" wp14:anchorId="0DDCA53A" wp14:editId="64BB4B21">
+            <wp:extent cx="4239820" cy="3429000"/>
+            <wp:effectExtent l="0" t="0" r="8890" b="0"/>
+            <wp:docPr id="616860165" name="Picture 1" descr="A screen shot of a computer screen&#10;&#10;AI-generated content may be incorrect."/>
+            <wp:cNvGraphicFramePr>
+              <a:graphicFrameLocks xmlns:a="http://schemas.openxmlformats.org/drawingml/2006/main" noChangeAspect="1"/>
+            </wp:cNvGraphicFramePr>
+            <a:graphic xmlns:a="http://schemas.openxmlformats.org/drawingml/2006/main">
+              <a:graphicData uri="http://schemas.openxmlformats.org/drawingml/2006/picture">
+                <pic:pic xmlns:pic="http://schemas.openxmlformats.org/drawingml/2006/picture">
+                  <pic:nvPicPr>
+                    <pic:cNvPr id="616860165" name="Picture 1" descr="A screen shot of a computer screen&#10;&#10;AI-generated content may be incorrect."/>
+                    <pic:cNvPicPr/>
+                  </pic:nvPicPr>
+                  <pic:blipFill>
+                    <a:blip r:embed="rId8"/>
+                    <a:stretch>
+                      <a:fillRect/>
+                    </a:stretch>
+                  </pic:blipFill>
+                  <pic:spPr>
+                    <a:xfrm>
+                      <a:off x="0" y="0"/>
+                      <a:ext cx="4246906" cy="3434731"/>
+                    </a:xfrm>
+                    <a:prstGeom prst="rect">
+                      <a:avLst/>
+                    </a:prstGeom>
+                  </pic:spPr>
+                </pic:pic>
+              </a:graphicData>
+            </a:graphic>
+          </wp:inline>
+        </w:drawing>
+      </w:r>
+    </w:p>
+    <w:p>
+      <w:pPr>
+        <w:spacing w:before="100" w:beforeAutospacing="1" w:after="100" w:afterAutospacing="1" w:line="240" w:lineRule="auto"/>
+        <w:rPr>
+          <w:rFonts w:ascii="Times New Roman" w:eastAsia="Times New Roman" w:hAnsi="Times New Roman" w:cs="Times New Roman"/>
+          <w:b/>
+          <w:bCs/>
+          <w:kern w:val="0"/>
+          <w14:ligatures w14:val="none"/>
+        </w:rPr>
+      </w:pPr>
+    </w:p>
+    <w:p>
+      <w:pPr>
+        <w:spacing w:before="100" w:beforeAutospacing="1" w:after="100" w:afterAutospacing="1" w:line="240" w:lineRule="auto"/>
+        <w:rPr>
+          <w:rFonts w:ascii="Times New Roman" w:eastAsia="Times New Roman" w:hAnsi="Times New Roman" w:cs="Times New Roman"/>
+          <w:kern w:val="0"/>
+          <w14:ligatures w14:val="none"/>
+        </w:rPr>
+      </w:pPr>
+      <w:r>
+        <w:rPr>
+          <w:rFonts w:ascii="Times New Roman" w:eastAsia="Times New Roman" w:hAnsi="Times New Roman" w:cs="Times New Roman"/>
+          <w:b/>
+          <w:bCs/>
+          <w:kern w:val="0"/>
+          <w14:ligatures w14:val="none"/>
+        </w:rPr>
+        <w:t>4. Cluster Purity and Composition Analysis</w:t>
+      </w:r>
+    </w:p>
+    <w:p>
+      <w:pPr>
+        <w:numPr>
+          <w:ilvl w:val="0"/>
+          <w:numId w:val="17"/>
+        </w:numPr>
+        <w:spacing w:before="100" w:beforeAutospacing="1" w:after="100" w:afterAutospacing="1" w:line="240" w:lineRule="auto"/>
+        <w:rPr>
+          <w:rFonts w:ascii="Times New Roman" w:eastAsia="Times New Roman" w:hAnsi="Times New Roman" w:cs="Times New Roman"/>
+          <w:kern w:val="0"/>
+          <w14:ligatures w14:val="none"/>
+        </w:rPr>
+      </w:pPr>
+      <w:r>
+        <w:rPr>
+          <w:rFonts w:ascii="Times New Roman" w:eastAsia="Times New Roman" w:hAnsi="Times New Roman" w:cs="Times New Roman"/>
+          <w:b/>
+          <w:bCs/>
+          <w:kern w:val="0"/>
+          <w14:ligatures w14:val="none"/>
+        </w:rPr>
+        <w:t>Purity:</w:t>
+      </w:r>
+      <w:r>
+        <w:rPr>
+          <w:rFonts w:ascii="Times New Roman" w:eastAsia="Times New Roman" w:hAnsi="Times New Roman" w:cs="Times New Roman"/>
+          <w:kern w:val="0"/>
+          <w14:ligatures w14:val="none"/>
+        </w:rPr>
+        <w:t> For each cluster, we looked at what fraction of images belonged to the most common person (the “purity”). High purity means the cluster mostly contains images of the same person; low purity means it’s a mix.</w:t>
+      </w:r>
+    </w:p>
+    <w:p>
+      <w:pPr>
+        <w:numPr>
+          <w:ilvl w:val="0"/>
+          <w:numId w:val="17"/>
+        </w:numPr>
+        <w:spacing w:before="100" w:beforeAutospacing="1" w:after="100" w:afterAutospacing="1" w:line="240" w:lineRule="auto"/>
+        <w:rPr>
+          <w:rFonts w:ascii="Times New Roman" w:eastAsia="Times New Roman" w:hAnsi="Times New Roman" w:cs="Times New Roman"/>
+          <w:kern w:val="0"/>
+          <w14:ligatures w14:val="none"/>
+        </w:rPr>
+      </w:pPr>
+      <w:r>
+        <w:rPr>
+          <w:rFonts w:ascii="Times New Roman" w:eastAsia="Times New Roman" w:hAnsi="Times New Roman" w:cs="Times New Roman"/>
+          <w:b/>
+          <w:bCs/>
+          <w:kern w:val="0"/>
+          <w14:ligatures w14:val="none"/>
+        </w:rPr>
+        <w:t>Results:</w:t>
       </w:r>
     </w:p>
     <w:p>
       <w:pPr>
         <w:numPr>
           <w:ilvl w:val="1"/>
-          <w:numId w:val="6"/>
+          <w:numId w:val="17"/>
         </w:numPr>
         <w:spacing w:before="100" w:beforeAutospacing="1" w:after="100" w:afterAutospacing="1" w:line="240" w:lineRule="auto"/>
         <w:rPr>
@@ -1774,24 +2086,14 @@
           <w:kern w:val="0"/>
           <w14:ligatures w14:val="none"/>
         </w:rPr>
-        <w:t xml:space="preserve">Adjusted Rand Index (ARI): </w:t>
-      </w:r>
-      <w:r>
-        <w:rPr>
-          <w:rFonts w:ascii="Times New Roman" w:eastAsia="Times New Roman" w:hAnsi="Times New Roman" w:cs="Times New Roman"/>
-          <w:b/>
-          <w:bCs/>
-          <w:kern w:val="0"/>
-          <w14:ligatures w14:val="none"/>
-        </w:rPr>
-        <w:t>0.3389</w:t>
+        <w:t>Some clusters were very pure (e.g., all images of one person), showing the method worked well for those cases.</w:t>
       </w:r>
     </w:p>
     <w:p>
       <w:pPr>
         <w:numPr>
           <w:ilvl w:val="1"/>
-          <w:numId w:val="6"/>
+          <w:numId w:val="17"/>
         </w:numPr>
         <w:spacing w:before="100" w:beforeAutospacing="1" w:after="100" w:afterAutospacing="1" w:line="240" w:lineRule="auto"/>
         <w:rPr>
@@ -1806,24 +2108,14 @@
           <w:kern w:val="0"/>
           <w14:ligatures w14:val="none"/>
         </w:rPr>
-        <w:t xml:space="preserve">Normalized Mutual Information (NMI): </w:t>
-      </w:r>
-      <w:r>
-        <w:rPr>
-          <w:rFonts w:ascii="Times New Roman" w:eastAsia="Times New Roman" w:hAnsi="Times New Roman" w:cs="Times New Roman"/>
-          <w:b/>
-          <w:bCs/>
-          <w:kern w:val="0"/>
-          <w14:ligatures w14:val="none"/>
-        </w:rPr>
-        <w:t>0.6555</w:t>
+        <w:t>Many clusters were mixed, especially when people had similar poses or lighting, or when the same person appeared in different conditions.</w:t>
       </w:r>
     </w:p>
     <w:p>
       <w:pPr>
         <w:numPr>
           <w:ilvl w:val="1"/>
-          <w:numId w:val="6"/>
+          <w:numId w:val="17"/>
         </w:numPr>
         <w:spacing w:before="100" w:beforeAutospacing="1" w:after="100" w:afterAutospacing="1" w:line="240" w:lineRule="auto"/>
         <w:rPr>
@@ -1835,59 +2127,27 @@
       <w:r>
         <w:rPr>
           <w:rFonts w:ascii="Times New Roman" w:eastAsia="Times New Roman" w:hAnsi="Times New Roman" w:cs="Times New Roman"/>
-          <w:kern w:val="0"/>
-          <w14:ligatures w14:val="none"/>
-        </w:rPr>
-        <w:t xml:space="preserve">Silhouette score: </w:t>
-      </w:r>
-      <w:r>
-        <w:rPr>
-          <w:rFonts w:ascii="Times New Roman" w:eastAsia="Times New Roman" w:hAnsi="Times New Roman" w:cs="Times New Roman"/>
-          <w:b/>
-          <w:bCs/>
-          <w:kern w:val="0"/>
-          <w14:ligatures w14:val="none"/>
-        </w:rPr>
-        <w:t>0.2273</w:t>
-      </w:r>
-    </w:p>
-    <w:p>
-      <w:pPr>
-        <w:numPr>
-          <w:ilvl w:val="1"/>
-          <w:numId w:val="6"/>
-        </w:numPr>
-        <w:spacing w:before="100" w:beforeAutospacing="1" w:after="100" w:afterAutospacing="1" w:line="240" w:lineRule="auto"/>
-        <w:rPr>
-          <w:rFonts w:ascii="Times New Roman" w:eastAsia="Times New Roman" w:hAnsi="Times New Roman" w:cs="Times New Roman"/>
-          <w:kern w:val="0"/>
-          <w14:ligatures w14:val="none"/>
-        </w:rPr>
-      </w:pPr>
-      <w:r>
-        <w:rPr>
-          <w:rFonts w:ascii="Times New Roman" w:eastAsia="Times New Roman" w:hAnsi="Times New Roman" w:cs="Times New Roman"/>
-          <w:kern w:val="0"/>
-          <w14:ligatures w14:val="none"/>
-        </w:rPr>
-        <w:t xml:space="preserve">Cluster purity: </w:t>
-      </w:r>
-      <w:r>
-        <w:rPr>
-          <w:rFonts w:ascii="Times New Roman" w:eastAsia="Times New Roman" w:hAnsi="Times New Roman" w:cs="Times New Roman"/>
-          <w:b/>
-          <w:bCs/>
-          <w:kern w:val="0"/>
-          <w14:ligatures w14:val="none"/>
-        </w:rPr>
-        <w:t>0.5275</w:t>
+          <w:b/>
+          <w:bCs/>
+          <w:kern w:val="0"/>
+          <w14:ligatures w14:val="none"/>
+        </w:rPr>
+        <w:t>Overall purity:</w:t>
+      </w:r>
+      <w:r>
+        <w:rPr>
+          <w:rFonts w:ascii="Times New Roman" w:eastAsia="Times New Roman" w:hAnsi="Times New Roman" w:cs="Times New Roman"/>
+          <w:kern w:val="0"/>
+          <w14:ligatures w14:val="none"/>
+        </w:rPr>
+        <w:t> About 0.29 for training data and 0.18 for test data, for both K-Means and Agglomerative. This means that, on average, less than a third of each cluster is made up of the same person, and it’s even lower on new (test) data.</w:t>
       </w:r>
     </w:p>
     <w:p>
       <w:pPr>
         <w:numPr>
           <w:ilvl w:val="0"/>
-          <w:numId w:val="6"/>
+          <w:numId w:val="17"/>
         </w:numPr>
         <w:spacing w:before="100" w:beforeAutospacing="1" w:after="100" w:afterAutospacing="1" w:line="240" w:lineRule="auto"/>
         <w:rPr>
@@ -1904,164 +2164,42 @@
           <w:kern w:val="0"/>
           <w14:ligatures w14:val="none"/>
         </w:rPr>
-        <w:t>Agglomerative on PCA (</w:t>
-      </w:r>
-      <w:proofErr w:type="spellStart"/>
-      <w:r>
-        <w:rPr>
-          <w:rFonts w:ascii="Times New Roman" w:eastAsia="Times New Roman" w:hAnsi="Times New Roman" w:cs="Times New Roman"/>
-          <w:b/>
-          <w:bCs/>
-          <w:kern w:val="0"/>
-          <w14:ligatures w14:val="none"/>
-        </w:rPr>
-        <w:t>pca</w:t>
-      </w:r>
-      <w:proofErr w:type="spellEnd"/>
-      <w:r>
-        <w:rPr>
-          <w:rFonts w:ascii="Times New Roman" w:eastAsia="Times New Roman" w:hAnsi="Times New Roman" w:cs="Times New Roman"/>
-          <w:b/>
-          <w:bCs/>
-          <w:kern w:val="0"/>
-          <w14:ligatures w14:val="none"/>
-        </w:rPr>
-        <w:t>-Agglomerative)</w:t>
-      </w:r>
-    </w:p>
-    <w:p>
-      <w:pPr>
-        <w:numPr>
-          <w:ilvl w:val="1"/>
-          <w:numId w:val="6"/>
-        </w:numPr>
-        <w:spacing w:before="100" w:beforeAutospacing="1" w:after="100" w:afterAutospacing="1" w:line="240" w:lineRule="auto"/>
-        <w:rPr>
-          <w:rFonts w:ascii="Times New Roman" w:eastAsia="Times New Roman" w:hAnsi="Times New Roman" w:cs="Times New Roman"/>
-          <w:kern w:val="0"/>
-          <w14:ligatures w14:val="none"/>
-        </w:rPr>
-      </w:pPr>
-      <w:r>
-        <w:rPr>
-          <w:rFonts w:ascii="Times New Roman" w:eastAsia="Times New Roman" w:hAnsi="Times New Roman" w:cs="Times New Roman"/>
-          <w:kern w:val="0"/>
-          <w14:ligatures w14:val="none"/>
-        </w:rPr>
-        <w:t xml:space="preserve">ARI: </w:t>
-      </w:r>
-      <w:r>
-        <w:rPr>
-          <w:rFonts w:ascii="Times New Roman" w:eastAsia="Times New Roman" w:hAnsi="Times New Roman" w:cs="Times New Roman"/>
-          <w:b/>
-          <w:bCs/>
-          <w:kern w:val="0"/>
-          <w14:ligatures w14:val="none"/>
-        </w:rPr>
-        <w:t>0.3802</w:t>
-      </w:r>
-    </w:p>
-    <w:p>
-      <w:pPr>
-        <w:numPr>
-          <w:ilvl w:val="1"/>
-          <w:numId w:val="6"/>
-        </w:numPr>
-        <w:spacing w:before="100" w:beforeAutospacing="1" w:after="100" w:afterAutospacing="1" w:line="240" w:lineRule="auto"/>
-        <w:rPr>
-          <w:rFonts w:ascii="Times New Roman" w:eastAsia="Times New Roman" w:hAnsi="Times New Roman" w:cs="Times New Roman"/>
-          <w:kern w:val="0"/>
-          <w14:ligatures w14:val="none"/>
-        </w:rPr>
-      </w:pPr>
-      <w:r>
-        <w:rPr>
-          <w:rFonts w:ascii="Times New Roman" w:eastAsia="Times New Roman" w:hAnsi="Times New Roman" w:cs="Times New Roman"/>
-          <w:kern w:val="0"/>
-          <w14:ligatures w14:val="none"/>
-        </w:rPr>
-        <w:t xml:space="preserve">NMI: </w:t>
-      </w:r>
-      <w:r>
-        <w:rPr>
-          <w:rFonts w:ascii="Times New Roman" w:eastAsia="Times New Roman" w:hAnsi="Times New Roman" w:cs="Times New Roman"/>
-          <w:b/>
-          <w:bCs/>
-          <w:kern w:val="0"/>
-          <w14:ligatures w14:val="none"/>
-        </w:rPr>
-        <w:t>0.7036</w:t>
-      </w:r>
-    </w:p>
-    <w:p>
-      <w:pPr>
-        <w:numPr>
-          <w:ilvl w:val="1"/>
-          <w:numId w:val="6"/>
-        </w:numPr>
-        <w:spacing w:before="100" w:beforeAutospacing="1" w:after="100" w:afterAutospacing="1" w:line="240" w:lineRule="auto"/>
-        <w:rPr>
-          <w:rFonts w:ascii="Times New Roman" w:eastAsia="Times New Roman" w:hAnsi="Times New Roman" w:cs="Times New Roman"/>
-          <w:kern w:val="0"/>
-          <w14:ligatures w14:val="none"/>
-        </w:rPr>
-      </w:pPr>
-      <w:r>
-        <w:rPr>
-          <w:rFonts w:ascii="Times New Roman" w:eastAsia="Times New Roman" w:hAnsi="Times New Roman" w:cs="Times New Roman"/>
-          <w:kern w:val="0"/>
-          <w14:ligatures w14:val="none"/>
-        </w:rPr>
-        <w:t xml:space="preserve">Silhouette score: </w:t>
-      </w:r>
-      <w:r>
-        <w:rPr>
-          <w:rFonts w:ascii="Times New Roman" w:eastAsia="Times New Roman" w:hAnsi="Times New Roman" w:cs="Times New Roman"/>
-          <w:b/>
-          <w:bCs/>
-          <w:kern w:val="0"/>
-          <w14:ligatures w14:val="none"/>
-        </w:rPr>
-        <w:t>0.2373</w:t>
-      </w:r>
-    </w:p>
-    <w:p>
-      <w:pPr>
-        <w:numPr>
-          <w:ilvl w:val="1"/>
-          <w:numId w:val="6"/>
-        </w:numPr>
-        <w:spacing w:before="100" w:beforeAutospacing="1" w:after="100" w:afterAutospacing="1" w:line="240" w:lineRule="auto"/>
-        <w:rPr>
-          <w:rFonts w:ascii="Times New Roman" w:eastAsia="Times New Roman" w:hAnsi="Times New Roman" w:cs="Times New Roman"/>
-          <w:kern w:val="0"/>
-          <w14:ligatures w14:val="none"/>
-        </w:rPr>
-      </w:pPr>
-      <w:r>
-        <w:rPr>
-          <w:rFonts w:ascii="Times New Roman" w:eastAsia="Times New Roman" w:hAnsi="Times New Roman" w:cs="Times New Roman"/>
-          <w:kern w:val="0"/>
-          <w14:ligatures w14:val="none"/>
-        </w:rPr>
-        <w:t xml:space="preserve">Cluster purity: </w:t>
-      </w:r>
-      <w:r>
-        <w:rPr>
-          <w:rFonts w:ascii="Times New Roman" w:eastAsia="Times New Roman" w:hAnsi="Times New Roman" w:cs="Times New Roman"/>
-          <w:b/>
-          <w:bCs/>
-          <w:kern w:val="0"/>
-          <w14:ligatures w14:val="none"/>
-        </w:rPr>
-        <w:t>0.5478</w:t>
+        <w:t>What this tells us:</w:t>
+      </w:r>
+      <w:r>
+        <w:rPr>
+          <w:rFonts w:ascii="Times New Roman" w:eastAsia="Times New Roman" w:hAnsi="Times New Roman" w:cs="Times New Roman"/>
+          <w:kern w:val="0"/>
+          <w14:ligatures w14:val="none"/>
+        </w:rPr>
+        <w:t> The clustering methods could group some people well, but often mixed up identities, especially when pose or lighting changed. Agglomerative did a little better than K-Means, and using autoencoder features helped a bit, but not dramatically.</w:t>
+      </w:r>
+    </w:p>
+    <w:p>
+      <w:pPr>
+        <w:spacing w:before="100" w:beforeAutospacing="1" w:after="100" w:afterAutospacing="1" w:line="240" w:lineRule="auto"/>
+        <w:rPr>
+          <w:rFonts w:ascii="Times New Roman" w:eastAsia="Times New Roman" w:hAnsi="Times New Roman" w:cs="Times New Roman"/>
+          <w:kern w:val="0"/>
+          <w14:ligatures w14:val="none"/>
+        </w:rPr>
+      </w:pPr>
+      <w:r>
+        <w:rPr>
+          <w:rFonts w:ascii="Times New Roman" w:eastAsia="Times New Roman" w:hAnsi="Times New Roman" w:cs="Times New Roman"/>
+          <w:b/>
+          <w:bCs/>
+          <w:kern w:val="0"/>
+          <w14:ligatures w14:val="none"/>
+        </w:rPr>
+        <w:t>Summary</w:t>
       </w:r>
     </w:p>
     <w:p>
       <w:pPr>
         <w:numPr>
           <w:ilvl w:val="0"/>
-          <w:numId w:val="6"/>
+          <w:numId w:val="18"/>
         </w:numPr>
         <w:spacing w:before="100" w:beforeAutospacing="1" w:after="100" w:afterAutospacing="1" w:line="240" w:lineRule="auto"/>
         <w:rPr>
@@ -2073,269 +2211,17 @@
       <w:r>
         <w:rPr>
           <w:rFonts w:ascii="Times New Roman" w:eastAsia="Times New Roman" w:hAnsi="Times New Roman" w:cs="Times New Roman"/>
-          <w:b/>
-          <w:bCs/>
-          <w:kern w:val="0"/>
-          <w14:ligatures w14:val="none"/>
-        </w:rPr>
-        <w:t>K-Means on AE latent codes (AE-</w:t>
-      </w:r>
-      <w:proofErr w:type="spellStart"/>
-      <w:r>
-        <w:rPr>
-          <w:rFonts w:ascii="Times New Roman" w:eastAsia="Times New Roman" w:hAnsi="Times New Roman" w:cs="Times New Roman"/>
-          <w:b/>
-          <w:bCs/>
-          <w:kern w:val="0"/>
-          <w14:ligatures w14:val="none"/>
-        </w:rPr>
-        <w:t>KMeans</w:t>
-      </w:r>
-      <w:proofErr w:type="spellEnd"/>
-      <w:r>
-        <w:rPr>
-          <w:rFonts w:ascii="Times New Roman" w:eastAsia="Times New Roman" w:hAnsi="Times New Roman" w:cs="Times New Roman"/>
-          <w:b/>
-          <w:bCs/>
-          <w:kern w:val="0"/>
-          <w14:ligatures w14:val="none"/>
-        </w:rPr>
-        <w:t>, optional)</w:t>
-      </w:r>
-    </w:p>
-    <w:p>
-      <w:pPr>
-        <w:numPr>
-          <w:ilvl w:val="1"/>
-          <w:numId w:val="6"/>
-        </w:numPr>
-        <w:spacing w:before="100" w:beforeAutospacing="1" w:after="100" w:afterAutospacing="1" w:line="240" w:lineRule="auto"/>
-        <w:rPr>
-          <w:rFonts w:ascii="Times New Roman" w:eastAsia="Times New Roman" w:hAnsi="Times New Roman" w:cs="Times New Roman"/>
-          <w:kern w:val="0"/>
-          <w14:ligatures w14:val="none"/>
-        </w:rPr>
-      </w:pPr>
-      <w:r>
-        <w:rPr>
-          <w:rFonts w:ascii="Times New Roman" w:eastAsia="Times New Roman" w:hAnsi="Times New Roman" w:cs="Times New Roman"/>
-          <w:kern w:val="0"/>
-          <w14:ligatures w14:val="none"/>
-        </w:rPr>
-        <w:t xml:space="preserve">ARI: </w:t>
-      </w:r>
-      <w:r>
-        <w:rPr>
-          <w:rFonts w:ascii="Times New Roman" w:eastAsia="Times New Roman" w:hAnsi="Times New Roman" w:cs="Times New Roman"/>
-          <w:b/>
-          <w:bCs/>
-          <w:kern w:val="0"/>
-          <w14:ligatures w14:val="none"/>
-        </w:rPr>
-        <w:t>0.3633</w:t>
-      </w:r>
-    </w:p>
-    <w:p>
-      <w:pPr>
-        <w:numPr>
-          <w:ilvl w:val="1"/>
-          <w:numId w:val="6"/>
-        </w:numPr>
-        <w:spacing w:before="100" w:beforeAutospacing="1" w:after="100" w:afterAutospacing="1" w:line="240" w:lineRule="auto"/>
-        <w:rPr>
-          <w:rFonts w:ascii="Times New Roman" w:eastAsia="Times New Roman" w:hAnsi="Times New Roman" w:cs="Times New Roman"/>
-          <w:kern w:val="0"/>
-          <w14:ligatures w14:val="none"/>
-        </w:rPr>
-      </w:pPr>
-      <w:r>
-        <w:rPr>
-          <w:rFonts w:ascii="Times New Roman" w:eastAsia="Times New Roman" w:hAnsi="Times New Roman" w:cs="Times New Roman"/>
-          <w:kern w:val="0"/>
-          <w14:ligatures w14:val="none"/>
-        </w:rPr>
-        <w:t xml:space="preserve">NMI: </w:t>
-      </w:r>
-      <w:r>
-        <w:rPr>
-          <w:rFonts w:ascii="Times New Roman" w:eastAsia="Times New Roman" w:hAnsi="Times New Roman" w:cs="Times New Roman"/>
-          <w:b/>
-          <w:bCs/>
-          <w:kern w:val="0"/>
-          <w14:ligatures w14:val="none"/>
-        </w:rPr>
-        <w:t>0.6630</w:t>
-      </w:r>
-    </w:p>
-    <w:p>
-      <w:pPr>
-        <w:numPr>
-          <w:ilvl w:val="1"/>
-          <w:numId w:val="6"/>
-        </w:numPr>
-        <w:spacing w:before="100" w:beforeAutospacing="1" w:after="100" w:afterAutospacing="1" w:line="240" w:lineRule="auto"/>
-        <w:rPr>
-          <w:rFonts w:ascii="Times New Roman" w:eastAsia="Times New Roman" w:hAnsi="Times New Roman" w:cs="Times New Roman"/>
-          <w:kern w:val="0"/>
-          <w14:ligatures w14:val="none"/>
-        </w:rPr>
-      </w:pPr>
-      <w:r>
-        <w:rPr>
-          <w:rFonts w:ascii="Times New Roman" w:eastAsia="Times New Roman" w:hAnsi="Times New Roman" w:cs="Times New Roman"/>
-          <w:kern w:val="0"/>
-          <w14:ligatures w14:val="none"/>
-        </w:rPr>
-        <w:t xml:space="preserve">Silhouette score: </w:t>
-      </w:r>
-      <w:r>
-        <w:rPr>
-          <w:rFonts w:ascii="Times New Roman" w:eastAsia="Times New Roman" w:hAnsi="Times New Roman" w:cs="Times New Roman"/>
-          <w:b/>
-          <w:bCs/>
-          <w:kern w:val="0"/>
-          <w14:ligatures w14:val="none"/>
-        </w:rPr>
-        <w:t>0.2515</w:t>
-      </w:r>
-    </w:p>
-    <w:p>
-      <w:pPr>
-        <w:numPr>
-          <w:ilvl w:val="1"/>
-          <w:numId w:val="6"/>
-        </w:numPr>
-        <w:spacing w:before="100" w:beforeAutospacing="1" w:after="100" w:afterAutospacing="1" w:line="240" w:lineRule="auto"/>
-        <w:rPr>
-          <w:rFonts w:ascii="Times New Roman" w:eastAsia="Times New Roman" w:hAnsi="Times New Roman" w:cs="Times New Roman"/>
-          <w:kern w:val="0"/>
-          <w14:ligatures w14:val="none"/>
-        </w:rPr>
-      </w:pPr>
-      <w:r>
-        <w:rPr>
-          <w:rFonts w:ascii="Times New Roman" w:eastAsia="Times New Roman" w:hAnsi="Times New Roman" w:cs="Times New Roman"/>
-          <w:kern w:val="0"/>
-          <w14:ligatures w14:val="none"/>
-        </w:rPr>
-        <w:t xml:space="preserve">Cluster purity: </w:t>
-      </w:r>
-      <w:r>
-        <w:rPr>
-          <w:rFonts w:ascii="Times New Roman" w:eastAsia="Times New Roman" w:hAnsi="Times New Roman" w:cs="Times New Roman"/>
-          <w:b/>
-          <w:bCs/>
-          <w:kern w:val="0"/>
-          <w14:ligatures w14:val="none"/>
-        </w:rPr>
-        <w:t>0.5362</w:t>
-      </w:r>
-    </w:p>
-    <w:p>
-      <w:pPr>
-        <w:spacing w:before="100" w:beforeAutospacing="1" w:after="100" w:afterAutospacing="1" w:line="240" w:lineRule="auto"/>
-        <w:rPr>
-          <w:rFonts w:ascii="Times New Roman" w:eastAsia="Times New Roman" w:hAnsi="Times New Roman" w:cs="Times New Roman"/>
-          <w:kern w:val="0"/>
-          <w14:ligatures w14:val="none"/>
-        </w:rPr>
-      </w:pPr>
-      <w:r>
-        <w:rPr>
-          <w:rFonts w:ascii="Times New Roman" w:eastAsia="Times New Roman" w:hAnsi="Times New Roman" w:cs="Times New Roman"/>
-          <w:kern w:val="0"/>
-          <w14:ligatures w14:val="none"/>
-        </w:rPr>
-        <w:t xml:space="preserve">Across these metrics, </w:t>
-      </w:r>
-      <w:r>
-        <w:rPr>
-          <w:rFonts w:ascii="Times New Roman" w:eastAsia="Times New Roman" w:hAnsi="Times New Roman" w:cs="Times New Roman"/>
-          <w:b/>
-          <w:bCs/>
-          <w:kern w:val="0"/>
-          <w14:ligatures w14:val="none"/>
-        </w:rPr>
-        <w:t>Agglomerative clustering on PCA features</w:t>
-      </w:r>
-      <w:r>
-        <w:rPr>
-          <w:rFonts w:ascii="Times New Roman" w:eastAsia="Times New Roman" w:hAnsi="Times New Roman" w:cs="Times New Roman"/>
-          <w:kern w:val="0"/>
-          <w14:ligatures w14:val="none"/>
-        </w:rPr>
-        <w:t xml:space="preserve"> performs slightly better than K-Means, indicating that hierarchical merging with Ward linkage can model the data structure more accurately.</w:t>
-      </w:r>
-    </w:p>
-    <w:p>
-      <w:pPr>
-        <w:spacing w:before="100" w:beforeAutospacing="1" w:after="100" w:afterAutospacing="1" w:line="240" w:lineRule="auto"/>
-        <w:outlineLvl w:val="2"/>
-        <w:rPr>
-          <w:rFonts w:ascii="Times New Roman" w:eastAsia="Times New Roman" w:hAnsi="Times New Roman" w:cs="Times New Roman"/>
-          <w:b/>
-          <w:bCs/>
-          <w:kern w:val="0"/>
-          <w:sz w:val="27"/>
-          <w:szCs w:val="27"/>
-          <w14:ligatures w14:val="none"/>
-        </w:rPr>
-      </w:pPr>
-      <w:r>
-        <w:rPr>
-          <w:rFonts w:ascii="Times New Roman" w:eastAsia="Times New Roman" w:hAnsi="Times New Roman" w:cs="Times New Roman"/>
-          <w:b/>
-          <w:bCs/>
-          <w:kern w:val="0"/>
-          <w:sz w:val="27"/>
-          <w:szCs w:val="27"/>
-          <w14:ligatures w14:val="none"/>
-        </w:rPr>
-        <w:t>4.3 2D visualization and cluster composition</w:t>
-      </w:r>
-    </w:p>
-    <w:p>
-      <w:pPr>
-        <w:spacing w:before="100" w:beforeAutospacing="1" w:after="100" w:afterAutospacing="1" w:line="240" w:lineRule="auto"/>
-        <w:rPr>
-          <w:rFonts w:ascii="Times New Roman" w:eastAsia="Times New Roman" w:hAnsi="Times New Roman" w:cs="Times New Roman"/>
-          <w:kern w:val="0"/>
-          <w14:ligatures w14:val="none"/>
-        </w:rPr>
-      </w:pPr>
-      <w:r>
-        <w:rPr>
-          <w:rFonts w:ascii="Times New Roman" w:eastAsia="Times New Roman" w:hAnsi="Times New Roman" w:cs="Times New Roman"/>
-          <w:kern w:val="0"/>
-          <w14:ligatures w14:val="none"/>
-        </w:rPr>
-        <w:lastRenderedPageBreak/>
-        <w:t xml:space="preserve">We projected the 50-dim PCA features down to </w:t>
-      </w:r>
-      <w:r>
-        <w:rPr>
-          <w:rFonts w:ascii="Times New Roman" w:eastAsia="Times New Roman" w:hAnsi="Times New Roman" w:cs="Times New Roman"/>
-          <w:b/>
-          <w:bCs/>
-          <w:kern w:val="0"/>
-          <w14:ligatures w14:val="none"/>
-        </w:rPr>
-        <w:t>2 principal components</w:t>
-      </w:r>
-      <w:r>
-        <w:rPr>
-          <w:rFonts w:ascii="Times New Roman" w:eastAsia="Times New Roman" w:hAnsi="Times New Roman" w:cs="Times New Roman"/>
-          <w:kern w:val="0"/>
-          <w14:ligatures w14:val="none"/>
-        </w:rPr>
-        <w:t xml:space="preserve"> and colored points by cluster ID to visualize the clustering structure:</w:t>
+          <w:kern w:val="0"/>
+          <w14:ligatures w14:val="none"/>
+        </w:rPr>
+        <w:t>Clustering faces by identity is hard because of pose and lighting changes.</w:t>
       </w:r>
     </w:p>
     <w:p>
       <w:pPr>
         <w:numPr>
           <w:ilvl w:val="0"/>
-          <w:numId w:val="7"/>
+          <w:numId w:val="18"/>
         </w:numPr>
         <w:spacing w:before="100" w:beforeAutospacing="1" w:after="100" w:afterAutospacing="1" w:line="240" w:lineRule="auto"/>
         <w:rPr>
@@ -2347,27 +2233,17 @@
       <w:r>
         <w:rPr>
           <w:rFonts w:ascii="Times New Roman" w:eastAsia="Times New Roman" w:hAnsi="Times New Roman" w:cs="Times New Roman"/>
-          <w:b/>
-          <w:bCs/>
-          <w:kern w:val="0"/>
-          <w14:ligatures w14:val="none"/>
-        </w:rPr>
-        <w:t>Figure pca_kmeans_scatter.png</w:t>
-      </w:r>
-      <w:r>
-        <w:rPr>
-          <w:rFonts w:ascii="Times New Roman" w:eastAsia="Times New Roman" w:hAnsi="Times New Roman" w:cs="Times New Roman"/>
-          <w:kern w:val="0"/>
-          <w14:ligatures w14:val="none"/>
-        </w:rPr>
-        <w:t>: PCA(2D) with K-Means clusters</w:t>
+          <w:kern w:val="0"/>
+          <w14:ligatures w14:val="none"/>
+        </w:rPr>
+        <w:t>Dimensionality reduction (PCA, autoencoder) helps, but doesn’t solve everything.</w:t>
       </w:r>
     </w:p>
     <w:p>
       <w:pPr>
         <w:numPr>
           <w:ilvl w:val="0"/>
-          <w:numId w:val="7"/>
+          <w:numId w:val="18"/>
         </w:numPr>
         <w:spacing w:before="100" w:beforeAutospacing="1" w:after="100" w:afterAutospacing="1" w:line="240" w:lineRule="auto"/>
         <w:rPr>
@@ -2379,38 +2255,33 @@
       <w:r>
         <w:rPr>
           <w:rFonts w:ascii="Times New Roman" w:eastAsia="Times New Roman" w:hAnsi="Times New Roman" w:cs="Times New Roman"/>
-          <w:b/>
-          <w:bCs/>
-          <w:kern w:val="0"/>
-          <w14:ligatures w14:val="none"/>
-        </w:rPr>
-        <w:t>Figure pca_agg_scatter.png</w:t>
-      </w:r>
-      <w:r>
-        <w:rPr>
-          <w:rFonts w:ascii="Times New Roman" w:eastAsia="Times New Roman" w:hAnsi="Times New Roman" w:cs="Times New Roman"/>
-          <w:kern w:val="0"/>
-          <w14:ligatures w14:val="none"/>
-        </w:rPr>
-        <w:t>: PCA(2D) with Agglomerative clusters</w:t>
-      </w:r>
-    </w:p>
-    <w:p>
-      <w:pPr>
-        <w:spacing w:before="100" w:beforeAutospacing="1" w:after="100" w:afterAutospacing="1" w:line="240" w:lineRule="auto"/>
-        <w:rPr>
-          <w:rFonts w:ascii="Times New Roman" w:eastAsia="Times New Roman" w:hAnsi="Times New Roman" w:cs="Times New Roman"/>
-          <w:kern w:val="0"/>
-          <w14:ligatures w14:val="none"/>
-        </w:rPr>
-      </w:pPr>
-      <w:r>
-        <w:rPr>
-          <w:rFonts w:ascii="Times New Roman" w:eastAsia="Times New Roman" w:hAnsi="Times New Roman" w:cs="Times New Roman"/>
-          <w:kern w:val="0"/>
-          <w14:ligatures w14:val="none"/>
-        </w:rPr>
-        <w:t>The plots reveal that images of the same person tend to form local neighborhoods, but there is still noticeable overlap between nearby clusters, especially for faces with similar pose or lighting.</w:t>
+          <w:kern w:val="0"/>
+          <w14:ligatures w14:val="none"/>
+        </w:rPr>
+        <w:t>Some clusters are pure, but many are mixed, so there’s room for improvement.</w:t>
+      </w:r>
+    </w:p>
+    <w:p>
+      <w:pPr>
+        <w:numPr>
+          <w:ilvl w:val="0"/>
+          <w:numId w:val="18"/>
+        </w:numPr>
+        <w:spacing w:before="100" w:beforeAutospacing="1" w:after="100" w:afterAutospacing="1" w:line="240" w:lineRule="auto"/>
+        <w:rPr>
+          <w:rFonts w:ascii="Times New Roman" w:eastAsia="Times New Roman" w:hAnsi="Times New Roman" w:cs="Times New Roman"/>
+          <w:kern w:val="0"/>
+          <w14:ligatures w14:val="none"/>
+        </w:rPr>
+      </w:pPr>
+      <w:r>
+        <w:rPr>
+          <w:rFonts w:ascii="Times New Roman" w:eastAsia="Times New Roman" w:hAnsi="Times New Roman" w:cs="Times New Roman"/>
+          <w:kern w:val="0"/>
+          <w14:ligatures w14:val="none"/>
+        </w:rPr>
+        <w:lastRenderedPageBreak/>
+        <w:t>Our analysis of cluster purity shows that while the methods can sometimes group the same person together, they often mix up different people, especially in challenging conditions.</w:t>
       </w:r>
     </w:p>
     <w:p>
@@ -2517,18 +2388,8 @@
           <w:kern w:val="0"/>
           <w14:ligatures w14:val="none"/>
         </w:rPr>
-        <w:t xml:space="preserve">Hidden layer 1: 128 units, </w:t>
-      </w:r>
-      <w:proofErr w:type="spellStart"/>
-      <w:r>
-        <w:rPr>
-          <w:rFonts w:ascii="Times New Roman" w:eastAsia="Times New Roman" w:hAnsi="Times New Roman" w:cs="Times New Roman"/>
-          <w:kern w:val="0"/>
-          <w14:ligatures w14:val="none"/>
-        </w:rPr>
-        <w:t>ReLU</w:t>
-      </w:r>
-      <w:proofErr w:type="spellEnd"/>
+        <w:t>Hidden layer 1: 128 units, ReLU</w:t>
+      </w:r>
     </w:p>
     <w:p>
       <w:pPr>
@@ -2549,18 +2410,8 @@
           <w:kern w:val="0"/>
           <w14:ligatures w14:val="none"/>
         </w:rPr>
-        <w:t xml:space="preserve">Hidden layer 2: 64 units, </w:t>
-      </w:r>
-      <w:proofErr w:type="spellStart"/>
-      <w:r>
-        <w:rPr>
-          <w:rFonts w:ascii="Times New Roman" w:eastAsia="Times New Roman" w:hAnsi="Times New Roman" w:cs="Times New Roman"/>
-          <w:kern w:val="0"/>
-          <w14:ligatures w14:val="none"/>
-        </w:rPr>
-        <w:t>ReLU</w:t>
-      </w:r>
-      <w:proofErr w:type="spellEnd"/>
+        <w:t>Hidden layer 2: 64 units, ReLU</w:t>
+      </w:r>
     </w:p>
     <w:p>
       <w:pPr>
@@ -2581,25 +2432,7 @@
           <w:kern w:val="0"/>
           <w14:ligatures w14:val="none"/>
         </w:rPr>
-        <w:t xml:space="preserve">Output layer: 20 units, </w:t>
-      </w:r>
-      <w:proofErr w:type="spellStart"/>
-      <w:r>
-        <w:rPr>
-          <w:rFonts w:ascii="Times New Roman" w:eastAsia="Times New Roman" w:hAnsi="Times New Roman" w:cs="Times New Roman"/>
-          <w:kern w:val="0"/>
-          <w14:ligatures w14:val="none"/>
-        </w:rPr>
-        <w:t>softmax</w:t>
-      </w:r>
-      <w:proofErr w:type="spellEnd"/>
-      <w:r>
-        <w:rPr>
-          <w:rFonts w:ascii="Times New Roman" w:eastAsia="Times New Roman" w:hAnsi="Times New Roman" w:cs="Times New Roman"/>
-          <w:kern w:val="0"/>
-          <w14:ligatures w14:val="none"/>
-        </w:rPr>
-        <w:t xml:space="preserve"> (one class per person)</w:t>
+        <w:t>Output layer: 20 units, softmax (one class per person)</w:t>
       </w:r>
     </w:p>
     <w:p>
@@ -3107,6 +2940,7 @@
           <w:kern w:val="0"/>
           <w14:ligatures w14:val="none"/>
         </w:rPr>
+        <w:lastRenderedPageBreak/>
         <w:t>A few classes (e.g., IDs 1, 3, 10, 14, 15) have slightly lower recall or precision due to occasional confusion with visually similar individuals.</w:t>
       </w:r>
     </w:p>
@@ -3153,25 +2987,7 @@
           <w:kern w:val="0"/>
           <w14:ligatures w14:val="none"/>
         </w:rPr>
-        <w:t xml:space="preserve">, which visually confirms that </w:t>
-      </w:r>
-      <w:proofErr w:type="gramStart"/>
-      <w:r>
-        <w:rPr>
-          <w:rFonts w:ascii="Times New Roman" w:eastAsia="Times New Roman" w:hAnsi="Times New Roman" w:cs="Times New Roman"/>
-          <w:kern w:val="0"/>
-          <w14:ligatures w14:val="none"/>
-        </w:rPr>
-        <w:t>the majority of</w:t>
-      </w:r>
-      <w:proofErr w:type="gramEnd"/>
-      <w:r>
-        <w:rPr>
-          <w:rFonts w:ascii="Times New Roman" w:eastAsia="Times New Roman" w:hAnsi="Times New Roman" w:cs="Times New Roman"/>
-          <w:kern w:val="0"/>
-          <w14:ligatures w14:val="none"/>
-        </w:rPr>
-        <w:t xml:space="preserve"> faces are correctly classified.</w:t>
+        <w:t>, which visually confirms that the majority of faces are correctly classified.</w:t>
       </w:r>
     </w:p>
     <w:p>
@@ -3451,13 +3267,7 @@
         <w:t>.</w:t>
       </w:r>
     </w:p>
-    <w:p>
-      <w:pPr>
-        <w:rPr>
-          <w:rFonts w:hint="eastAsia"/>
-        </w:rPr>
-      </w:pPr>
-    </w:p>
+    <w:p/>
     <w:sectPr>
       <w:pgSz w:w="12240" w:h="15840"/>
       <w:pgMar w:top="1440" w:right="1440" w:bottom="1440" w:left="1440" w:header="708" w:footer="708" w:gutter="0"/>
@@ -3620,6 +3430,155 @@
     </w:lvl>
   </w:abstractNum>
   <w:abstractNum w:abstractNumId="1" w15:restartNumberingAfterBreak="0">
+    <w:nsid w:val="080A15B9"/>
+    <w:multiLevelType w:val="multilevel"/>
+    <w:tmpl w:val="1A9424EA"/>
+    <w:lvl w:ilvl="0">
+      <w:start w:val="1"/>
+      <w:numFmt w:val="bullet"/>
+      <w:lvlText w:val=""/>
+      <w:lvlJc w:val="left"/>
+      <w:pPr>
+        <w:tabs>
+          <w:tab w:val="num" w:pos="720"/>
+        </w:tabs>
+        <w:ind w:left="720" w:hanging="360"/>
+      </w:pPr>
+      <w:rPr>
+        <w:rFonts w:ascii="Symbol" w:hAnsi="Symbol" w:hint="default"/>
+        <w:sz w:val="20"/>
+      </w:rPr>
+    </w:lvl>
+    <w:lvl w:ilvl="1" w:tentative="1">
+      <w:start w:val="1"/>
+      <w:numFmt w:val="bullet"/>
+      <w:lvlText w:val="o"/>
+      <w:lvlJc w:val="left"/>
+      <w:pPr>
+        <w:tabs>
+          <w:tab w:val="num" w:pos="1440"/>
+        </w:tabs>
+        <w:ind w:left="1440" w:hanging="360"/>
+      </w:pPr>
+      <w:rPr>
+        <w:rFonts w:ascii="Courier New" w:hAnsi="Courier New" w:hint="default"/>
+        <w:sz w:val="20"/>
+      </w:rPr>
+    </w:lvl>
+    <w:lvl w:ilvl="2" w:tentative="1">
+      <w:start w:val="1"/>
+      <w:numFmt w:val="bullet"/>
+      <w:lvlText w:val=""/>
+      <w:lvlJc w:val="left"/>
+      <w:pPr>
+        <w:tabs>
+          <w:tab w:val="num" w:pos="2160"/>
+        </w:tabs>
+        <w:ind w:left="2160" w:hanging="360"/>
+      </w:pPr>
+      <w:rPr>
+        <w:rFonts w:ascii="Wingdings" w:hAnsi="Wingdings" w:hint="default"/>
+        <w:sz w:val="20"/>
+      </w:rPr>
+    </w:lvl>
+    <w:lvl w:ilvl="3" w:tentative="1">
+      <w:start w:val="1"/>
+      <w:numFmt w:val="bullet"/>
+      <w:lvlText w:val=""/>
+      <w:lvlJc w:val="left"/>
+      <w:pPr>
+        <w:tabs>
+          <w:tab w:val="num" w:pos="2880"/>
+        </w:tabs>
+        <w:ind w:left="2880" w:hanging="360"/>
+      </w:pPr>
+      <w:rPr>
+        <w:rFonts w:ascii="Wingdings" w:hAnsi="Wingdings" w:hint="default"/>
+        <w:sz w:val="20"/>
+      </w:rPr>
+    </w:lvl>
+    <w:lvl w:ilvl="4" w:tentative="1">
+      <w:start w:val="1"/>
+      <w:numFmt w:val="bullet"/>
+      <w:lvlText w:val=""/>
+      <w:lvlJc w:val="left"/>
+      <w:pPr>
+        <w:tabs>
+          <w:tab w:val="num" w:pos="3600"/>
+        </w:tabs>
+        <w:ind w:left="3600" w:hanging="360"/>
+      </w:pPr>
+      <w:rPr>
+        <w:rFonts w:ascii="Wingdings" w:hAnsi="Wingdings" w:hint="default"/>
+        <w:sz w:val="20"/>
+      </w:rPr>
+    </w:lvl>
+    <w:lvl w:ilvl="5" w:tentative="1">
+      <w:start w:val="1"/>
+      <w:numFmt w:val="bullet"/>
+      <w:lvlText w:val=""/>
+      <w:lvlJc w:val="left"/>
+      <w:pPr>
+        <w:tabs>
+          <w:tab w:val="num" w:pos="4320"/>
+        </w:tabs>
+        <w:ind w:left="4320" w:hanging="360"/>
+      </w:pPr>
+      <w:rPr>
+        <w:rFonts w:ascii="Wingdings" w:hAnsi="Wingdings" w:hint="default"/>
+        <w:sz w:val="20"/>
+      </w:rPr>
+    </w:lvl>
+    <w:lvl w:ilvl="6" w:tentative="1">
+      <w:start w:val="1"/>
+      <w:numFmt w:val="bullet"/>
+      <w:lvlText w:val=""/>
+      <w:lvlJc w:val="left"/>
+      <w:pPr>
+        <w:tabs>
+          <w:tab w:val="num" w:pos="5040"/>
+        </w:tabs>
+        <w:ind w:left="5040" w:hanging="360"/>
+      </w:pPr>
+      <w:rPr>
+        <w:rFonts w:ascii="Wingdings" w:hAnsi="Wingdings" w:hint="default"/>
+        <w:sz w:val="20"/>
+      </w:rPr>
+    </w:lvl>
+    <w:lvl w:ilvl="7" w:tentative="1">
+      <w:start w:val="1"/>
+      <w:numFmt w:val="bullet"/>
+      <w:lvlText w:val=""/>
+      <w:lvlJc w:val="left"/>
+      <w:pPr>
+        <w:tabs>
+          <w:tab w:val="num" w:pos="5760"/>
+        </w:tabs>
+        <w:ind w:left="5760" w:hanging="360"/>
+      </w:pPr>
+      <w:rPr>
+        <w:rFonts w:ascii="Wingdings" w:hAnsi="Wingdings" w:hint="default"/>
+        <w:sz w:val="20"/>
+      </w:rPr>
+    </w:lvl>
+    <w:lvl w:ilvl="8" w:tentative="1">
+      <w:start w:val="1"/>
+      <w:numFmt w:val="bullet"/>
+      <w:lvlText w:val=""/>
+      <w:lvlJc w:val="left"/>
+      <w:pPr>
+        <w:tabs>
+          <w:tab w:val="num" w:pos="6480"/>
+        </w:tabs>
+        <w:ind w:left="6480" w:hanging="360"/>
+      </w:pPr>
+      <w:rPr>
+        <w:rFonts w:ascii="Wingdings" w:hAnsi="Wingdings" w:hint="default"/>
+        <w:sz w:val="20"/>
+      </w:rPr>
+    </w:lvl>
+  </w:abstractNum>
+  <w:abstractNum w:abstractNumId="2" w15:restartNumberingAfterBreak="0">
     <w:nsid w:val="0D413433"/>
     <w:multiLevelType w:val="multilevel"/>
     <w:tmpl w:val="6DE8FA4A"/>
@@ -3768,7 +3727,7 @@
       </w:rPr>
     </w:lvl>
   </w:abstractNum>
-  <w:abstractNum w:abstractNumId="2" w15:restartNumberingAfterBreak="0">
+  <w:abstractNum w:abstractNumId="3" w15:restartNumberingAfterBreak="0">
     <w:nsid w:val="10C5121A"/>
     <w:multiLevelType w:val="multilevel"/>
     <w:tmpl w:val="46386A26"/>
@@ -3917,7 +3876,7 @@
       </w:rPr>
     </w:lvl>
   </w:abstractNum>
-  <w:abstractNum w:abstractNumId="3" w15:restartNumberingAfterBreak="0">
+  <w:abstractNum w:abstractNumId="4" w15:restartNumberingAfterBreak="0">
     <w:nsid w:val="16695EE9"/>
     <w:multiLevelType w:val="multilevel"/>
     <w:tmpl w:val="CA4EB9C6"/>
@@ -4066,7 +4025,7 @@
       </w:rPr>
     </w:lvl>
   </w:abstractNum>
-  <w:abstractNum w:abstractNumId="4" w15:restartNumberingAfterBreak="0">
+  <w:abstractNum w:abstractNumId="5" w15:restartNumberingAfterBreak="0">
     <w:nsid w:val="1BE312F1"/>
     <w:multiLevelType w:val="multilevel"/>
     <w:tmpl w:val="9E1C1C9E"/>
@@ -4215,7 +4174,156 @@
       </w:rPr>
     </w:lvl>
   </w:abstractNum>
-  <w:abstractNum w:abstractNumId="5" w15:restartNumberingAfterBreak="0">
+  <w:abstractNum w:abstractNumId="6" w15:restartNumberingAfterBreak="0">
+    <w:nsid w:val="1C186AA2"/>
+    <w:multiLevelType w:val="multilevel"/>
+    <w:tmpl w:val="0916E5E0"/>
+    <w:lvl w:ilvl="0">
+      <w:start w:val="1"/>
+      <w:numFmt w:val="bullet"/>
+      <w:lvlText w:val=""/>
+      <w:lvlJc w:val="left"/>
+      <w:pPr>
+        <w:tabs>
+          <w:tab w:val="num" w:pos="720"/>
+        </w:tabs>
+        <w:ind w:left="720" w:hanging="360"/>
+      </w:pPr>
+      <w:rPr>
+        <w:rFonts w:ascii="Symbol" w:hAnsi="Symbol" w:hint="default"/>
+        <w:sz w:val="20"/>
+      </w:rPr>
+    </w:lvl>
+    <w:lvl w:ilvl="1" w:tentative="1">
+      <w:start w:val="1"/>
+      <w:numFmt w:val="bullet"/>
+      <w:lvlText w:val="o"/>
+      <w:lvlJc w:val="left"/>
+      <w:pPr>
+        <w:tabs>
+          <w:tab w:val="num" w:pos="1440"/>
+        </w:tabs>
+        <w:ind w:left="1440" w:hanging="360"/>
+      </w:pPr>
+      <w:rPr>
+        <w:rFonts w:ascii="Courier New" w:hAnsi="Courier New" w:hint="default"/>
+        <w:sz w:val="20"/>
+      </w:rPr>
+    </w:lvl>
+    <w:lvl w:ilvl="2" w:tentative="1">
+      <w:start w:val="1"/>
+      <w:numFmt w:val="bullet"/>
+      <w:lvlText w:val=""/>
+      <w:lvlJc w:val="left"/>
+      <w:pPr>
+        <w:tabs>
+          <w:tab w:val="num" w:pos="2160"/>
+        </w:tabs>
+        <w:ind w:left="2160" w:hanging="360"/>
+      </w:pPr>
+      <w:rPr>
+        <w:rFonts w:ascii="Wingdings" w:hAnsi="Wingdings" w:hint="default"/>
+        <w:sz w:val="20"/>
+      </w:rPr>
+    </w:lvl>
+    <w:lvl w:ilvl="3" w:tentative="1">
+      <w:start w:val="1"/>
+      <w:numFmt w:val="bullet"/>
+      <w:lvlText w:val=""/>
+      <w:lvlJc w:val="left"/>
+      <w:pPr>
+        <w:tabs>
+          <w:tab w:val="num" w:pos="2880"/>
+        </w:tabs>
+        <w:ind w:left="2880" w:hanging="360"/>
+      </w:pPr>
+      <w:rPr>
+        <w:rFonts w:ascii="Wingdings" w:hAnsi="Wingdings" w:hint="default"/>
+        <w:sz w:val="20"/>
+      </w:rPr>
+    </w:lvl>
+    <w:lvl w:ilvl="4" w:tentative="1">
+      <w:start w:val="1"/>
+      <w:numFmt w:val="bullet"/>
+      <w:lvlText w:val=""/>
+      <w:lvlJc w:val="left"/>
+      <w:pPr>
+        <w:tabs>
+          <w:tab w:val="num" w:pos="3600"/>
+        </w:tabs>
+        <w:ind w:left="3600" w:hanging="360"/>
+      </w:pPr>
+      <w:rPr>
+        <w:rFonts w:ascii="Wingdings" w:hAnsi="Wingdings" w:hint="default"/>
+        <w:sz w:val="20"/>
+      </w:rPr>
+    </w:lvl>
+    <w:lvl w:ilvl="5" w:tentative="1">
+      <w:start w:val="1"/>
+      <w:numFmt w:val="bullet"/>
+      <w:lvlText w:val=""/>
+      <w:lvlJc w:val="left"/>
+      <w:pPr>
+        <w:tabs>
+          <w:tab w:val="num" w:pos="4320"/>
+        </w:tabs>
+        <w:ind w:left="4320" w:hanging="360"/>
+      </w:pPr>
+      <w:rPr>
+        <w:rFonts w:ascii="Wingdings" w:hAnsi="Wingdings" w:hint="default"/>
+        <w:sz w:val="20"/>
+      </w:rPr>
+    </w:lvl>
+    <w:lvl w:ilvl="6" w:tentative="1">
+      <w:start w:val="1"/>
+      <w:numFmt w:val="bullet"/>
+      <w:lvlText w:val=""/>
+      <w:lvlJc w:val="left"/>
+      <w:pPr>
+        <w:tabs>
+          <w:tab w:val="num" w:pos="5040"/>
+        </w:tabs>
+        <w:ind w:left="5040" w:hanging="360"/>
+      </w:pPr>
+      <w:rPr>
+        <w:rFonts w:ascii="Wingdings" w:hAnsi="Wingdings" w:hint="default"/>
+        <w:sz w:val="20"/>
+      </w:rPr>
+    </w:lvl>
+    <w:lvl w:ilvl="7" w:tentative="1">
+      <w:start w:val="1"/>
+      <w:numFmt w:val="bullet"/>
+      <w:lvlText w:val=""/>
+      <w:lvlJc w:val="left"/>
+      <w:pPr>
+        <w:tabs>
+          <w:tab w:val="num" w:pos="5760"/>
+        </w:tabs>
+        <w:ind w:left="5760" w:hanging="360"/>
+      </w:pPr>
+      <w:rPr>
+        <w:rFonts w:ascii="Wingdings" w:hAnsi="Wingdings" w:hint="default"/>
+        <w:sz w:val="20"/>
+      </w:rPr>
+    </w:lvl>
+    <w:lvl w:ilvl="8" w:tentative="1">
+      <w:start w:val="1"/>
+      <w:numFmt w:val="bullet"/>
+      <w:lvlText w:val=""/>
+      <w:lvlJc w:val="left"/>
+      <w:pPr>
+        <w:tabs>
+          <w:tab w:val="num" w:pos="6480"/>
+        </w:tabs>
+        <w:ind w:left="6480" w:hanging="360"/>
+      </w:pPr>
+      <w:rPr>
+        <w:rFonts w:ascii="Wingdings" w:hAnsi="Wingdings" w:hint="default"/>
+        <w:sz w:val="20"/>
+      </w:rPr>
+    </w:lvl>
+  </w:abstractNum>
+  <w:abstractNum w:abstractNumId="7" w15:restartNumberingAfterBreak="0">
     <w:nsid w:val="30295EAF"/>
     <w:multiLevelType w:val="multilevel"/>
     <w:tmpl w:val="4D226272"/>
@@ -4364,7 +4472,156 @@
       </w:rPr>
     </w:lvl>
   </w:abstractNum>
-  <w:abstractNum w:abstractNumId="6" w15:restartNumberingAfterBreak="0">
+  <w:abstractNum w:abstractNumId="8" w15:restartNumberingAfterBreak="0">
+    <w:nsid w:val="39DB51AE"/>
+    <w:multiLevelType w:val="multilevel"/>
+    <w:tmpl w:val="A9606BBC"/>
+    <w:lvl w:ilvl="0">
+      <w:start w:val="1"/>
+      <w:numFmt w:val="bullet"/>
+      <w:lvlText w:val=""/>
+      <w:lvlJc w:val="left"/>
+      <w:pPr>
+        <w:tabs>
+          <w:tab w:val="num" w:pos="720"/>
+        </w:tabs>
+        <w:ind w:left="720" w:hanging="360"/>
+      </w:pPr>
+      <w:rPr>
+        <w:rFonts w:ascii="Symbol" w:hAnsi="Symbol" w:hint="default"/>
+        <w:sz w:val="20"/>
+      </w:rPr>
+    </w:lvl>
+    <w:lvl w:ilvl="1">
+      <w:start w:val="1"/>
+      <w:numFmt w:val="bullet"/>
+      <w:lvlText w:val="o"/>
+      <w:lvlJc w:val="left"/>
+      <w:pPr>
+        <w:tabs>
+          <w:tab w:val="num" w:pos="1440"/>
+        </w:tabs>
+        <w:ind w:left="1440" w:hanging="360"/>
+      </w:pPr>
+      <w:rPr>
+        <w:rFonts w:ascii="Courier New" w:hAnsi="Courier New" w:hint="default"/>
+        <w:sz w:val="20"/>
+      </w:rPr>
+    </w:lvl>
+    <w:lvl w:ilvl="2" w:tentative="1">
+      <w:start w:val="1"/>
+      <w:numFmt w:val="bullet"/>
+      <w:lvlText w:val=""/>
+      <w:lvlJc w:val="left"/>
+      <w:pPr>
+        <w:tabs>
+          <w:tab w:val="num" w:pos="2160"/>
+        </w:tabs>
+        <w:ind w:left="2160" w:hanging="360"/>
+      </w:pPr>
+      <w:rPr>
+        <w:rFonts w:ascii="Wingdings" w:hAnsi="Wingdings" w:hint="default"/>
+        <w:sz w:val="20"/>
+      </w:rPr>
+    </w:lvl>
+    <w:lvl w:ilvl="3" w:tentative="1">
+      <w:start w:val="1"/>
+      <w:numFmt w:val="bullet"/>
+      <w:lvlText w:val=""/>
+      <w:lvlJc w:val="left"/>
+      <w:pPr>
+        <w:tabs>
+          <w:tab w:val="num" w:pos="2880"/>
+        </w:tabs>
+        <w:ind w:left="2880" w:hanging="360"/>
+      </w:pPr>
+      <w:rPr>
+        <w:rFonts w:ascii="Wingdings" w:hAnsi="Wingdings" w:hint="default"/>
+        <w:sz w:val="20"/>
+      </w:rPr>
+    </w:lvl>
+    <w:lvl w:ilvl="4" w:tentative="1">
+      <w:start w:val="1"/>
+      <w:numFmt w:val="bullet"/>
+      <w:lvlText w:val=""/>
+      <w:lvlJc w:val="left"/>
+      <w:pPr>
+        <w:tabs>
+          <w:tab w:val="num" w:pos="3600"/>
+        </w:tabs>
+        <w:ind w:left="3600" w:hanging="360"/>
+      </w:pPr>
+      <w:rPr>
+        <w:rFonts w:ascii="Wingdings" w:hAnsi="Wingdings" w:hint="default"/>
+        <w:sz w:val="20"/>
+      </w:rPr>
+    </w:lvl>
+    <w:lvl w:ilvl="5" w:tentative="1">
+      <w:start w:val="1"/>
+      <w:numFmt w:val="bullet"/>
+      <w:lvlText w:val=""/>
+      <w:lvlJc w:val="left"/>
+      <w:pPr>
+        <w:tabs>
+          <w:tab w:val="num" w:pos="4320"/>
+        </w:tabs>
+        <w:ind w:left="4320" w:hanging="360"/>
+      </w:pPr>
+      <w:rPr>
+        <w:rFonts w:ascii="Wingdings" w:hAnsi="Wingdings" w:hint="default"/>
+        <w:sz w:val="20"/>
+      </w:rPr>
+    </w:lvl>
+    <w:lvl w:ilvl="6" w:tentative="1">
+      <w:start w:val="1"/>
+      <w:numFmt w:val="bullet"/>
+      <w:lvlText w:val=""/>
+      <w:lvlJc w:val="left"/>
+      <w:pPr>
+        <w:tabs>
+          <w:tab w:val="num" w:pos="5040"/>
+        </w:tabs>
+        <w:ind w:left="5040" w:hanging="360"/>
+      </w:pPr>
+      <w:rPr>
+        <w:rFonts w:ascii="Wingdings" w:hAnsi="Wingdings" w:hint="default"/>
+        <w:sz w:val="20"/>
+      </w:rPr>
+    </w:lvl>
+    <w:lvl w:ilvl="7" w:tentative="1">
+      <w:start w:val="1"/>
+      <w:numFmt w:val="bullet"/>
+      <w:lvlText w:val=""/>
+      <w:lvlJc w:val="left"/>
+      <w:pPr>
+        <w:tabs>
+          <w:tab w:val="num" w:pos="5760"/>
+        </w:tabs>
+        <w:ind w:left="5760" w:hanging="360"/>
+      </w:pPr>
+      <w:rPr>
+        <w:rFonts w:ascii="Wingdings" w:hAnsi="Wingdings" w:hint="default"/>
+        <w:sz w:val="20"/>
+      </w:rPr>
+    </w:lvl>
+    <w:lvl w:ilvl="8" w:tentative="1">
+      <w:start w:val="1"/>
+      <w:numFmt w:val="bullet"/>
+      <w:lvlText w:val=""/>
+      <w:lvlJc w:val="left"/>
+      <w:pPr>
+        <w:tabs>
+          <w:tab w:val="num" w:pos="6480"/>
+        </w:tabs>
+        <w:ind w:left="6480" w:hanging="360"/>
+      </w:pPr>
+      <w:rPr>
+        <w:rFonts w:ascii="Wingdings" w:hAnsi="Wingdings" w:hint="default"/>
+        <w:sz w:val="20"/>
+      </w:rPr>
+    </w:lvl>
+  </w:abstractNum>
+  <w:abstractNum w:abstractNumId="9" w15:restartNumberingAfterBreak="0">
     <w:nsid w:val="476D6A0F"/>
     <w:multiLevelType w:val="multilevel"/>
     <w:tmpl w:val="43322E12"/>
@@ -4513,7 +4770,7 @@
       </w:rPr>
     </w:lvl>
   </w:abstractNum>
-  <w:abstractNum w:abstractNumId="7" w15:restartNumberingAfterBreak="0">
+  <w:abstractNum w:abstractNumId="10" w15:restartNumberingAfterBreak="0">
     <w:nsid w:val="57CF5EB0"/>
     <w:multiLevelType w:val="multilevel"/>
     <w:tmpl w:val="869A5ECE"/>
@@ -4662,7 +4919,305 @@
       </w:rPr>
     </w:lvl>
   </w:abstractNum>
-  <w:abstractNum w:abstractNumId="8" w15:restartNumberingAfterBreak="0">
+  <w:abstractNum w:abstractNumId="11" w15:restartNumberingAfterBreak="0">
+    <w:nsid w:val="5ABC3409"/>
+    <w:multiLevelType w:val="multilevel"/>
+    <w:tmpl w:val="07860056"/>
+    <w:lvl w:ilvl="0">
+      <w:start w:val="1"/>
+      <w:numFmt w:val="bullet"/>
+      <w:lvlText w:val=""/>
+      <w:lvlJc w:val="left"/>
+      <w:pPr>
+        <w:tabs>
+          <w:tab w:val="num" w:pos="720"/>
+        </w:tabs>
+        <w:ind w:left="720" w:hanging="360"/>
+      </w:pPr>
+      <w:rPr>
+        <w:rFonts w:ascii="Symbol" w:hAnsi="Symbol" w:hint="default"/>
+        <w:sz w:val="20"/>
+      </w:rPr>
+    </w:lvl>
+    <w:lvl w:ilvl="1" w:tentative="1">
+      <w:start w:val="1"/>
+      <w:numFmt w:val="bullet"/>
+      <w:lvlText w:val="o"/>
+      <w:lvlJc w:val="left"/>
+      <w:pPr>
+        <w:tabs>
+          <w:tab w:val="num" w:pos="1440"/>
+        </w:tabs>
+        <w:ind w:left="1440" w:hanging="360"/>
+      </w:pPr>
+      <w:rPr>
+        <w:rFonts w:ascii="Courier New" w:hAnsi="Courier New" w:hint="default"/>
+        <w:sz w:val="20"/>
+      </w:rPr>
+    </w:lvl>
+    <w:lvl w:ilvl="2" w:tentative="1">
+      <w:start w:val="1"/>
+      <w:numFmt w:val="bullet"/>
+      <w:lvlText w:val=""/>
+      <w:lvlJc w:val="left"/>
+      <w:pPr>
+        <w:tabs>
+          <w:tab w:val="num" w:pos="2160"/>
+        </w:tabs>
+        <w:ind w:left="2160" w:hanging="360"/>
+      </w:pPr>
+      <w:rPr>
+        <w:rFonts w:ascii="Wingdings" w:hAnsi="Wingdings" w:hint="default"/>
+        <w:sz w:val="20"/>
+      </w:rPr>
+    </w:lvl>
+    <w:lvl w:ilvl="3" w:tentative="1">
+      <w:start w:val="1"/>
+      <w:numFmt w:val="bullet"/>
+      <w:lvlText w:val=""/>
+      <w:lvlJc w:val="left"/>
+      <w:pPr>
+        <w:tabs>
+          <w:tab w:val="num" w:pos="2880"/>
+        </w:tabs>
+        <w:ind w:left="2880" w:hanging="360"/>
+      </w:pPr>
+      <w:rPr>
+        <w:rFonts w:ascii="Wingdings" w:hAnsi="Wingdings" w:hint="default"/>
+        <w:sz w:val="20"/>
+      </w:rPr>
+    </w:lvl>
+    <w:lvl w:ilvl="4" w:tentative="1">
+      <w:start w:val="1"/>
+      <w:numFmt w:val="bullet"/>
+      <w:lvlText w:val=""/>
+      <w:lvlJc w:val="left"/>
+      <w:pPr>
+        <w:tabs>
+          <w:tab w:val="num" w:pos="3600"/>
+        </w:tabs>
+        <w:ind w:left="3600" w:hanging="360"/>
+      </w:pPr>
+      <w:rPr>
+        <w:rFonts w:ascii="Wingdings" w:hAnsi="Wingdings" w:hint="default"/>
+        <w:sz w:val="20"/>
+      </w:rPr>
+    </w:lvl>
+    <w:lvl w:ilvl="5" w:tentative="1">
+      <w:start w:val="1"/>
+      <w:numFmt w:val="bullet"/>
+      <w:lvlText w:val=""/>
+      <w:lvlJc w:val="left"/>
+      <w:pPr>
+        <w:tabs>
+          <w:tab w:val="num" w:pos="4320"/>
+        </w:tabs>
+        <w:ind w:left="4320" w:hanging="360"/>
+      </w:pPr>
+      <w:rPr>
+        <w:rFonts w:ascii="Wingdings" w:hAnsi="Wingdings" w:hint="default"/>
+        <w:sz w:val="20"/>
+      </w:rPr>
+    </w:lvl>
+    <w:lvl w:ilvl="6" w:tentative="1">
+      <w:start w:val="1"/>
+      <w:numFmt w:val="bullet"/>
+      <w:lvlText w:val=""/>
+      <w:lvlJc w:val="left"/>
+      <w:pPr>
+        <w:tabs>
+          <w:tab w:val="num" w:pos="5040"/>
+        </w:tabs>
+        <w:ind w:left="5040" w:hanging="360"/>
+      </w:pPr>
+      <w:rPr>
+        <w:rFonts w:ascii="Wingdings" w:hAnsi="Wingdings" w:hint="default"/>
+        <w:sz w:val="20"/>
+      </w:rPr>
+    </w:lvl>
+    <w:lvl w:ilvl="7" w:tentative="1">
+      <w:start w:val="1"/>
+      <w:numFmt w:val="bullet"/>
+      <w:lvlText w:val=""/>
+      <w:lvlJc w:val="left"/>
+      <w:pPr>
+        <w:tabs>
+          <w:tab w:val="num" w:pos="5760"/>
+        </w:tabs>
+        <w:ind w:left="5760" w:hanging="360"/>
+      </w:pPr>
+      <w:rPr>
+        <w:rFonts w:ascii="Wingdings" w:hAnsi="Wingdings" w:hint="default"/>
+        <w:sz w:val="20"/>
+      </w:rPr>
+    </w:lvl>
+    <w:lvl w:ilvl="8" w:tentative="1">
+      <w:start w:val="1"/>
+      <w:numFmt w:val="bullet"/>
+      <w:lvlText w:val=""/>
+      <w:lvlJc w:val="left"/>
+      <w:pPr>
+        <w:tabs>
+          <w:tab w:val="num" w:pos="6480"/>
+        </w:tabs>
+        <w:ind w:left="6480" w:hanging="360"/>
+      </w:pPr>
+      <w:rPr>
+        <w:rFonts w:ascii="Wingdings" w:hAnsi="Wingdings" w:hint="default"/>
+        <w:sz w:val="20"/>
+      </w:rPr>
+    </w:lvl>
+  </w:abstractNum>
+  <w:abstractNum w:abstractNumId="12" w15:restartNumberingAfterBreak="0">
+    <w:nsid w:val="5AF95B6A"/>
+    <w:multiLevelType w:val="multilevel"/>
+    <w:tmpl w:val="6300838E"/>
+    <w:lvl w:ilvl="0">
+      <w:start w:val="1"/>
+      <w:numFmt w:val="bullet"/>
+      <w:lvlText w:val=""/>
+      <w:lvlJc w:val="left"/>
+      <w:pPr>
+        <w:tabs>
+          <w:tab w:val="num" w:pos="720"/>
+        </w:tabs>
+        <w:ind w:left="720" w:hanging="360"/>
+      </w:pPr>
+      <w:rPr>
+        <w:rFonts w:ascii="Symbol" w:hAnsi="Symbol" w:hint="default"/>
+        <w:sz w:val="20"/>
+      </w:rPr>
+    </w:lvl>
+    <w:lvl w:ilvl="1" w:tentative="1">
+      <w:start w:val="1"/>
+      <w:numFmt w:val="bullet"/>
+      <w:lvlText w:val="o"/>
+      <w:lvlJc w:val="left"/>
+      <w:pPr>
+        <w:tabs>
+          <w:tab w:val="num" w:pos="1440"/>
+        </w:tabs>
+        <w:ind w:left="1440" w:hanging="360"/>
+      </w:pPr>
+      <w:rPr>
+        <w:rFonts w:ascii="Courier New" w:hAnsi="Courier New" w:hint="default"/>
+        <w:sz w:val="20"/>
+      </w:rPr>
+    </w:lvl>
+    <w:lvl w:ilvl="2" w:tentative="1">
+      <w:start w:val="1"/>
+      <w:numFmt w:val="bullet"/>
+      <w:lvlText w:val=""/>
+      <w:lvlJc w:val="left"/>
+      <w:pPr>
+        <w:tabs>
+          <w:tab w:val="num" w:pos="2160"/>
+        </w:tabs>
+        <w:ind w:left="2160" w:hanging="360"/>
+      </w:pPr>
+      <w:rPr>
+        <w:rFonts w:ascii="Wingdings" w:hAnsi="Wingdings" w:hint="default"/>
+        <w:sz w:val="20"/>
+      </w:rPr>
+    </w:lvl>
+    <w:lvl w:ilvl="3" w:tentative="1">
+      <w:start w:val="1"/>
+      <w:numFmt w:val="bullet"/>
+      <w:lvlText w:val=""/>
+      <w:lvlJc w:val="left"/>
+      <w:pPr>
+        <w:tabs>
+          <w:tab w:val="num" w:pos="2880"/>
+        </w:tabs>
+        <w:ind w:left="2880" w:hanging="360"/>
+      </w:pPr>
+      <w:rPr>
+        <w:rFonts w:ascii="Wingdings" w:hAnsi="Wingdings" w:hint="default"/>
+        <w:sz w:val="20"/>
+      </w:rPr>
+    </w:lvl>
+    <w:lvl w:ilvl="4" w:tentative="1">
+      <w:start w:val="1"/>
+      <w:numFmt w:val="bullet"/>
+      <w:lvlText w:val=""/>
+      <w:lvlJc w:val="left"/>
+      <w:pPr>
+        <w:tabs>
+          <w:tab w:val="num" w:pos="3600"/>
+        </w:tabs>
+        <w:ind w:left="3600" w:hanging="360"/>
+      </w:pPr>
+      <w:rPr>
+        <w:rFonts w:ascii="Wingdings" w:hAnsi="Wingdings" w:hint="default"/>
+        <w:sz w:val="20"/>
+      </w:rPr>
+    </w:lvl>
+    <w:lvl w:ilvl="5" w:tentative="1">
+      <w:start w:val="1"/>
+      <w:numFmt w:val="bullet"/>
+      <w:lvlText w:val=""/>
+      <w:lvlJc w:val="left"/>
+      <w:pPr>
+        <w:tabs>
+          <w:tab w:val="num" w:pos="4320"/>
+        </w:tabs>
+        <w:ind w:left="4320" w:hanging="360"/>
+      </w:pPr>
+      <w:rPr>
+        <w:rFonts w:ascii="Wingdings" w:hAnsi="Wingdings" w:hint="default"/>
+        <w:sz w:val="20"/>
+      </w:rPr>
+    </w:lvl>
+    <w:lvl w:ilvl="6" w:tentative="1">
+      <w:start w:val="1"/>
+      <w:numFmt w:val="bullet"/>
+      <w:lvlText w:val=""/>
+      <w:lvlJc w:val="left"/>
+      <w:pPr>
+        <w:tabs>
+          <w:tab w:val="num" w:pos="5040"/>
+        </w:tabs>
+        <w:ind w:left="5040" w:hanging="360"/>
+      </w:pPr>
+      <w:rPr>
+        <w:rFonts w:ascii="Wingdings" w:hAnsi="Wingdings" w:hint="default"/>
+        <w:sz w:val="20"/>
+      </w:rPr>
+    </w:lvl>
+    <w:lvl w:ilvl="7" w:tentative="1">
+      <w:start w:val="1"/>
+      <w:numFmt w:val="bullet"/>
+      <w:lvlText w:val=""/>
+      <w:lvlJc w:val="left"/>
+      <w:pPr>
+        <w:tabs>
+          <w:tab w:val="num" w:pos="5760"/>
+        </w:tabs>
+        <w:ind w:left="5760" w:hanging="360"/>
+      </w:pPr>
+      <w:rPr>
+        <w:rFonts w:ascii="Wingdings" w:hAnsi="Wingdings" w:hint="default"/>
+        <w:sz w:val="20"/>
+      </w:rPr>
+    </w:lvl>
+    <w:lvl w:ilvl="8" w:tentative="1">
+      <w:start w:val="1"/>
+      <w:numFmt w:val="bullet"/>
+      <w:lvlText w:val=""/>
+      <w:lvlJc w:val="left"/>
+      <w:pPr>
+        <w:tabs>
+          <w:tab w:val="num" w:pos="6480"/>
+        </w:tabs>
+        <w:ind w:left="6480" w:hanging="360"/>
+      </w:pPr>
+      <w:rPr>
+        <w:rFonts w:ascii="Wingdings" w:hAnsi="Wingdings" w:hint="default"/>
+        <w:sz w:val="20"/>
+      </w:rPr>
+    </w:lvl>
+  </w:abstractNum>
+  <w:abstractNum w:abstractNumId="13" w15:restartNumberingAfterBreak="0">
     <w:nsid w:val="601D11BE"/>
     <w:multiLevelType w:val="multilevel"/>
     <w:tmpl w:val="C058804E"/>
@@ -4775,7 +5330,7 @@
       </w:pPr>
     </w:lvl>
   </w:abstractNum>
-  <w:abstractNum w:abstractNumId="9" w15:restartNumberingAfterBreak="0">
+  <w:abstractNum w:abstractNumId="14" w15:restartNumberingAfterBreak="0">
     <w:nsid w:val="649024F1"/>
     <w:multiLevelType w:val="multilevel"/>
     <w:tmpl w:val="CD969546"/>
@@ -4924,7 +5479,7 @@
       </w:rPr>
     </w:lvl>
   </w:abstractNum>
-  <w:abstractNum w:abstractNumId="10" w15:restartNumberingAfterBreak="0">
+  <w:abstractNum w:abstractNumId="15" w15:restartNumberingAfterBreak="0">
     <w:nsid w:val="68FA073D"/>
     <w:multiLevelType w:val="multilevel"/>
     <w:tmpl w:val="CBD8991C"/>
@@ -5073,7 +5628,7 @@
       </w:rPr>
     </w:lvl>
   </w:abstractNum>
-  <w:abstractNum w:abstractNumId="11" w15:restartNumberingAfterBreak="0">
+  <w:abstractNum w:abstractNumId="16" w15:restartNumberingAfterBreak="0">
     <w:nsid w:val="6DCC0457"/>
     <w:multiLevelType w:val="multilevel"/>
     <w:tmpl w:val="375A0A82"/>
@@ -5222,7 +5777,7 @@
       </w:rPr>
     </w:lvl>
   </w:abstractNum>
-  <w:abstractNum w:abstractNumId="12" w15:restartNumberingAfterBreak="0">
+  <w:abstractNum w:abstractNumId="17" w15:restartNumberingAfterBreak="0">
     <w:nsid w:val="7A270893"/>
     <w:multiLevelType w:val="multilevel"/>
     <w:tmpl w:val="5394A6F2"/>
@@ -5372,43 +5927,58 @@
     </w:lvl>
   </w:abstractNum>
   <w:num w:numId="1" w16cid:durableId="372921814">
+    <w:abstractNumId w:val="5"/>
+  </w:num>
+  <w:num w:numId="2" w16cid:durableId="435827282">
+    <w:abstractNumId w:val="15"/>
+  </w:num>
+  <w:num w:numId="3" w16cid:durableId="851645505">
     <w:abstractNumId w:val="4"/>
   </w:num>
-  <w:num w:numId="2" w16cid:durableId="435827282">
-    <w:abstractNumId w:val="10"/>
+  <w:num w:numId="4" w16cid:durableId="1074087140">
+    <w:abstractNumId w:val="16"/>
   </w:num>
-  <w:num w:numId="3" w16cid:durableId="851645505">
+  <w:num w:numId="5" w16cid:durableId="1219170139">
+    <w:abstractNumId w:val="13"/>
+  </w:num>
+  <w:num w:numId="6" w16cid:durableId="1238130025">
     <w:abstractNumId w:val="3"/>
   </w:num>
-  <w:num w:numId="4" w16cid:durableId="1074087140">
-    <w:abstractNumId w:val="11"/>
-  </w:num>
-  <w:num w:numId="5" w16cid:durableId="1219170139">
-    <w:abstractNumId w:val="8"/>
-  </w:num>
-  <w:num w:numId="6" w16cid:durableId="1238130025">
+  <w:num w:numId="7" w16cid:durableId="1296715097">
     <w:abstractNumId w:val="2"/>
   </w:num>
-  <w:num w:numId="7" w16cid:durableId="1296715097">
-    <w:abstractNumId w:val="1"/>
-  </w:num>
   <w:num w:numId="8" w16cid:durableId="370228518">
-    <w:abstractNumId w:val="9"/>
+    <w:abstractNumId w:val="14"/>
   </w:num>
   <w:num w:numId="9" w16cid:durableId="204022727">
-    <w:abstractNumId w:val="12"/>
+    <w:abstractNumId w:val="17"/>
   </w:num>
   <w:num w:numId="10" w16cid:durableId="2007398516">
     <w:abstractNumId w:val="0"/>
   </w:num>
   <w:num w:numId="11" w16cid:durableId="1320302065">
+    <w:abstractNumId w:val="10"/>
+  </w:num>
+  <w:num w:numId="12" w16cid:durableId="523901584">
     <w:abstractNumId w:val="7"/>
   </w:num>
-  <w:num w:numId="12" w16cid:durableId="523901584">
-    <w:abstractNumId w:val="5"/>
+  <w:num w:numId="13" w16cid:durableId="1860849021">
+    <w:abstractNumId w:val="9"/>
   </w:num>
-  <w:num w:numId="13" w16cid:durableId="1860849021">
+  <w:num w:numId="14" w16cid:durableId="1495603572">
+    <w:abstractNumId w:val="1"/>
+  </w:num>
+  <w:num w:numId="15" w16cid:durableId="824008639">
     <w:abstractNumId w:val="6"/>
+  </w:num>
+  <w:num w:numId="16" w16cid:durableId="686638993">
+    <w:abstractNumId w:val="11"/>
+  </w:num>
+  <w:num w:numId="17" w16cid:durableId="1457019585">
+    <w:abstractNumId w:val="8"/>
+  </w:num>
+  <w:num w:numId="18" w16cid:durableId="1013533031">
+    <w:abstractNumId w:val="12"/>
   </w:num>
 </w:numbering>
 </file>
@@ -6015,7 +6585,6 @@
   <w:style w:type="character" w:default="1" w:styleId="DefaultParagraphFont">
     <w:name w:val="Default Paragraph Font"/>
     <w:uiPriority w:val="1"/>
-    <w:semiHidden/>
     <w:unhideWhenUsed/>
   </w:style>
   <w:style w:type="table" w:default="1" w:styleId="TableNormal">

</xml_diff>